<commit_message>
fix(docs): Corrigido os documentos de Login
Fase de Análise
Fase de Projeto
</commit_message>
<xml_diff>
--- a/docs/engenharia-software-2/casos_de_uso/Caso de uso - Login.docx
+++ b/docs/engenharia-software-2/casos_de_uso/Caso de uso - Login.docx
@@ -26,7 +26,7 @@
           <w:ilvl w:val="0"/>
           <w:numId w:val="11"/>
         </w:numPr>
-        <w:ind w:left="566" w:right="-324"/>
+        <w:ind w:left="566" w:right="21"/>
         <w:jc w:val="both"/>
         <w:rPr>
           <w:rFonts w:ascii="Courier New" w:eastAsia="Courier New" w:hAnsi="Courier New" w:cs="Courier New"/>
@@ -44,30 +44,32 @@
         <w:rPr>
           <w:rFonts w:ascii="Courier New" w:eastAsia="Courier New" w:hAnsi="Courier New" w:cs="Courier New"/>
         </w:rPr>
-        <w:t xml:space="preserve">(ator) preenche suas informações nas </w:t>
+        <w:t xml:space="preserve"> preenche suas informações na</w:t>
       </w:r>
-      <w:proofErr w:type="spellStart"/>
       <w:r>
         <w:rPr>
           <w:rFonts w:ascii="Courier New" w:eastAsia="Courier New" w:hAnsi="Courier New" w:cs="Courier New"/>
         </w:rPr>
-        <w:t>textbox</w:t>
+        <w:t>s</w:t>
       </w:r>
-      <w:proofErr w:type="spellEnd"/>
       <w:r>
         <w:rPr>
           <w:rFonts w:ascii="Courier New" w:eastAsia="Courier New" w:hAnsi="Courier New" w:cs="Courier New"/>
         </w:rPr>
-        <w:t xml:space="preserve"> de </w:t>
+        <w:t xml:space="preserve"> caixa</w:t>
       </w:r>
-      <w:proofErr w:type="spellStart"/>
       <w:r>
         <w:rPr>
           <w:rFonts w:ascii="Courier New" w:eastAsia="Courier New" w:hAnsi="Courier New" w:cs="Courier New"/>
         </w:rPr>
-        <w:t>LoginView</w:t>
+        <w:t>s</w:t>
       </w:r>
-      <w:proofErr w:type="spellEnd"/>
+      <w:r>
+        <w:rPr>
+          <w:rFonts w:ascii="Courier New" w:eastAsia="Courier New" w:hAnsi="Courier New" w:cs="Courier New"/>
+        </w:rPr>
+        <w:t xml:space="preserve"> de texto</w:t>
+      </w:r>
       <w:r>
         <w:rPr>
           <w:rFonts w:ascii="Courier New" w:eastAsia="Courier New" w:hAnsi="Courier New" w:cs="Courier New"/>
@@ -81,7 +83,7 @@
           <w:ilvl w:val="0"/>
           <w:numId w:val="11"/>
         </w:numPr>
-        <w:ind w:left="566" w:right="-324"/>
+        <w:ind w:left="566" w:right="21"/>
         <w:jc w:val="both"/>
         <w:rPr>
           <w:rFonts w:ascii="Courier New" w:eastAsia="Courier New" w:hAnsi="Courier New" w:cs="Courier New"/>
@@ -93,16 +95,41 @@
         <w:rPr>
           <w:rFonts w:ascii="Courier New" w:eastAsia="Courier New" w:hAnsi="Courier New" w:cs="Courier New"/>
         </w:rPr>
-        <w:t xml:space="preserve">Usuário(ator) pressiona o botão “ENTER” na </w:t>
+        <w:t>Usuário pressiona o botão “</w:t>
       </w:r>
-      <w:proofErr w:type="spellStart"/>
       <w:r>
         <w:rPr>
           <w:rFonts w:ascii="Courier New" w:eastAsia="Courier New" w:hAnsi="Courier New" w:cs="Courier New"/>
         </w:rPr>
-        <w:t>LoginView</w:t>
+        <w:t>ENTRAR</w:t>
       </w:r>
-      <w:proofErr w:type="spellEnd"/>
+      <w:r>
+        <w:rPr>
+          <w:rFonts w:ascii="Courier New" w:eastAsia="Courier New" w:hAnsi="Courier New" w:cs="Courier New"/>
+        </w:rPr>
+        <w:t>”;</w:t>
+      </w:r>
+    </w:p>
+    <w:p>
+      <w:pPr>
+        <w:numPr>
+          <w:ilvl w:val="0"/>
+          <w:numId w:val="11"/>
+        </w:numPr>
+        <w:ind w:left="566" w:right="21"/>
+        <w:jc w:val="both"/>
+        <w:rPr>
+          <w:rFonts w:ascii="Courier New" w:eastAsia="Courier New" w:hAnsi="Courier New" w:cs="Courier New"/>
+          <w:b/>
+          <w:bCs/>
+        </w:rPr>
+      </w:pPr>
+      <w:r>
+        <w:rPr>
+          <w:rFonts w:ascii="Courier New" w:eastAsia="Courier New" w:hAnsi="Courier New" w:cs="Courier New"/>
+        </w:rPr>
+        <w:t>Sistema valida as informações inseridas pelo Usuário</w:t>
+      </w:r>
       <w:r>
         <w:rPr>
           <w:rFonts w:ascii="Courier New" w:eastAsia="Courier New" w:hAnsi="Courier New" w:cs="Courier New"/>
@@ -116,7 +143,7 @@
           <w:ilvl w:val="0"/>
           <w:numId w:val="11"/>
         </w:numPr>
-        <w:ind w:left="566" w:right="-324"/>
+        <w:ind w:left="566" w:right="21"/>
         <w:jc w:val="both"/>
         <w:rPr>
           <w:rFonts w:ascii="Courier New" w:eastAsia="Courier New" w:hAnsi="Courier New" w:cs="Courier New"/>
@@ -124,398 +151,24 @@
           <w:bCs/>
         </w:rPr>
       </w:pPr>
-      <w:proofErr w:type="spellStart"/>
       <w:r>
         <w:rPr>
           <w:rFonts w:ascii="Courier New" w:eastAsia="Courier New" w:hAnsi="Courier New" w:cs="Courier New"/>
         </w:rPr>
-        <w:t>LoginView</w:t>
-      </w:r>
-      <w:proofErr w:type="spellEnd"/>
-      <w:r>
-        <w:rPr>
-          <w:rFonts w:ascii="Courier New" w:eastAsia="Courier New" w:hAnsi="Courier New" w:cs="Courier New"/>
-        </w:rPr>
-        <w:t xml:space="preserve"> chama </w:t>
-      </w:r>
-      <w:proofErr w:type="spellStart"/>
-      <w:r>
-        <w:rPr>
-          <w:rFonts w:ascii="Courier New" w:eastAsia="Courier New" w:hAnsi="Courier New" w:cs="Courier New"/>
-        </w:rPr>
-        <w:t>validarInfo</w:t>
-      </w:r>
-      <w:proofErr w:type="spellEnd"/>
-      <w:r>
-        <w:rPr>
-          <w:rFonts w:ascii="Courier New" w:eastAsia="Courier New" w:hAnsi="Courier New" w:cs="Courier New"/>
-        </w:rPr>
-        <w:t>(</w:t>
-      </w:r>
-      <w:proofErr w:type="spellStart"/>
-      <w:r>
-        <w:rPr>
-          <w:rFonts w:ascii="Courier New" w:eastAsia="Courier New" w:hAnsi="Courier New" w:cs="Courier New"/>
-        </w:rPr>
-        <w:t>info</w:t>
-      </w:r>
-      <w:proofErr w:type="spellEnd"/>
-      <w:r>
-        <w:rPr>
-          <w:rFonts w:ascii="Courier New" w:eastAsia="Courier New" w:hAnsi="Courier New" w:cs="Courier New"/>
-        </w:rPr>
-        <w:t>); para validar as informações inseridas pelo usuário;</w:t>
-      </w:r>
-    </w:p>
-    <w:p>
-      <w:pPr>
-        <w:numPr>
-          <w:ilvl w:val="0"/>
-          <w:numId w:val="11"/>
-        </w:numPr>
-        <w:ind w:left="566" w:right="-324"/>
-        <w:jc w:val="both"/>
-        <w:rPr>
-          <w:rFonts w:ascii="Courier New" w:eastAsia="Courier New" w:hAnsi="Courier New" w:cs="Courier New"/>
-        </w:rPr>
-      </w:pPr>
-      <w:proofErr w:type="spellStart"/>
-      <w:r>
-        <w:rPr>
-          <w:rFonts w:ascii="Courier New" w:eastAsia="Courier New" w:hAnsi="Courier New" w:cs="Courier New"/>
-        </w:rPr>
-        <w:t>RoutesControl</w:t>
-      </w:r>
-      <w:proofErr w:type="spellEnd"/>
-      <w:r>
-        <w:rPr>
-          <w:rFonts w:ascii="Courier New" w:eastAsia="Courier New" w:hAnsi="Courier New" w:cs="Courier New"/>
-        </w:rPr>
-        <w:t xml:space="preserve"> chama </w:t>
-      </w:r>
-      <w:proofErr w:type="spellStart"/>
-      <w:r>
-        <w:rPr>
-          <w:rFonts w:ascii="Courier New" w:eastAsia="Courier New" w:hAnsi="Courier New" w:cs="Courier New"/>
-        </w:rPr>
-        <w:t>enviarLogin</w:t>
-      </w:r>
-      <w:proofErr w:type="spellEnd"/>
-      <w:r>
-        <w:rPr>
-          <w:rFonts w:ascii="Courier New" w:eastAsia="Courier New" w:hAnsi="Courier New" w:cs="Courier New"/>
-        </w:rPr>
-        <w:t>(</w:t>
-      </w:r>
-      <w:proofErr w:type="spellStart"/>
-      <w:r>
-        <w:rPr>
-          <w:rFonts w:ascii="Courier New" w:eastAsia="Courier New" w:hAnsi="Courier New" w:cs="Courier New"/>
-        </w:rPr>
-        <w:t>info</w:t>
-      </w:r>
-      <w:proofErr w:type="spellEnd"/>
-      <w:r>
-        <w:rPr>
-          <w:rFonts w:ascii="Courier New" w:eastAsia="Courier New" w:hAnsi="Courier New" w:cs="Courier New"/>
-        </w:rPr>
-        <w:t xml:space="preserve">); para enviar as informações de login inseridas para </w:t>
-      </w:r>
-      <w:proofErr w:type="gramStart"/>
-      <w:r>
-        <w:rPr>
-          <w:rFonts w:ascii="Courier New" w:eastAsia="Courier New" w:hAnsi="Courier New" w:cs="Courier New"/>
-        </w:rPr>
-        <w:t>Login(</w:t>
-      </w:r>
-      <w:proofErr w:type="gramEnd"/>
-      <w:r>
-        <w:rPr>
-          <w:rFonts w:ascii="Courier New" w:eastAsia="Courier New" w:hAnsi="Courier New" w:cs="Courier New"/>
-        </w:rPr>
-        <w:t>Model);</w:t>
-      </w:r>
-    </w:p>
-    <w:p>
-      <w:pPr>
-        <w:numPr>
-          <w:ilvl w:val="0"/>
-          <w:numId w:val="11"/>
-        </w:numPr>
-        <w:ind w:left="566" w:right="-324"/>
-        <w:jc w:val="both"/>
-        <w:rPr>
-          <w:rFonts w:ascii="Courier New" w:eastAsia="Courier New" w:hAnsi="Courier New" w:cs="Courier New"/>
-          <w:b/>
-          <w:bCs/>
-        </w:rPr>
-      </w:pPr>
-      <w:proofErr w:type="gramStart"/>
-      <w:r>
-        <w:rPr>
-          <w:rFonts w:ascii="Courier New" w:eastAsia="Courier New" w:hAnsi="Courier New" w:cs="Courier New"/>
-        </w:rPr>
-        <w:t>Login(</w:t>
-      </w:r>
-      <w:proofErr w:type="gramEnd"/>
-      <w:r>
-        <w:rPr>
-          <w:rFonts w:ascii="Courier New" w:eastAsia="Courier New" w:hAnsi="Courier New" w:cs="Courier New"/>
-        </w:rPr>
-        <w:t xml:space="preserve">Model) chama </w:t>
-      </w:r>
-      <w:proofErr w:type="spellStart"/>
-      <w:r>
-        <w:rPr>
-          <w:rFonts w:ascii="Courier New" w:eastAsia="Courier New" w:hAnsi="Courier New" w:cs="Courier New"/>
-        </w:rPr>
-        <w:t>verificarLogin</w:t>
-      </w:r>
-      <w:proofErr w:type="spellEnd"/>
-      <w:r>
-        <w:rPr>
-          <w:rFonts w:ascii="Courier New" w:eastAsia="Courier New" w:hAnsi="Courier New" w:cs="Courier New"/>
-        </w:rPr>
-        <w:t>(</w:t>
-      </w:r>
-      <w:proofErr w:type="spellStart"/>
-      <w:r>
-        <w:rPr>
-          <w:rFonts w:ascii="Courier New" w:eastAsia="Courier New" w:hAnsi="Courier New" w:cs="Courier New"/>
-        </w:rPr>
-        <w:t>info</w:t>
-      </w:r>
-      <w:proofErr w:type="spellEnd"/>
-      <w:r>
-        <w:rPr>
-          <w:rFonts w:ascii="Courier New" w:eastAsia="Courier New" w:hAnsi="Courier New" w:cs="Courier New"/>
-        </w:rPr>
-        <w:t>); para verificar as informações de login;</w:t>
-      </w:r>
-    </w:p>
-    <w:p>
-      <w:pPr>
-        <w:numPr>
-          <w:ilvl w:val="0"/>
-          <w:numId w:val="11"/>
-        </w:numPr>
-        <w:ind w:left="566" w:right="-324"/>
-        <w:jc w:val="both"/>
-        <w:rPr>
-          <w:rFonts w:ascii="Courier New" w:eastAsia="Courier New" w:hAnsi="Courier New" w:cs="Courier New"/>
-          <w:b/>
-          <w:bCs/>
-        </w:rPr>
-      </w:pPr>
-      <w:proofErr w:type="gramStart"/>
-      <w:r>
-        <w:rPr>
-          <w:rFonts w:ascii="Courier New" w:eastAsia="Courier New" w:hAnsi="Courier New" w:cs="Courier New"/>
-        </w:rPr>
-        <w:t>Login(</w:t>
-      </w:r>
-      <w:proofErr w:type="gramEnd"/>
-      <w:r>
-        <w:rPr>
-          <w:rFonts w:ascii="Courier New" w:eastAsia="Courier New" w:hAnsi="Courier New" w:cs="Courier New"/>
-        </w:rPr>
-        <w:t xml:space="preserve">Model) chama </w:t>
-      </w:r>
-      <w:proofErr w:type="spellStart"/>
-      <w:r>
-        <w:rPr>
-          <w:rFonts w:ascii="Courier New" w:eastAsia="Courier New" w:hAnsi="Courier New" w:cs="Courier New"/>
-        </w:rPr>
-        <w:t>sanitizarDados</w:t>
-      </w:r>
-      <w:proofErr w:type="spellEnd"/>
-      <w:r>
-        <w:rPr>
-          <w:rFonts w:ascii="Courier New" w:eastAsia="Courier New" w:hAnsi="Courier New" w:cs="Courier New"/>
-        </w:rPr>
-        <w:t>(</w:t>
-      </w:r>
-      <w:proofErr w:type="spellStart"/>
-      <w:r>
-        <w:rPr>
-          <w:rFonts w:ascii="Courier New" w:eastAsia="Courier New" w:hAnsi="Courier New" w:cs="Courier New"/>
-        </w:rPr>
-        <w:t>info</w:t>
-      </w:r>
-      <w:proofErr w:type="spellEnd"/>
-      <w:r>
-        <w:rPr>
-          <w:rFonts w:ascii="Courier New" w:eastAsia="Courier New" w:hAnsi="Courier New" w:cs="Courier New"/>
-        </w:rPr>
-        <w:t>); para sanitizar as informações inseridas pelo Usuário;</w:t>
-      </w:r>
-    </w:p>
-    <w:p>
-      <w:pPr>
-        <w:numPr>
-          <w:ilvl w:val="0"/>
-          <w:numId w:val="11"/>
-        </w:numPr>
-        <w:ind w:left="566" w:right="-324"/>
-        <w:jc w:val="both"/>
-        <w:rPr>
-          <w:rFonts w:ascii="Courier New" w:eastAsia="Courier New" w:hAnsi="Courier New" w:cs="Courier New"/>
-          <w:b/>
-          <w:bCs/>
-        </w:rPr>
-      </w:pPr>
-      <w:proofErr w:type="spellStart"/>
-      <w:r>
-        <w:rPr>
-          <w:rFonts w:ascii="Courier New" w:eastAsia="Courier New" w:hAnsi="Courier New" w:cs="Courier New"/>
-        </w:rPr>
-        <w:t>DataBank</w:t>
-      </w:r>
-      <w:proofErr w:type="spellEnd"/>
-      <w:r>
-        <w:rPr>
-          <w:rFonts w:ascii="Courier New" w:eastAsia="Courier New" w:hAnsi="Courier New" w:cs="Courier New"/>
-        </w:rPr>
-        <w:t xml:space="preserve"> chama </w:t>
-      </w:r>
-      <w:proofErr w:type="spellStart"/>
-      <w:r>
-        <w:rPr>
-          <w:rFonts w:ascii="Courier New" w:eastAsia="Courier New" w:hAnsi="Courier New" w:cs="Courier New"/>
-        </w:rPr>
-        <w:t>autenticarCredenciais</w:t>
-      </w:r>
-      <w:proofErr w:type="spellEnd"/>
-      <w:r>
-        <w:rPr>
-          <w:rFonts w:ascii="Courier New" w:eastAsia="Courier New" w:hAnsi="Courier New" w:cs="Courier New"/>
-        </w:rPr>
-        <w:t>(</w:t>
-      </w:r>
-      <w:proofErr w:type="spellStart"/>
-      <w:r>
-        <w:rPr>
-          <w:rFonts w:ascii="Courier New" w:eastAsia="Courier New" w:hAnsi="Courier New" w:cs="Courier New"/>
-        </w:rPr>
-        <w:t>info</w:t>
-      </w:r>
-      <w:proofErr w:type="spellEnd"/>
-      <w:r>
-        <w:rPr>
-          <w:rFonts w:ascii="Courier New" w:eastAsia="Courier New" w:hAnsi="Courier New" w:cs="Courier New"/>
-        </w:rPr>
-        <w:t>); para autenticar as credenciais para efetuar o login do usuário;</w:t>
-      </w:r>
-    </w:p>
-    <w:p>
-      <w:pPr>
-        <w:numPr>
-          <w:ilvl w:val="0"/>
-          <w:numId w:val="11"/>
-        </w:numPr>
-        <w:ind w:left="566" w:right="-324"/>
-        <w:jc w:val="both"/>
-        <w:rPr>
-          <w:rFonts w:ascii="Courier New" w:eastAsia="Courier New" w:hAnsi="Courier New" w:cs="Courier New"/>
-          <w:b/>
-          <w:bCs/>
-        </w:rPr>
-      </w:pPr>
-      <w:proofErr w:type="spellStart"/>
-      <w:r>
-        <w:rPr>
-          <w:rFonts w:ascii="Courier New" w:eastAsia="Courier New" w:hAnsi="Courier New" w:cs="Courier New"/>
-        </w:rPr>
-        <w:t>DataBank</w:t>
-      </w:r>
-      <w:proofErr w:type="spellEnd"/>
-      <w:r>
-        <w:rPr>
-          <w:rFonts w:ascii="Courier New" w:eastAsia="Courier New" w:hAnsi="Courier New" w:cs="Courier New"/>
-        </w:rPr>
-        <w:t xml:space="preserve"> retorna </w:t>
-      </w:r>
-      <w:r>
-        <w:rPr>
-          <w:rFonts w:ascii="Courier New" w:eastAsia="Courier New" w:hAnsi="Courier New" w:cs="Courier New"/>
-          <w:i/>
-          <w:iCs/>
-        </w:rPr>
-        <w:t>status</w:t>
+        <w:t xml:space="preserve">Banco de dados </w:t>
       </w:r>
       <w:r>
         <w:rPr>
           <w:rFonts w:ascii="Courier New" w:eastAsia="Courier New" w:hAnsi="Courier New" w:cs="Courier New"/>
         </w:rPr>
-        <w:t xml:space="preserve"> de aprovado para </w:t>
+        <w:t>verifica as credenciais</w:t>
       </w:r>
-      <w:proofErr w:type="gramStart"/>
       <w:r>
         <w:rPr>
           <w:rFonts w:ascii="Courier New" w:eastAsia="Courier New" w:hAnsi="Courier New" w:cs="Courier New"/>
         </w:rPr>
-        <w:t>Login(</w:t>
+        <w:t xml:space="preserve"> do Usuário</w:t>
       </w:r>
-      <w:proofErr w:type="gramEnd"/>
-      <w:r>
-        <w:rPr>
-          <w:rFonts w:ascii="Courier New" w:eastAsia="Courier New" w:hAnsi="Courier New" w:cs="Courier New"/>
-        </w:rPr>
-        <w:t>Model);</w:t>
-      </w:r>
-    </w:p>
-    <w:p>
-      <w:pPr>
-        <w:numPr>
-          <w:ilvl w:val="0"/>
-          <w:numId w:val="11"/>
-        </w:numPr>
-        <w:ind w:left="566" w:right="-324"/>
-        <w:jc w:val="both"/>
-        <w:rPr>
-          <w:rFonts w:ascii="Courier New" w:eastAsia="Courier New" w:hAnsi="Courier New" w:cs="Courier New"/>
-          <w:b/>
-          <w:bCs/>
-        </w:rPr>
-      </w:pPr>
-      <w:proofErr w:type="gramStart"/>
-      <w:r>
-        <w:rPr>
-          <w:rFonts w:ascii="Courier New" w:eastAsia="Courier New" w:hAnsi="Courier New" w:cs="Courier New"/>
-        </w:rPr>
-        <w:t>Login(</w:t>
-      </w:r>
-      <w:proofErr w:type="gramEnd"/>
-      <w:r>
-        <w:rPr>
-          <w:rFonts w:ascii="Courier New" w:eastAsia="Courier New" w:hAnsi="Courier New" w:cs="Courier New"/>
-        </w:rPr>
-        <w:t xml:space="preserve">Model) retorna </w:t>
-      </w:r>
-      <w:proofErr w:type="spellStart"/>
-      <w:r>
-        <w:rPr>
-          <w:rFonts w:ascii="Courier New" w:eastAsia="Courier New" w:hAnsi="Courier New" w:cs="Courier New"/>
-          <w:i/>
-          <w:iCs/>
-        </w:rPr>
-        <w:t>autorizacao</w:t>
-      </w:r>
-      <w:proofErr w:type="spellEnd"/>
-      <w:r>
-        <w:rPr>
-          <w:rFonts w:ascii="Courier New" w:eastAsia="Courier New" w:hAnsi="Courier New" w:cs="Courier New"/>
-        </w:rPr>
-        <w:t xml:space="preserve"> para </w:t>
-      </w:r>
-      <w:proofErr w:type="spellStart"/>
-      <w:r>
-        <w:rPr>
-          <w:rFonts w:ascii="Courier New" w:eastAsia="Courier New" w:hAnsi="Courier New" w:cs="Courier New"/>
-        </w:rPr>
-        <w:t>RoutesControl</w:t>
-      </w:r>
-      <w:proofErr w:type="spellEnd"/>
       <w:r>
         <w:rPr>
           <w:rFonts w:ascii="Courier New" w:eastAsia="Courier New" w:hAnsi="Courier New" w:cs="Courier New"/>
@@ -529,7 +182,7 @@
           <w:ilvl w:val="0"/>
           <w:numId w:val="11"/>
         </w:numPr>
-        <w:ind w:left="566" w:right="-324"/>
+        <w:ind w:left="566" w:right="21"/>
         <w:jc w:val="both"/>
         <w:rPr>
           <w:rFonts w:ascii="Courier New" w:eastAsia="Courier New" w:hAnsi="Courier New" w:cs="Courier New"/>
@@ -541,185 +194,8 @@
         <w:rPr>
           <w:rFonts w:ascii="Courier New" w:eastAsia="Courier New" w:hAnsi="Courier New" w:cs="Courier New"/>
         </w:rPr>
-        <w:t xml:space="preserve">Dependendo de </w:t>
+        <w:t>Sistema redireciona Usuário para sua tela principal</w:t>
       </w:r>
-      <w:proofErr w:type="spellStart"/>
-      <w:r>
-        <w:rPr>
-          <w:rFonts w:ascii="Courier New" w:eastAsia="Courier New" w:hAnsi="Courier New" w:cs="Courier New"/>
-          <w:i/>
-          <w:iCs/>
-        </w:rPr>
-        <w:t>autorizacao</w:t>
-      </w:r>
-      <w:proofErr w:type="spellEnd"/>
-      <w:r>
-        <w:rPr>
-          <w:rFonts w:ascii="Courier New" w:eastAsia="Courier New" w:hAnsi="Courier New" w:cs="Courier New"/>
-        </w:rPr>
-        <w:t xml:space="preserve">, ou </w:t>
-      </w:r>
-      <w:proofErr w:type="spellStart"/>
-      <w:proofErr w:type="gramStart"/>
-      <w:r>
-        <w:rPr>
-          <w:rFonts w:ascii="Courier New" w:eastAsia="Courier New" w:hAnsi="Courier New" w:cs="Courier New"/>
-        </w:rPr>
-        <w:t>TrainingView</w:t>
-      </w:r>
-      <w:proofErr w:type="spellEnd"/>
-      <w:r>
-        <w:rPr>
-          <w:rFonts w:ascii="Courier New" w:eastAsia="Courier New" w:hAnsi="Courier New" w:cs="Courier New"/>
-        </w:rPr>
-        <w:t>(</w:t>
-      </w:r>
-      <w:proofErr w:type="gramEnd"/>
-      <w:r>
-        <w:rPr>
-          <w:rFonts w:ascii="Courier New" w:eastAsia="Courier New" w:hAnsi="Courier New" w:cs="Courier New"/>
-        </w:rPr>
-        <w:t xml:space="preserve">Dashboard principal do </w:t>
-      </w:r>
-      <w:r>
-        <w:rPr>
-          <w:rFonts w:ascii="Courier New" w:eastAsia="Courier New" w:hAnsi="Courier New" w:cs="Courier New"/>
-        </w:rPr>
-        <w:t>Usuário</w:t>
-      </w:r>
-      <w:r>
-        <w:rPr>
-          <w:rFonts w:ascii="Courier New" w:eastAsia="Courier New" w:hAnsi="Courier New" w:cs="Courier New"/>
-        </w:rPr>
-        <w:t xml:space="preserve">) ou </w:t>
-      </w:r>
-      <w:proofErr w:type="spellStart"/>
-      <w:proofErr w:type="gramStart"/>
-      <w:r>
-        <w:rPr>
-          <w:rFonts w:ascii="Courier New" w:eastAsia="Courier New" w:hAnsi="Courier New" w:cs="Courier New"/>
-        </w:rPr>
-        <w:t>StudentListingView</w:t>
-      </w:r>
-      <w:proofErr w:type="spellEnd"/>
-      <w:r>
-        <w:rPr>
-          <w:rFonts w:ascii="Courier New" w:eastAsia="Courier New" w:hAnsi="Courier New" w:cs="Courier New"/>
-        </w:rPr>
-        <w:t>(</w:t>
-      </w:r>
-      <w:proofErr w:type="gramEnd"/>
-      <w:r>
-        <w:rPr>
-          <w:rFonts w:ascii="Courier New" w:eastAsia="Courier New" w:hAnsi="Courier New" w:cs="Courier New"/>
-        </w:rPr>
-        <w:t xml:space="preserve">Dashboard principal do Personal) chamar </w:t>
-      </w:r>
-      <w:proofErr w:type="gramStart"/>
-      <w:r>
-        <w:rPr>
-          <w:rFonts w:ascii="Courier New" w:eastAsia="Courier New" w:hAnsi="Courier New" w:cs="Courier New"/>
-        </w:rPr>
-        <w:t>render(</w:t>
-      </w:r>
-      <w:proofErr w:type="gramEnd"/>
-      <w:r>
-        <w:rPr>
-          <w:rFonts w:ascii="Courier New" w:eastAsia="Courier New" w:hAnsi="Courier New" w:cs="Courier New"/>
-        </w:rPr>
-        <w:t>); para serem exibidas;</w:t>
-      </w:r>
-    </w:p>
-    <w:p>
-      <w:pPr>
-        <w:ind w:right="-324"/>
-        <w:jc w:val="both"/>
-        <w:rPr>
-          <w:rFonts w:ascii="Courier New" w:eastAsia="Courier New" w:hAnsi="Courier New" w:cs="Courier New"/>
-        </w:rPr>
-      </w:pPr>
-    </w:p>
-    <w:p>
-      <w:pPr>
-        <w:ind w:right="-324"/>
-        <w:jc w:val="both"/>
-        <w:rPr>
-          <w:rFonts w:ascii="Courier New" w:eastAsia="Courier New" w:hAnsi="Courier New" w:cs="Courier New"/>
-        </w:rPr>
-      </w:pPr>
-    </w:p>
-    <w:p>
-      <w:pPr>
-        <w:ind w:right="-324"/>
-        <w:jc w:val="both"/>
-        <w:rPr>
-          <w:rFonts w:ascii="Courier New" w:eastAsia="Courier New" w:hAnsi="Courier New" w:cs="Courier New"/>
-        </w:rPr>
-      </w:pPr>
-    </w:p>
-    <w:p>
-      <w:pPr>
-        <w:ind w:right="-324"/>
-        <w:jc w:val="center"/>
-      </w:pPr>
-    </w:p>
-    <w:p>
-      <w:pPr>
-        <w:ind w:right="-324"/>
-        <w:jc w:val="center"/>
-      </w:pPr>
-      <w:r>
-        <w:br w:type="page"/>
-      </w:r>
-    </w:p>
-    <w:p>
-      <w:pPr>
-        <w:jc w:val="center"/>
-        <w:rPr>
-          <w:rFonts w:ascii="Courier New" w:eastAsia="Courier New" w:hAnsi="Courier New" w:cs="Courier New"/>
-          <w:b/>
-          <w:bCs/>
-        </w:rPr>
-      </w:pPr>
-    </w:p>
-    <w:p>
-      <w:pPr>
-        <w:pStyle w:val="Ttulo"/>
-      </w:pPr>
-      <w:bookmarkStart w:id="1" w:name="_n85s57ykwb9l" w:colFirst="0" w:colLast="0"/>
-      <w:bookmarkEnd w:id="1"/>
-      <w:r>
-        <w:t>Fluxo Alternativo I (1)</w:t>
-      </w:r>
-    </w:p>
-    <w:p>
-      <w:pPr>
-        <w:numPr>
-          <w:ilvl w:val="0"/>
-          <w:numId w:val="1"/>
-        </w:numPr>
-        <w:ind w:left="566" w:right="-324"/>
-        <w:jc w:val="both"/>
-        <w:rPr>
-          <w:rFonts w:ascii="Courier New" w:eastAsia="Courier New" w:hAnsi="Courier New" w:cs="Courier New"/>
-          <w:b/>
-          <w:bCs/>
-        </w:rPr>
-      </w:pPr>
-      <w:r>
-        <w:rPr>
-          <w:rFonts w:ascii="Courier New" w:eastAsia="Courier New" w:hAnsi="Courier New" w:cs="Courier New"/>
-        </w:rPr>
-        <w:t xml:space="preserve">Usuário(ator) pressiona o botão “Continuar com o Google” na </w:t>
-      </w:r>
-      <w:proofErr w:type="spellStart"/>
-      <w:r>
-        <w:rPr>
-          <w:rFonts w:ascii="Courier New" w:eastAsia="Courier New" w:hAnsi="Courier New" w:cs="Courier New"/>
-        </w:rPr>
-        <w:t>LoginView</w:t>
-      </w:r>
-      <w:proofErr w:type="spellEnd"/>
       <w:r>
         <w:rPr>
           <w:rFonts w:ascii="Courier New" w:eastAsia="Courier New" w:hAnsi="Courier New" w:cs="Courier New"/>
@@ -729,11 +205,54 @@
     </w:p>
     <w:p>
       <w:pPr>
+        <w:ind w:right="-324"/>
+        <w:jc w:val="both"/>
+        <w:rPr>
+          <w:rFonts w:ascii="Courier New" w:eastAsia="Courier New" w:hAnsi="Courier New" w:cs="Courier New"/>
+        </w:rPr>
+      </w:pPr>
+    </w:p>
+    <w:p>
+      <w:pPr>
+        <w:ind w:right="-324"/>
+        <w:jc w:val="both"/>
+        <w:rPr>
+          <w:rFonts w:ascii="Courier New" w:eastAsia="Courier New" w:hAnsi="Courier New" w:cs="Courier New"/>
+        </w:rPr>
+      </w:pPr>
+    </w:p>
+    <w:p>
+      <w:pPr>
+        <w:ind w:right="-324"/>
+        <w:jc w:val="both"/>
+        <w:rPr>
+          <w:rFonts w:ascii="Courier New" w:eastAsia="Courier New" w:hAnsi="Courier New" w:cs="Courier New"/>
+        </w:rPr>
+      </w:pPr>
+    </w:p>
+    <w:p>
+      <w:pPr>
+        <w:pStyle w:val="Ttulo"/>
+      </w:pPr>
+      <w:bookmarkStart w:id="1" w:name="_n85s57ykwb9l" w:colFirst="0" w:colLast="0"/>
+      <w:bookmarkEnd w:id="1"/>
+      <w:r>
+        <w:t>Fluxo Alternativo I (</w:t>
+      </w:r>
+      <w:r>
+        <w:t>4</w:t>
+      </w:r>
+      <w:r>
+        <w:t>)</w:t>
+      </w:r>
+    </w:p>
+    <w:p>
+      <w:pPr>
         <w:numPr>
           <w:ilvl w:val="0"/>
-          <w:numId w:val="22"/>
+          <w:numId w:val="1"/>
         </w:numPr>
-        <w:ind w:left="566" w:right="-324"/>
+        <w:ind w:right="21"/>
         <w:jc w:val="both"/>
         <w:rPr>
           <w:rFonts w:ascii="Courier New" w:eastAsia="Courier New" w:hAnsi="Courier New" w:cs="Courier New"/>
@@ -741,454 +260,24 @@
           <w:bCs/>
         </w:rPr>
       </w:pPr>
-      <w:proofErr w:type="spellStart"/>
       <w:r>
         <w:rPr>
           <w:rFonts w:ascii="Courier New" w:eastAsia="Courier New" w:hAnsi="Courier New" w:cs="Courier New"/>
         </w:rPr>
-        <w:t>LoginView</w:t>
-      </w:r>
-      <w:proofErr w:type="spellEnd"/>
-      <w:r>
-        <w:rPr>
-          <w:rFonts w:ascii="Courier New" w:eastAsia="Courier New" w:hAnsi="Courier New" w:cs="Courier New"/>
-        </w:rPr>
-        <w:t xml:space="preserve"> exibe as opções de contas para </w:t>
+        <w:t xml:space="preserve">Banco de dados </w:t>
       </w:r>
       <w:r>
         <w:rPr>
           <w:rFonts w:ascii="Courier New" w:eastAsia="Courier New" w:hAnsi="Courier New" w:cs="Courier New"/>
         </w:rPr>
-        <w:t>Usuário</w:t>
+        <w:t>aprova</w:t>
       </w:r>
       <w:r>
         <w:rPr>
           <w:rFonts w:ascii="Courier New" w:eastAsia="Courier New" w:hAnsi="Courier New" w:cs="Courier New"/>
         </w:rPr>
-        <w:t>(ator);</w:t>
+        <w:t xml:space="preserve"> login do Usuário</w:t>
       </w:r>
-    </w:p>
-    <w:p>
-      <w:pPr>
-        <w:numPr>
-          <w:ilvl w:val="0"/>
-          <w:numId w:val="7"/>
-        </w:numPr>
-        <w:ind w:left="566" w:right="-324"/>
-        <w:jc w:val="both"/>
-        <w:rPr>
-          <w:rFonts w:ascii="Courier New" w:eastAsia="Courier New" w:hAnsi="Courier New" w:cs="Courier New"/>
-          <w:b/>
-          <w:bCs/>
-        </w:rPr>
-      </w:pPr>
-      <w:r>
-        <w:rPr>
-          <w:rFonts w:ascii="Courier New" w:eastAsia="Courier New" w:hAnsi="Courier New" w:cs="Courier New"/>
-        </w:rPr>
-        <w:t>Usuário(ator) escolhe uma de suas contas para efetuar o login;</w:t>
-      </w:r>
-    </w:p>
-    <w:p>
-      <w:pPr>
-        <w:numPr>
-          <w:ilvl w:val="0"/>
-          <w:numId w:val="4"/>
-        </w:numPr>
-        <w:ind w:left="566" w:right="-324"/>
-        <w:jc w:val="both"/>
-        <w:rPr>
-          <w:rFonts w:ascii="Courier New" w:eastAsia="Courier New" w:hAnsi="Courier New" w:cs="Courier New"/>
-          <w:b/>
-          <w:bCs/>
-        </w:rPr>
-      </w:pPr>
-      <w:proofErr w:type="spellStart"/>
-      <w:r>
-        <w:rPr>
-          <w:rFonts w:ascii="Courier New" w:eastAsia="Courier New" w:hAnsi="Courier New" w:cs="Courier New"/>
-        </w:rPr>
-        <w:t>LoginView</w:t>
-      </w:r>
-      <w:proofErr w:type="spellEnd"/>
-      <w:r>
-        <w:rPr>
-          <w:rFonts w:ascii="Courier New" w:eastAsia="Courier New" w:hAnsi="Courier New" w:cs="Courier New"/>
-        </w:rPr>
-        <w:t xml:space="preserve"> chama </w:t>
-      </w:r>
-      <w:proofErr w:type="spellStart"/>
-      <w:r>
-        <w:rPr>
-          <w:rFonts w:ascii="Courier New" w:eastAsia="Courier New" w:hAnsi="Courier New" w:cs="Courier New"/>
-        </w:rPr>
-        <w:t>validarInfo</w:t>
-      </w:r>
-      <w:proofErr w:type="spellEnd"/>
-      <w:r>
-        <w:rPr>
-          <w:rFonts w:ascii="Courier New" w:eastAsia="Courier New" w:hAnsi="Courier New" w:cs="Courier New"/>
-        </w:rPr>
-        <w:t>(</w:t>
-      </w:r>
-      <w:proofErr w:type="spellStart"/>
-      <w:r>
-        <w:rPr>
-          <w:rFonts w:ascii="Courier New" w:eastAsia="Courier New" w:hAnsi="Courier New" w:cs="Courier New"/>
-        </w:rPr>
-        <w:t>info</w:t>
-      </w:r>
-      <w:proofErr w:type="spellEnd"/>
-      <w:r>
-        <w:rPr>
-          <w:rFonts w:ascii="Courier New" w:eastAsia="Courier New" w:hAnsi="Courier New" w:cs="Courier New"/>
-        </w:rPr>
-        <w:t>); para validar as informações inseridas pelo usuário;</w:t>
-      </w:r>
-    </w:p>
-    <w:p>
-      <w:pPr>
-        <w:numPr>
-          <w:ilvl w:val="0"/>
-          <w:numId w:val="21"/>
-        </w:numPr>
-        <w:ind w:left="566" w:right="-324"/>
-        <w:jc w:val="both"/>
-        <w:rPr>
-          <w:rFonts w:ascii="Courier New" w:eastAsia="Courier New" w:hAnsi="Courier New" w:cs="Courier New"/>
-          <w:b/>
-          <w:bCs/>
-        </w:rPr>
-      </w:pPr>
-      <w:proofErr w:type="spellStart"/>
-      <w:r>
-        <w:rPr>
-          <w:rFonts w:ascii="Courier New" w:eastAsia="Courier New" w:hAnsi="Courier New" w:cs="Courier New"/>
-        </w:rPr>
-        <w:t>RoutesControl</w:t>
-      </w:r>
-      <w:proofErr w:type="spellEnd"/>
-      <w:r>
-        <w:rPr>
-          <w:rFonts w:ascii="Courier New" w:eastAsia="Courier New" w:hAnsi="Courier New" w:cs="Courier New"/>
-        </w:rPr>
-        <w:t xml:space="preserve"> chama </w:t>
-      </w:r>
-      <w:proofErr w:type="spellStart"/>
-      <w:r>
-        <w:rPr>
-          <w:rFonts w:ascii="Courier New" w:eastAsia="Courier New" w:hAnsi="Courier New" w:cs="Courier New"/>
-        </w:rPr>
-        <w:t>enviarLogin</w:t>
-      </w:r>
-      <w:proofErr w:type="spellEnd"/>
-      <w:r>
-        <w:rPr>
-          <w:rFonts w:ascii="Courier New" w:eastAsia="Courier New" w:hAnsi="Courier New" w:cs="Courier New"/>
-        </w:rPr>
-        <w:t>(</w:t>
-      </w:r>
-      <w:proofErr w:type="spellStart"/>
-      <w:r>
-        <w:rPr>
-          <w:rFonts w:ascii="Courier New" w:eastAsia="Courier New" w:hAnsi="Courier New" w:cs="Courier New"/>
-        </w:rPr>
-        <w:t>info</w:t>
-      </w:r>
-      <w:proofErr w:type="spellEnd"/>
-      <w:r>
-        <w:rPr>
-          <w:rFonts w:ascii="Courier New" w:eastAsia="Courier New" w:hAnsi="Courier New" w:cs="Courier New"/>
-        </w:rPr>
-        <w:t xml:space="preserve">); para enviar as informações de login inseridas para </w:t>
-      </w:r>
-      <w:proofErr w:type="gramStart"/>
-      <w:r>
-        <w:rPr>
-          <w:rFonts w:ascii="Courier New" w:eastAsia="Courier New" w:hAnsi="Courier New" w:cs="Courier New"/>
-        </w:rPr>
-        <w:t>Login(</w:t>
-      </w:r>
-      <w:proofErr w:type="gramEnd"/>
-      <w:r>
-        <w:rPr>
-          <w:rFonts w:ascii="Courier New" w:eastAsia="Courier New" w:hAnsi="Courier New" w:cs="Courier New"/>
-        </w:rPr>
-        <w:t>Model);</w:t>
-      </w:r>
-    </w:p>
-    <w:p>
-      <w:pPr>
-        <w:numPr>
-          <w:ilvl w:val="0"/>
-          <w:numId w:val="19"/>
-        </w:numPr>
-        <w:ind w:left="566" w:right="-324"/>
-        <w:jc w:val="both"/>
-        <w:rPr>
-          <w:rFonts w:ascii="Courier New" w:eastAsia="Courier New" w:hAnsi="Courier New" w:cs="Courier New"/>
-          <w:b/>
-          <w:bCs/>
-        </w:rPr>
-      </w:pPr>
-      <w:proofErr w:type="gramStart"/>
-      <w:r>
-        <w:rPr>
-          <w:rFonts w:ascii="Courier New" w:eastAsia="Courier New" w:hAnsi="Courier New" w:cs="Courier New"/>
-        </w:rPr>
-        <w:t>Login(</w:t>
-      </w:r>
-      <w:proofErr w:type="gramEnd"/>
-      <w:r>
-        <w:rPr>
-          <w:rFonts w:ascii="Courier New" w:eastAsia="Courier New" w:hAnsi="Courier New" w:cs="Courier New"/>
-        </w:rPr>
-        <w:t xml:space="preserve">Model) chama </w:t>
-      </w:r>
-      <w:proofErr w:type="spellStart"/>
-      <w:r>
-        <w:rPr>
-          <w:rFonts w:ascii="Courier New" w:eastAsia="Courier New" w:hAnsi="Courier New" w:cs="Courier New"/>
-        </w:rPr>
-        <w:t>verificarLogin</w:t>
-      </w:r>
-      <w:proofErr w:type="spellEnd"/>
-      <w:r>
-        <w:rPr>
-          <w:rFonts w:ascii="Courier New" w:eastAsia="Courier New" w:hAnsi="Courier New" w:cs="Courier New"/>
-        </w:rPr>
-        <w:t>(</w:t>
-      </w:r>
-      <w:proofErr w:type="spellStart"/>
-      <w:r>
-        <w:rPr>
-          <w:rFonts w:ascii="Courier New" w:eastAsia="Courier New" w:hAnsi="Courier New" w:cs="Courier New"/>
-        </w:rPr>
-        <w:t>info</w:t>
-      </w:r>
-      <w:proofErr w:type="spellEnd"/>
-      <w:r>
-        <w:rPr>
-          <w:rFonts w:ascii="Courier New" w:eastAsia="Courier New" w:hAnsi="Courier New" w:cs="Courier New"/>
-        </w:rPr>
-        <w:t>); para verificar as informações de login;</w:t>
-      </w:r>
-    </w:p>
-    <w:p>
-      <w:pPr>
-        <w:numPr>
-          <w:ilvl w:val="0"/>
-          <w:numId w:val="8"/>
-        </w:numPr>
-        <w:ind w:left="566" w:right="-324"/>
-        <w:jc w:val="both"/>
-        <w:rPr>
-          <w:rFonts w:ascii="Courier New" w:eastAsia="Courier New" w:hAnsi="Courier New" w:cs="Courier New"/>
-        </w:rPr>
-      </w:pPr>
-      <w:proofErr w:type="gramStart"/>
-      <w:r>
-        <w:rPr>
-          <w:rFonts w:ascii="Courier New" w:eastAsia="Courier New" w:hAnsi="Courier New" w:cs="Courier New"/>
-        </w:rPr>
-        <w:t>Login(</w:t>
-      </w:r>
-      <w:proofErr w:type="gramEnd"/>
-      <w:r>
-        <w:rPr>
-          <w:rFonts w:ascii="Courier New" w:eastAsia="Courier New" w:hAnsi="Courier New" w:cs="Courier New"/>
-        </w:rPr>
-        <w:t xml:space="preserve">Model) chama </w:t>
-      </w:r>
-      <w:proofErr w:type="spellStart"/>
-      <w:r>
-        <w:rPr>
-          <w:rFonts w:ascii="Courier New" w:eastAsia="Courier New" w:hAnsi="Courier New" w:cs="Courier New"/>
-        </w:rPr>
-        <w:t>sanitizarDados</w:t>
-      </w:r>
-      <w:proofErr w:type="spellEnd"/>
-      <w:r>
-        <w:rPr>
-          <w:rFonts w:ascii="Courier New" w:eastAsia="Courier New" w:hAnsi="Courier New" w:cs="Courier New"/>
-        </w:rPr>
-        <w:t>(</w:t>
-      </w:r>
-      <w:proofErr w:type="spellStart"/>
-      <w:r>
-        <w:rPr>
-          <w:rFonts w:ascii="Courier New" w:eastAsia="Courier New" w:hAnsi="Courier New" w:cs="Courier New"/>
-        </w:rPr>
-        <w:t>info</w:t>
-      </w:r>
-      <w:proofErr w:type="spellEnd"/>
-      <w:r>
-        <w:rPr>
-          <w:rFonts w:ascii="Courier New" w:eastAsia="Courier New" w:hAnsi="Courier New" w:cs="Courier New"/>
-        </w:rPr>
-        <w:t>); para sanitizar as informações inseridas pelo Usuário;</w:t>
-      </w:r>
-    </w:p>
-    <w:p>
-      <w:pPr>
-        <w:numPr>
-          <w:ilvl w:val="0"/>
-          <w:numId w:val="23"/>
-        </w:numPr>
-        <w:ind w:left="566" w:right="-324"/>
-        <w:jc w:val="both"/>
-        <w:rPr>
-          <w:rFonts w:ascii="Courier New" w:eastAsia="Courier New" w:hAnsi="Courier New" w:cs="Courier New"/>
-        </w:rPr>
-      </w:pPr>
-      <w:proofErr w:type="spellStart"/>
-      <w:r>
-        <w:rPr>
-          <w:rFonts w:ascii="Courier New" w:eastAsia="Courier New" w:hAnsi="Courier New" w:cs="Courier New"/>
-        </w:rPr>
-        <w:t>DataBank</w:t>
-      </w:r>
-      <w:proofErr w:type="spellEnd"/>
-      <w:r>
-        <w:rPr>
-          <w:rFonts w:ascii="Courier New" w:eastAsia="Courier New" w:hAnsi="Courier New" w:cs="Courier New"/>
-        </w:rPr>
-        <w:t xml:space="preserve"> chama </w:t>
-      </w:r>
-      <w:proofErr w:type="spellStart"/>
-      <w:r>
-        <w:rPr>
-          <w:rFonts w:ascii="Courier New" w:eastAsia="Courier New" w:hAnsi="Courier New" w:cs="Courier New"/>
-        </w:rPr>
-        <w:t>autenticarCredenciais</w:t>
-      </w:r>
-      <w:proofErr w:type="spellEnd"/>
-      <w:r>
-        <w:rPr>
-          <w:rFonts w:ascii="Courier New" w:eastAsia="Courier New" w:hAnsi="Courier New" w:cs="Courier New"/>
-        </w:rPr>
-        <w:t>(</w:t>
-      </w:r>
-      <w:proofErr w:type="spellStart"/>
-      <w:r>
-        <w:rPr>
-          <w:rFonts w:ascii="Courier New" w:eastAsia="Courier New" w:hAnsi="Courier New" w:cs="Courier New"/>
-        </w:rPr>
-        <w:t>info</w:t>
-      </w:r>
-      <w:proofErr w:type="spellEnd"/>
-      <w:r>
-        <w:rPr>
-          <w:rFonts w:ascii="Courier New" w:eastAsia="Courier New" w:hAnsi="Courier New" w:cs="Courier New"/>
-        </w:rPr>
-        <w:t>); para autenticar as credenciais para efetuar o login do usuário;</w:t>
-      </w:r>
-    </w:p>
-    <w:p>
-      <w:pPr>
-        <w:numPr>
-          <w:ilvl w:val="0"/>
-          <w:numId w:val="2"/>
-        </w:numPr>
-        <w:ind w:left="566" w:right="-324"/>
-        <w:jc w:val="both"/>
-        <w:rPr>
-          <w:rFonts w:ascii="Courier New" w:eastAsia="Courier New" w:hAnsi="Courier New" w:cs="Courier New"/>
-        </w:rPr>
-      </w:pPr>
-      <w:proofErr w:type="spellStart"/>
-      <w:r>
-        <w:rPr>
-          <w:rFonts w:ascii="Courier New" w:eastAsia="Courier New" w:hAnsi="Courier New" w:cs="Courier New"/>
-        </w:rPr>
-        <w:t>DataBank</w:t>
-      </w:r>
-      <w:proofErr w:type="spellEnd"/>
-      <w:r>
-        <w:rPr>
-          <w:rFonts w:ascii="Courier New" w:eastAsia="Courier New" w:hAnsi="Courier New" w:cs="Courier New"/>
-        </w:rPr>
-        <w:t xml:space="preserve"> retorna </w:t>
-      </w:r>
-      <w:r>
-        <w:rPr>
-          <w:rFonts w:ascii="Courier New" w:eastAsia="Courier New" w:hAnsi="Courier New" w:cs="Courier New"/>
-          <w:i/>
-          <w:iCs/>
-        </w:rPr>
-        <w:t>status</w:t>
-      </w:r>
-      <w:r>
-        <w:rPr>
-          <w:rFonts w:ascii="Courier New" w:eastAsia="Courier New" w:hAnsi="Courier New" w:cs="Courier New"/>
-        </w:rPr>
-        <w:t xml:space="preserve"> de aprovado para </w:t>
-      </w:r>
-      <w:proofErr w:type="gramStart"/>
-      <w:r>
-        <w:rPr>
-          <w:rFonts w:ascii="Courier New" w:eastAsia="Courier New" w:hAnsi="Courier New" w:cs="Courier New"/>
-        </w:rPr>
-        <w:t>Login(</w:t>
-      </w:r>
-      <w:proofErr w:type="gramEnd"/>
-      <w:r>
-        <w:rPr>
-          <w:rFonts w:ascii="Courier New" w:eastAsia="Courier New" w:hAnsi="Courier New" w:cs="Courier New"/>
-        </w:rPr>
-        <w:t>Model);</w:t>
-      </w:r>
-    </w:p>
-    <w:p>
-      <w:pPr>
-        <w:numPr>
-          <w:ilvl w:val="0"/>
-          <w:numId w:val="17"/>
-        </w:numPr>
-        <w:ind w:left="566" w:right="-324"/>
-        <w:jc w:val="both"/>
-        <w:rPr>
-          <w:rFonts w:ascii="Courier New" w:eastAsia="Courier New" w:hAnsi="Courier New" w:cs="Courier New"/>
-        </w:rPr>
-      </w:pPr>
-      <w:proofErr w:type="gramStart"/>
-      <w:r>
-        <w:rPr>
-          <w:rFonts w:ascii="Courier New" w:eastAsia="Courier New" w:hAnsi="Courier New" w:cs="Courier New"/>
-        </w:rPr>
-        <w:t>Login(</w:t>
-      </w:r>
-      <w:proofErr w:type="gramEnd"/>
-      <w:r>
-        <w:rPr>
-          <w:rFonts w:ascii="Courier New" w:eastAsia="Courier New" w:hAnsi="Courier New" w:cs="Courier New"/>
-        </w:rPr>
-        <w:t xml:space="preserve">Model) retorna </w:t>
-      </w:r>
-      <w:proofErr w:type="spellStart"/>
-      <w:r>
-        <w:rPr>
-          <w:rFonts w:ascii="Courier New" w:eastAsia="Courier New" w:hAnsi="Courier New" w:cs="Courier New"/>
-          <w:i/>
-          <w:iCs/>
-        </w:rPr>
-        <w:t>autorizacao</w:t>
-      </w:r>
-      <w:proofErr w:type="spellEnd"/>
-      <w:r>
-        <w:rPr>
-          <w:rFonts w:ascii="Courier New" w:eastAsia="Courier New" w:hAnsi="Courier New" w:cs="Courier New"/>
-        </w:rPr>
-        <w:t xml:space="preserve"> para </w:t>
-      </w:r>
-      <w:proofErr w:type="spellStart"/>
-      <w:r>
-        <w:rPr>
-          <w:rFonts w:ascii="Courier New" w:eastAsia="Courier New" w:hAnsi="Courier New" w:cs="Courier New"/>
-        </w:rPr>
-        <w:t>RoutesControl</w:t>
-      </w:r>
-      <w:proofErr w:type="spellEnd"/>
       <w:r>
         <w:rPr>
           <w:rFonts w:ascii="Courier New" w:eastAsia="Courier New" w:hAnsi="Courier New" w:cs="Courier New"/>
@@ -1200,145 +289,9 @@
       <w:pPr>
         <w:numPr>
           <w:ilvl w:val="0"/>
-          <w:numId w:val="5"/>
+          <w:numId w:val="22"/>
         </w:numPr>
-        <w:ind w:left="566" w:right="-324"/>
-        <w:jc w:val="both"/>
-        <w:rPr>
-          <w:rFonts w:ascii="Courier New" w:eastAsia="Courier New" w:hAnsi="Courier New" w:cs="Courier New"/>
-        </w:rPr>
-      </w:pPr>
-      <w:r>
-        <w:rPr>
-          <w:rFonts w:ascii="Courier New" w:eastAsia="Courier New" w:hAnsi="Courier New" w:cs="Courier New"/>
-        </w:rPr>
-        <w:t xml:space="preserve">Dependendo de </w:t>
-      </w:r>
-      <w:proofErr w:type="spellStart"/>
-      <w:r>
-        <w:rPr>
-          <w:rFonts w:ascii="Courier New" w:eastAsia="Courier New" w:hAnsi="Courier New" w:cs="Courier New"/>
-          <w:i/>
-          <w:iCs/>
-        </w:rPr>
-        <w:t>autorizacao</w:t>
-      </w:r>
-      <w:proofErr w:type="spellEnd"/>
-      <w:r>
-        <w:rPr>
-          <w:rFonts w:ascii="Courier New" w:eastAsia="Courier New" w:hAnsi="Courier New" w:cs="Courier New"/>
-        </w:rPr>
-        <w:t xml:space="preserve">, ou </w:t>
-      </w:r>
-      <w:proofErr w:type="spellStart"/>
-      <w:proofErr w:type="gramStart"/>
-      <w:r>
-        <w:rPr>
-          <w:rFonts w:ascii="Courier New" w:eastAsia="Courier New" w:hAnsi="Courier New" w:cs="Courier New"/>
-        </w:rPr>
-        <w:t>TrainingView</w:t>
-      </w:r>
-      <w:proofErr w:type="spellEnd"/>
-      <w:r>
-        <w:rPr>
-          <w:rFonts w:ascii="Courier New" w:eastAsia="Courier New" w:hAnsi="Courier New" w:cs="Courier New"/>
-        </w:rPr>
-        <w:t>(</w:t>
-      </w:r>
-      <w:proofErr w:type="gramEnd"/>
-      <w:r>
-        <w:rPr>
-          <w:rFonts w:ascii="Courier New" w:eastAsia="Courier New" w:hAnsi="Courier New" w:cs="Courier New"/>
-        </w:rPr>
-        <w:t xml:space="preserve">Dashboard principal do </w:t>
-      </w:r>
-      <w:r>
-        <w:rPr>
-          <w:rFonts w:ascii="Courier New" w:eastAsia="Courier New" w:hAnsi="Courier New" w:cs="Courier New"/>
-        </w:rPr>
-        <w:t>Usuário</w:t>
-      </w:r>
-      <w:r>
-        <w:rPr>
-          <w:rFonts w:ascii="Courier New" w:eastAsia="Courier New" w:hAnsi="Courier New" w:cs="Courier New"/>
-        </w:rPr>
-        <w:t xml:space="preserve">) ou </w:t>
-      </w:r>
-      <w:proofErr w:type="spellStart"/>
-      <w:proofErr w:type="gramStart"/>
-      <w:r>
-        <w:rPr>
-          <w:rFonts w:ascii="Courier New" w:eastAsia="Courier New" w:hAnsi="Courier New" w:cs="Courier New"/>
-        </w:rPr>
-        <w:t>StudentListingView</w:t>
-      </w:r>
-      <w:proofErr w:type="spellEnd"/>
-      <w:r>
-        <w:rPr>
-          <w:rFonts w:ascii="Courier New" w:eastAsia="Courier New" w:hAnsi="Courier New" w:cs="Courier New"/>
-        </w:rPr>
-        <w:t>(</w:t>
-      </w:r>
-      <w:proofErr w:type="gramEnd"/>
-      <w:r>
-        <w:rPr>
-          <w:rFonts w:ascii="Courier New" w:eastAsia="Courier New" w:hAnsi="Courier New" w:cs="Courier New"/>
-        </w:rPr>
-        <w:t xml:space="preserve">Dashboard principal do Personal) chamar </w:t>
-      </w:r>
-      <w:proofErr w:type="gramStart"/>
-      <w:r>
-        <w:rPr>
-          <w:rFonts w:ascii="Courier New" w:eastAsia="Courier New" w:hAnsi="Courier New" w:cs="Courier New"/>
-        </w:rPr>
-        <w:t>render(</w:t>
-      </w:r>
-      <w:proofErr w:type="gramEnd"/>
-      <w:r>
-        <w:rPr>
-          <w:rFonts w:ascii="Courier New" w:eastAsia="Courier New" w:hAnsi="Courier New" w:cs="Courier New"/>
-        </w:rPr>
-        <w:t>); para serem exibidas;</w:t>
-      </w:r>
-    </w:p>
-    <w:p>
-      <w:pPr>
-        <w:ind w:right="-324"/>
-        <w:jc w:val="both"/>
-        <w:rPr>
-          <w:rFonts w:ascii="Courier New" w:eastAsia="Courier New" w:hAnsi="Courier New" w:cs="Courier New"/>
-        </w:rPr>
-      </w:pPr>
-      <w:r>
-        <w:br w:type="page"/>
-      </w:r>
-    </w:p>
-    <w:p>
-      <w:pPr>
-        <w:ind w:right="-324"/>
-        <w:jc w:val="both"/>
-        <w:rPr>
-          <w:rFonts w:ascii="Courier New" w:eastAsia="Courier New" w:hAnsi="Courier New" w:cs="Courier New"/>
-        </w:rPr>
-      </w:pPr>
-    </w:p>
-    <w:p>
-      <w:pPr>
-        <w:pStyle w:val="Ttulo"/>
-      </w:pPr>
-      <w:bookmarkStart w:id="2" w:name="_aesxzu3ewedp" w:colFirst="0" w:colLast="0"/>
-      <w:bookmarkEnd w:id="2"/>
-      <w:r>
-        <w:t>Fluxo Alternativo II (1)</w:t>
-      </w:r>
-    </w:p>
-    <w:p>
-      <w:pPr>
-        <w:numPr>
-          <w:ilvl w:val="0"/>
-          <w:numId w:val="12"/>
-        </w:numPr>
-        <w:ind w:left="566" w:right="-324"/>
+        <w:ind w:right="21"/>
         <w:jc w:val="both"/>
         <w:rPr>
           <w:rFonts w:ascii="Courier New" w:eastAsia="Courier New" w:hAnsi="Courier New" w:cs="Courier New"/>
@@ -1350,16 +303,14 @@
         <w:rPr>
           <w:rFonts w:ascii="Courier New" w:eastAsia="Courier New" w:hAnsi="Courier New" w:cs="Courier New"/>
         </w:rPr>
-        <w:t xml:space="preserve">Usuário(ator) pressiona o botão “Continuar com a Apple” na </w:t>
+        <w:t xml:space="preserve">Sistema </w:t>
       </w:r>
-      <w:proofErr w:type="spellStart"/>
       <w:r>
         <w:rPr>
           <w:rFonts w:ascii="Courier New" w:eastAsia="Courier New" w:hAnsi="Courier New" w:cs="Courier New"/>
         </w:rPr>
-        <w:t>LoginView</w:t>
+        <w:t>redireciona Usuário para sua tela principal</w:t>
       </w:r>
-      <w:proofErr w:type="spellEnd"/>
       <w:r>
         <w:rPr>
           <w:rFonts w:ascii="Courier New" w:eastAsia="Courier New" w:hAnsi="Courier New" w:cs="Courier New"/>
@@ -1369,11 +320,52 @@
     </w:p>
     <w:p>
       <w:pPr>
+        <w:ind w:right="21"/>
+        <w:jc w:val="both"/>
+        <w:rPr>
+          <w:rFonts w:ascii="Courier New" w:eastAsia="Courier New" w:hAnsi="Courier New" w:cs="Courier New"/>
+        </w:rPr>
+      </w:pPr>
+    </w:p>
+    <w:p>
+      <w:pPr>
+        <w:ind w:right="21"/>
+        <w:jc w:val="both"/>
+        <w:rPr>
+          <w:rFonts w:ascii="Courier New" w:eastAsia="Courier New" w:hAnsi="Courier New" w:cs="Courier New"/>
+        </w:rPr>
+      </w:pPr>
+    </w:p>
+    <w:p>
+      <w:pPr>
+        <w:ind w:right="21"/>
+        <w:jc w:val="both"/>
+        <w:rPr>
+          <w:rFonts w:ascii="Courier New" w:eastAsia="Courier New" w:hAnsi="Courier New" w:cs="Courier New"/>
+        </w:rPr>
+      </w:pPr>
+    </w:p>
+    <w:p>
+      <w:pPr>
+        <w:pStyle w:val="Ttulo"/>
+      </w:pPr>
+      <w:r>
+        <w:t>Fluxo Alternativo I</w:t>
+      </w:r>
+      <w:r>
+        <w:t>I</w:t>
+      </w:r>
+      <w:r>
+        <w:t xml:space="preserve"> (4)</w:t>
+      </w:r>
+    </w:p>
+    <w:p>
+      <w:pPr>
         <w:numPr>
           <w:ilvl w:val="0"/>
-          <w:numId w:val="20"/>
+          <w:numId w:val="29"/>
         </w:numPr>
-        <w:ind w:left="566" w:right="-324"/>
+        <w:ind w:right="21"/>
         <w:jc w:val="both"/>
         <w:rPr>
           <w:rFonts w:ascii="Courier New" w:eastAsia="Courier New" w:hAnsi="Courier New" w:cs="Courier New"/>
@@ -1381,40 +373,20 @@
           <w:bCs/>
         </w:rPr>
       </w:pPr>
-      <w:proofErr w:type="spellStart"/>
       <w:r>
         <w:rPr>
           <w:rFonts w:ascii="Courier New" w:eastAsia="Courier New" w:hAnsi="Courier New" w:cs="Courier New"/>
         </w:rPr>
-        <w:t>LoginView</w:t>
-      </w:r>
-      <w:proofErr w:type="spellEnd"/>
-      <w:r>
-        <w:rPr>
-          <w:rFonts w:ascii="Courier New" w:eastAsia="Courier New" w:hAnsi="Courier New" w:cs="Courier New"/>
-        </w:rPr>
-        <w:t xml:space="preserve"> exibe as opções de contas para </w:t>
-      </w:r>
-      <w:r>
-        <w:rPr>
-          <w:rFonts w:ascii="Courier New" w:eastAsia="Courier New" w:hAnsi="Courier New" w:cs="Courier New"/>
-        </w:rPr>
-        <w:t>Usuário</w:t>
-      </w:r>
-      <w:r>
-        <w:rPr>
-          <w:rFonts w:ascii="Courier New" w:eastAsia="Courier New" w:hAnsi="Courier New" w:cs="Courier New"/>
-        </w:rPr>
-        <w:t>(ator);</w:t>
+        <w:t>Banco de dados reprova login do Usuário;</w:t>
       </w:r>
     </w:p>
     <w:p>
       <w:pPr>
         <w:numPr>
           <w:ilvl w:val="0"/>
-          <w:numId w:val="9"/>
+          <w:numId w:val="30"/>
         </w:numPr>
-        <w:ind w:left="566" w:right="-324"/>
+        <w:ind w:right="21"/>
         <w:jc w:val="both"/>
         <w:rPr>
           <w:rFonts w:ascii="Courier New" w:eastAsia="Courier New" w:hAnsi="Courier New" w:cs="Courier New"/>
@@ -1426,407 +398,14 @@
         <w:rPr>
           <w:rFonts w:ascii="Courier New" w:eastAsia="Courier New" w:hAnsi="Courier New" w:cs="Courier New"/>
         </w:rPr>
-        <w:t>Usuário(ator) escolhe uma de suas contas para efetuar o login;</w:t>
-      </w:r>
-    </w:p>
-    <w:p>
-      <w:pPr>
-        <w:numPr>
-          <w:ilvl w:val="0"/>
-          <w:numId w:val="13"/>
-        </w:numPr>
-        <w:ind w:left="566" w:right="-324"/>
-        <w:jc w:val="both"/>
-        <w:rPr>
-          <w:rFonts w:ascii="Courier New" w:eastAsia="Courier New" w:hAnsi="Courier New" w:cs="Courier New"/>
-          <w:b/>
-          <w:bCs/>
-        </w:rPr>
-      </w:pPr>
-      <w:proofErr w:type="spellStart"/>
-      <w:r>
-        <w:rPr>
-          <w:rFonts w:ascii="Courier New" w:eastAsia="Courier New" w:hAnsi="Courier New" w:cs="Courier New"/>
-        </w:rPr>
-        <w:t>LoginView</w:t>
-      </w:r>
-      <w:proofErr w:type="spellEnd"/>
-      <w:r>
-        <w:rPr>
-          <w:rFonts w:ascii="Courier New" w:eastAsia="Courier New" w:hAnsi="Courier New" w:cs="Courier New"/>
-        </w:rPr>
-        <w:t xml:space="preserve"> chama </w:t>
-      </w:r>
-      <w:proofErr w:type="spellStart"/>
-      <w:r>
-        <w:rPr>
-          <w:rFonts w:ascii="Courier New" w:eastAsia="Courier New" w:hAnsi="Courier New" w:cs="Courier New"/>
-        </w:rPr>
-        <w:t>validarInfo</w:t>
-      </w:r>
-      <w:proofErr w:type="spellEnd"/>
-      <w:r>
-        <w:rPr>
-          <w:rFonts w:ascii="Courier New" w:eastAsia="Courier New" w:hAnsi="Courier New" w:cs="Courier New"/>
-        </w:rPr>
-        <w:t>(</w:t>
-      </w:r>
-      <w:proofErr w:type="spellStart"/>
-      <w:r>
-        <w:rPr>
-          <w:rFonts w:ascii="Courier New" w:eastAsia="Courier New" w:hAnsi="Courier New" w:cs="Courier New"/>
-        </w:rPr>
-        <w:t>info</w:t>
-      </w:r>
-      <w:proofErr w:type="spellEnd"/>
-      <w:r>
-        <w:rPr>
-          <w:rFonts w:ascii="Courier New" w:eastAsia="Courier New" w:hAnsi="Courier New" w:cs="Courier New"/>
-        </w:rPr>
-        <w:t>); para validar as informações inseridas pelo usuário;</w:t>
-      </w:r>
-    </w:p>
-    <w:p>
-      <w:pPr>
-        <w:numPr>
-          <w:ilvl w:val="0"/>
-          <w:numId w:val="10"/>
-        </w:numPr>
-        <w:ind w:left="566" w:right="-324"/>
-        <w:jc w:val="both"/>
-        <w:rPr>
-          <w:rFonts w:ascii="Courier New" w:eastAsia="Courier New" w:hAnsi="Courier New" w:cs="Courier New"/>
-          <w:b/>
-          <w:bCs/>
-        </w:rPr>
-      </w:pPr>
-      <w:proofErr w:type="spellStart"/>
-      <w:r>
-        <w:rPr>
-          <w:rFonts w:ascii="Courier New" w:eastAsia="Courier New" w:hAnsi="Courier New" w:cs="Courier New"/>
-        </w:rPr>
-        <w:t>RoutesControl</w:t>
-      </w:r>
-      <w:proofErr w:type="spellEnd"/>
-      <w:r>
-        <w:rPr>
-          <w:rFonts w:ascii="Courier New" w:eastAsia="Courier New" w:hAnsi="Courier New" w:cs="Courier New"/>
-        </w:rPr>
-        <w:t xml:space="preserve"> chama </w:t>
-      </w:r>
-      <w:proofErr w:type="spellStart"/>
-      <w:r>
-        <w:rPr>
-          <w:rFonts w:ascii="Courier New" w:eastAsia="Courier New" w:hAnsi="Courier New" w:cs="Courier New"/>
-        </w:rPr>
-        <w:t>enviarLogin</w:t>
-      </w:r>
-      <w:proofErr w:type="spellEnd"/>
-      <w:r>
-        <w:rPr>
-          <w:rFonts w:ascii="Courier New" w:eastAsia="Courier New" w:hAnsi="Courier New" w:cs="Courier New"/>
-        </w:rPr>
-        <w:t>(</w:t>
-      </w:r>
-      <w:proofErr w:type="spellStart"/>
-      <w:r>
-        <w:rPr>
-          <w:rFonts w:ascii="Courier New" w:eastAsia="Courier New" w:hAnsi="Courier New" w:cs="Courier New"/>
-        </w:rPr>
-        <w:t>info</w:t>
-      </w:r>
-      <w:proofErr w:type="spellEnd"/>
-      <w:r>
-        <w:rPr>
-          <w:rFonts w:ascii="Courier New" w:eastAsia="Courier New" w:hAnsi="Courier New" w:cs="Courier New"/>
-        </w:rPr>
-        <w:t xml:space="preserve">); para enviar as informações de login inseridas para </w:t>
-      </w:r>
-      <w:proofErr w:type="gramStart"/>
-      <w:r>
-        <w:rPr>
-          <w:rFonts w:ascii="Courier New" w:eastAsia="Courier New" w:hAnsi="Courier New" w:cs="Courier New"/>
-        </w:rPr>
-        <w:t>Login(</w:t>
-      </w:r>
-      <w:proofErr w:type="gramEnd"/>
-      <w:r>
-        <w:rPr>
-          <w:rFonts w:ascii="Courier New" w:eastAsia="Courier New" w:hAnsi="Courier New" w:cs="Courier New"/>
-        </w:rPr>
-        <w:t>Model);</w:t>
-      </w:r>
-    </w:p>
-    <w:p>
-      <w:pPr>
-        <w:numPr>
-          <w:ilvl w:val="0"/>
-          <w:numId w:val="3"/>
-        </w:numPr>
-        <w:ind w:left="566" w:right="-324"/>
-        <w:jc w:val="both"/>
-        <w:rPr>
-          <w:rFonts w:ascii="Courier New" w:eastAsia="Courier New" w:hAnsi="Courier New" w:cs="Courier New"/>
-        </w:rPr>
-      </w:pPr>
-      <w:proofErr w:type="gramStart"/>
-      <w:r>
-        <w:rPr>
-          <w:rFonts w:ascii="Courier New" w:eastAsia="Courier New" w:hAnsi="Courier New" w:cs="Courier New"/>
-        </w:rPr>
-        <w:t>Login(</w:t>
-      </w:r>
-      <w:proofErr w:type="gramEnd"/>
-      <w:r>
-        <w:rPr>
-          <w:rFonts w:ascii="Courier New" w:eastAsia="Courier New" w:hAnsi="Courier New" w:cs="Courier New"/>
-        </w:rPr>
-        <w:t xml:space="preserve">Model) chama </w:t>
-      </w:r>
-      <w:proofErr w:type="spellStart"/>
-      <w:r>
-        <w:rPr>
-          <w:rFonts w:ascii="Courier New" w:eastAsia="Courier New" w:hAnsi="Courier New" w:cs="Courier New"/>
-        </w:rPr>
-        <w:t>verificarLogin</w:t>
-      </w:r>
-      <w:proofErr w:type="spellEnd"/>
-      <w:r>
-        <w:rPr>
-          <w:rFonts w:ascii="Courier New" w:eastAsia="Courier New" w:hAnsi="Courier New" w:cs="Courier New"/>
-        </w:rPr>
-        <w:t>(</w:t>
-      </w:r>
-      <w:proofErr w:type="spellStart"/>
-      <w:r>
-        <w:rPr>
-          <w:rFonts w:ascii="Courier New" w:eastAsia="Courier New" w:hAnsi="Courier New" w:cs="Courier New"/>
-        </w:rPr>
-        <w:t>info</w:t>
-      </w:r>
-      <w:proofErr w:type="spellEnd"/>
-      <w:r>
-        <w:rPr>
-          <w:rFonts w:ascii="Courier New" w:eastAsia="Courier New" w:hAnsi="Courier New" w:cs="Courier New"/>
-        </w:rPr>
-        <w:t>); para verificar as informações de login;</w:t>
-      </w:r>
-    </w:p>
-    <w:p>
-      <w:pPr>
-        <w:numPr>
-          <w:ilvl w:val="0"/>
-          <w:numId w:val="14"/>
-        </w:numPr>
-        <w:ind w:left="566" w:right="-324"/>
-        <w:jc w:val="both"/>
-        <w:rPr>
-          <w:rFonts w:ascii="Courier New" w:eastAsia="Courier New" w:hAnsi="Courier New" w:cs="Courier New"/>
-        </w:rPr>
-      </w:pPr>
-      <w:proofErr w:type="gramStart"/>
-      <w:r>
-        <w:rPr>
-          <w:rFonts w:ascii="Courier New" w:eastAsia="Courier New" w:hAnsi="Courier New" w:cs="Courier New"/>
-        </w:rPr>
-        <w:t>Login(</w:t>
-      </w:r>
-      <w:proofErr w:type="gramEnd"/>
-      <w:r>
-        <w:rPr>
-          <w:rFonts w:ascii="Courier New" w:eastAsia="Courier New" w:hAnsi="Courier New" w:cs="Courier New"/>
-        </w:rPr>
-        <w:t xml:space="preserve">Model) chama </w:t>
-      </w:r>
-      <w:proofErr w:type="spellStart"/>
-      <w:r>
-        <w:rPr>
-          <w:rFonts w:ascii="Courier New" w:eastAsia="Courier New" w:hAnsi="Courier New" w:cs="Courier New"/>
-        </w:rPr>
-        <w:t>sanitizarDados</w:t>
-      </w:r>
-      <w:proofErr w:type="spellEnd"/>
-      <w:r>
-        <w:rPr>
-          <w:rFonts w:ascii="Courier New" w:eastAsia="Courier New" w:hAnsi="Courier New" w:cs="Courier New"/>
-        </w:rPr>
-        <w:t>(</w:t>
-      </w:r>
-      <w:proofErr w:type="spellStart"/>
-      <w:r>
-        <w:rPr>
-          <w:rFonts w:ascii="Courier New" w:eastAsia="Courier New" w:hAnsi="Courier New" w:cs="Courier New"/>
-        </w:rPr>
-        <w:t>info</w:t>
-      </w:r>
-      <w:proofErr w:type="spellEnd"/>
-      <w:r>
-        <w:rPr>
-          <w:rFonts w:ascii="Courier New" w:eastAsia="Courier New" w:hAnsi="Courier New" w:cs="Courier New"/>
-        </w:rPr>
-        <w:t>); para sanitizar as informações inseridas pelo Usuário;</w:t>
-      </w:r>
-    </w:p>
-    <w:p>
-      <w:pPr>
-        <w:numPr>
-          <w:ilvl w:val="0"/>
-          <w:numId w:val="16"/>
-        </w:numPr>
-        <w:ind w:left="566" w:right="-324"/>
-        <w:jc w:val="both"/>
-        <w:rPr>
-          <w:rFonts w:ascii="Courier New" w:eastAsia="Courier New" w:hAnsi="Courier New" w:cs="Courier New"/>
-        </w:rPr>
-      </w:pPr>
-      <w:proofErr w:type="spellStart"/>
-      <w:r>
-        <w:rPr>
-          <w:rFonts w:ascii="Courier New" w:eastAsia="Courier New" w:hAnsi="Courier New" w:cs="Courier New"/>
-        </w:rPr>
-        <w:t>DataBank</w:t>
-      </w:r>
-      <w:proofErr w:type="spellEnd"/>
-      <w:r>
-        <w:rPr>
-          <w:rFonts w:ascii="Courier New" w:eastAsia="Courier New" w:hAnsi="Courier New" w:cs="Courier New"/>
-        </w:rPr>
-        <w:t xml:space="preserve"> chama </w:t>
-      </w:r>
-      <w:proofErr w:type="spellStart"/>
-      <w:r>
-        <w:rPr>
-          <w:rFonts w:ascii="Courier New" w:eastAsia="Courier New" w:hAnsi="Courier New" w:cs="Courier New"/>
-        </w:rPr>
-        <w:t>autenticarCredenciais</w:t>
-      </w:r>
-      <w:proofErr w:type="spellEnd"/>
-      <w:r>
-        <w:rPr>
-          <w:rFonts w:ascii="Courier New" w:eastAsia="Courier New" w:hAnsi="Courier New" w:cs="Courier New"/>
-        </w:rPr>
-        <w:t>(</w:t>
-      </w:r>
-      <w:proofErr w:type="spellStart"/>
-      <w:r>
-        <w:rPr>
-          <w:rFonts w:ascii="Courier New" w:eastAsia="Courier New" w:hAnsi="Courier New" w:cs="Courier New"/>
-        </w:rPr>
-        <w:t>info</w:t>
-      </w:r>
-      <w:proofErr w:type="spellEnd"/>
-      <w:r>
-        <w:rPr>
-          <w:rFonts w:ascii="Courier New" w:eastAsia="Courier New" w:hAnsi="Courier New" w:cs="Courier New"/>
-        </w:rPr>
-        <w:t>); para autenticar as credenciais para efetuar o login do usuário;</w:t>
-      </w:r>
-    </w:p>
-    <w:p>
-      <w:pPr>
-        <w:numPr>
-          <w:ilvl w:val="0"/>
-          <w:numId w:val="6"/>
-        </w:numPr>
-        <w:ind w:left="566" w:right="-324"/>
-        <w:jc w:val="both"/>
-        <w:rPr>
-          <w:rFonts w:ascii="Courier New" w:eastAsia="Courier New" w:hAnsi="Courier New" w:cs="Courier New"/>
-        </w:rPr>
-      </w:pPr>
-      <w:proofErr w:type="spellStart"/>
-      <w:r>
-        <w:rPr>
-          <w:rFonts w:ascii="Courier New" w:eastAsia="Courier New" w:hAnsi="Courier New" w:cs="Courier New"/>
-        </w:rPr>
-        <w:t>DataBank</w:t>
-      </w:r>
-      <w:proofErr w:type="spellEnd"/>
-      <w:r>
-        <w:rPr>
-          <w:rFonts w:ascii="Courier New" w:eastAsia="Courier New" w:hAnsi="Courier New" w:cs="Courier New"/>
-        </w:rPr>
-        <w:t xml:space="preserve"> retorna </w:t>
-      </w:r>
-      <w:r>
-        <w:rPr>
-          <w:rFonts w:ascii="Courier New" w:eastAsia="Courier New" w:hAnsi="Courier New" w:cs="Courier New"/>
-          <w:i/>
-          <w:iCs/>
-        </w:rPr>
-        <w:t>status</w:t>
+        <w:t xml:space="preserve">Sistema </w:t>
       </w:r>
       <w:r>
         <w:rPr>
           <w:rFonts w:ascii="Courier New" w:eastAsia="Courier New" w:hAnsi="Courier New" w:cs="Courier New"/>
         </w:rPr>
-        <w:t xml:space="preserve"> de aprovado para </w:t>
+        <w:t>redireciona Usuário de volta para a tela de login</w:t>
       </w:r>
-      <w:proofErr w:type="gramStart"/>
-      <w:r>
-        <w:rPr>
-          <w:rFonts w:ascii="Courier New" w:eastAsia="Courier New" w:hAnsi="Courier New" w:cs="Courier New"/>
-        </w:rPr>
-        <w:t>Login(</w:t>
-      </w:r>
-      <w:proofErr w:type="gramEnd"/>
-      <w:r>
-        <w:rPr>
-          <w:rFonts w:ascii="Courier New" w:eastAsia="Courier New" w:hAnsi="Courier New" w:cs="Courier New"/>
-        </w:rPr>
-        <w:t>Model);</w:t>
-      </w:r>
-    </w:p>
-    <w:p>
-      <w:pPr>
-        <w:numPr>
-          <w:ilvl w:val="0"/>
-          <w:numId w:val="24"/>
-        </w:numPr>
-        <w:ind w:left="566" w:right="-324"/>
-        <w:jc w:val="both"/>
-        <w:rPr>
-          <w:rFonts w:ascii="Courier New" w:eastAsia="Courier New" w:hAnsi="Courier New" w:cs="Courier New"/>
-        </w:rPr>
-      </w:pPr>
-      <w:proofErr w:type="gramStart"/>
-      <w:r>
-        <w:rPr>
-          <w:rFonts w:ascii="Courier New" w:eastAsia="Courier New" w:hAnsi="Courier New" w:cs="Courier New"/>
-        </w:rPr>
-        <w:t>Login(</w:t>
-      </w:r>
-      <w:proofErr w:type="gramEnd"/>
-      <w:r>
-        <w:rPr>
-          <w:rFonts w:ascii="Courier New" w:eastAsia="Courier New" w:hAnsi="Courier New" w:cs="Courier New"/>
-        </w:rPr>
-        <w:t xml:space="preserve">Model) retorna </w:t>
-      </w:r>
-      <w:proofErr w:type="spellStart"/>
-      <w:r>
-        <w:rPr>
-          <w:rFonts w:ascii="Courier New" w:eastAsia="Courier New" w:hAnsi="Courier New" w:cs="Courier New"/>
-          <w:i/>
-          <w:iCs/>
-        </w:rPr>
-        <w:t>autorizacao</w:t>
-      </w:r>
-      <w:proofErr w:type="spellEnd"/>
-      <w:r>
-        <w:rPr>
-          <w:rFonts w:ascii="Courier New" w:eastAsia="Courier New" w:hAnsi="Courier New" w:cs="Courier New"/>
-        </w:rPr>
-        <w:t xml:space="preserve"> para </w:t>
-      </w:r>
-      <w:proofErr w:type="spellStart"/>
-      <w:r>
-        <w:rPr>
-          <w:rFonts w:ascii="Courier New" w:eastAsia="Courier New" w:hAnsi="Courier New" w:cs="Courier New"/>
-        </w:rPr>
-        <w:t>RoutesControl</w:t>
-      </w:r>
-      <w:proofErr w:type="spellEnd"/>
       <w:r>
         <w:rPr>
           <w:rFonts w:ascii="Courier New" w:eastAsia="Courier New" w:hAnsi="Courier New" w:cs="Courier New"/>
@@ -1836,147 +415,7 @@
     </w:p>
     <w:p>
       <w:pPr>
-        <w:numPr>
-          <w:ilvl w:val="0"/>
-          <w:numId w:val="15"/>
-        </w:numPr>
-        <w:ind w:left="566" w:right="-324"/>
-        <w:jc w:val="both"/>
-        <w:rPr>
-          <w:rFonts w:ascii="Courier New" w:eastAsia="Courier New" w:hAnsi="Courier New" w:cs="Courier New"/>
-        </w:rPr>
-      </w:pPr>
-      <w:r>
-        <w:rPr>
-          <w:rFonts w:ascii="Courier New" w:eastAsia="Courier New" w:hAnsi="Courier New" w:cs="Courier New"/>
-        </w:rPr>
-        <w:t xml:space="preserve">Dependendo de </w:t>
-      </w:r>
-      <w:proofErr w:type="spellStart"/>
-      <w:r>
-        <w:rPr>
-          <w:rFonts w:ascii="Courier New" w:eastAsia="Courier New" w:hAnsi="Courier New" w:cs="Courier New"/>
-          <w:i/>
-          <w:iCs/>
-        </w:rPr>
-        <w:t>autorizacao</w:t>
-      </w:r>
-      <w:proofErr w:type="spellEnd"/>
-      <w:r>
-        <w:rPr>
-          <w:rFonts w:ascii="Courier New" w:eastAsia="Courier New" w:hAnsi="Courier New" w:cs="Courier New"/>
-        </w:rPr>
-        <w:t xml:space="preserve">, ou </w:t>
-      </w:r>
-      <w:proofErr w:type="spellStart"/>
-      <w:proofErr w:type="gramStart"/>
-      <w:r>
-        <w:rPr>
-          <w:rFonts w:ascii="Courier New" w:eastAsia="Courier New" w:hAnsi="Courier New" w:cs="Courier New"/>
-        </w:rPr>
-        <w:t>TrainingView</w:t>
-      </w:r>
-      <w:proofErr w:type="spellEnd"/>
-      <w:r>
-        <w:rPr>
-          <w:rFonts w:ascii="Courier New" w:eastAsia="Courier New" w:hAnsi="Courier New" w:cs="Courier New"/>
-        </w:rPr>
-        <w:t>(</w:t>
-      </w:r>
-      <w:proofErr w:type="gramEnd"/>
-      <w:r>
-        <w:rPr>
-          <w:rFonts w:ascii="Courier New" w:eastAsia="Courier New" w:hAnsi="Courier New" w:cs="Courier New"/>
-        </w:rPr>
-        <w:t xml:space="preserve">Dashboard principal do </w:t>
-      </w:r>
-      <w:r>
-        <w:rPr>
-          <w:rFonts w:ascii="Courier New" w:eastAsia="Courier New" w:hAnsi="Courier New" w:cs="Courier New"/>
-        </w:rPr>
-        <w:t>Usuário</w:t>
-      </w:r>
-      <w:r>
-        <w:rPr>
-          <w:rFonts w:ascii="Courier New" w:eastAsia="Courier New" w:hAnsi="Courier New" w:cs="Courier New"/>
-        </w:rPr>
-        <w:t xml:space="preserve">) ou </w:t>
-      </w:r>
-      <w:proofErr w:type="spellStart"/>
-      <w:proofErr w:type="gramStart"/>
-      <w:r>
-        <w:rPr>
-          <w:rFonts w:ascii="Courier New" w:eastAsia="Courier New" w:hAnsi="Courier New" w:cs="Courier New"/>
-        </w:rPr>
-        <w:t>StudentListingView</w:t>
-      </w:r>
-      <w:proofErr w:type="spellEnd"/>
-      <w:r>
-        <w:rPr>
-          <w:rFonts w:ascii="Courier New" w:eastAsia="Courier New" w:hAnsi="Courier New" w:cs="Courier New"/>
-        </w:rPr>
-        <w:t>(</w:t>
-      </w:r>
-      <w:proofErr w:type="gramEnd"/>
-      <w:r>
-        <w:rPr>
-          <w:rFonts w:ascii="Courier New" w:eastAsia="Courier New" w:hAnsi="Courier New" w:cs="Courier New"/>
-        </w:rPr>
-        <w:t xml:space="preserve">Dashboard principal do Personal) chamar </w:t>
-      </w:r>
-      <w:proofErr w:type="gramStart"/>
-      <w:r>
-        <w:rPr>
-          <w:rFonts w:ascii="Courier New" w:eastAsia="Courier New" w:hAnsi="Courier New" w:cs="Courier New"/>
-        </w:rPr>
-        <w:t>render(</w:t>
-      </w:r>
-      <w:proofErr w:type="gramEnd"/>
-      <w:r>
-        <w:rPr>
-          <w:rFonts w:ascii="Courier New" w:eastAsia="Courier New" w:hAnsi="Courier New" w:cs="Courier New"/>
-        </w:rPr>
-        <w:t>); para serem exibidas;</w:t>
-      </w:r>
-    </w:p>
-    <w:p>
-      <w:pPr>
-        <w:ind w:right="-324"/>
-        <w:jc w:val="both"/>
-        <w:rPr>
-          <w:rFonts w:ascii="Courier New" w:eastAsia="Courier New" w:hAnsi="Courier New" w:cs="Courier New"/>
-        </w:rPr>
-      </w:pPr>
-      <w:r>
-        <w:br w:type="page"/>
-      </w:r>
-    </w:p>
-    <w:p>
-      <w:pPr>
-        <w:ind w:right="-324"/>
-        <w:jc w:val="both"/>
-        <w:rPr>
-          <w:rFonts w:ascii="Courier New" w:eastAsia="Courier New" w:hAnsi="Courier New" w:cs="Courier New"/>
-        </w:rPr>
-      </w:pPr>
-    </w:p>
-    <w:p>
-      <w:pPr>
-        <w:pStyle w:val="Ttulo"/>
-      </w:pPr>
-      <w:bookmarkStart w:id="3" w:name="_p4tya94guwh4" w:colFirst="0" w:colLast="0"/>
-      <w:bookmarkEnd w:id="3"/>
-      <w:r>
-        <w:t>Fluxo Alternativo III (8, 1.9)</w:t>
-      </w:r>
-    </w:p>
-    <w:p>
-      <w:pPr>
-        <w:numPr>
-          <w:ilvl w:val="0"/>
-          <w:numId w:val="18"/>
-        </w:numPr>
-        <w:ind w:left="566" w:right="-324" w:hanging="570"/>
+        <w:ind w:right="21"/>
         <w:jc w:val="both"/>
         <w:rPr>
           <w:rFonts w:ascii="Courier New" w:eastAsia="Courier New" w:hAnsi="Courier New" w:cs="Courier New"/>
@@ -1984,189 +423,6 @@
           <w:bCs/>
         </w:rPr>
       </w:pPr>
-      <w:proofErr w:type="spellStart"/>
-      <w:r>
-        <w:rPr>
-          <w:rFonts w:ascii="Courier New" w:eastAsia="Courier New" w:hAnsi="Courier New" w:cs="Courier New"/>
-        </w:rPr>
-        <w:t>DataBank</w:t>
-      </w:r>
-      <w:proofErr w:type="spellEnd"/>
-      <w:r>
-        <w:rPr>
-          <w:rFonts w:ascii="Courier New" w:eastAsia="Courier New" w:hAnsi="Courier New" w:cs="Courier New"/>
-        </w:rPr>
-        <w:t xml:space="preserve"> retorna </w:t>
-      </w:r>
-      <w:r>
-        <w:rPr>
-          <w:rFonts w:ascii="Courier New" w:eastAsia="Courier New" w:hAnsi="Courier New" w:cs="Courier New"/>
-          <w:i/>
-          <w:iCs/>
-        </w:rPr>
-        <w:t>status</w:t>
-      </w:r>
-      <w:r>
-        <w:rPr>
-          <w:rFonts w:ascii="Courier New" w:eastAsia="Courier New" w:hAnsi="Courier New" w:cs="Courier New"/>
-        </w:rPr>
-        <w:t xml:space="preserve"> de reprovado para </w:t>
-      </w:r>
-      <w:proofErr w:type="gramStart"/>
-      <w:r>
-        <w:rPr>
-          <w:rFonts w:ascii="Courier New" w:eastAsia="Courier New" w:hAnsi="Courier New" w:cs="Courier New"/>
-        </w:rPr>
-        <w:t>Login(</w:t>
-      </w:r>
-      <w:proofErr w:type="gramEnd"/>
-      <w:r>
-        <w:rPr>
-          <w:rFonts w:ascii="Courier New" w:eastAsia="Courier New" w:hAnsi="Courier New" w:cs="Courier New"/>
-        </w:rPr>
-        <w:t>Model);</w:t>
-      </w:r>
-    </w:p>
-    <w:p>
-      <w:pPr>
-        <w:numPr>
-          <w:ilvl w:val="0"/>
-          <w:numId w:val="18"/>
-        </w:numPr>
-        <w:ind w:left="566" w:right="-324" w:hanging="570"/>
-        <w:jc w:val="both"/>
-        <w:rPr>
-          <w:rFonts w:ascii="Courier New" w:eastAsia="Courier New" w:hAnsi="Courier New" w:cs="Courier New"/>
-          <w:b/>
-          <w:bCs/>
-        </w:rPr>
-      </w:pPr>
-      <w:proofErr w:type="gramStart"/>
-      <w:r>
-        <w:rPr>
-          <w:rFonts w:ascii="Courier New" w:eastAsia="Courier New" w:hAnsi="Courier New" w:cs="Courier New"/>
-        </w:rPr>
-        <w:t>Login(</w:t>
-      </w:r>
-      <w:proofErr w:type="gramEnd"/>
-      <w:r>
-        <w:rPr>
-          <w:rFonts w:ascii="Courier New" w:eastAsia="Courier New" w:hAnsi="Courier New" w:cs="Courier New"/>
-        </w:rPr>
-        <w:t xml:space="preserve">Model) retorna </w:t>
-      </w:r>
-      <w:proofErr w:type="spellStart"/>
-      <w:r>
-        <w:rPr>
-          <w:rFonts w:ascii="Courier New" w:eastAsia="Courier New" w:hAnsi="Courier New" w:cs="Courier New"/>
-          <w:i/>
-          <w:iCs/>
-        </w:rPr>
-        <w:t>autorizacao</w:t>
-      </w:r>
-      <w:proofErr w:type="spellEnd"/>
-      <w:r>
-        <w:rPr>
-          <w:rFonts w:ascii="Courier New" w:eastAsia="Courier New" w:hAnsi="Courier New" w:cs="Courier New"/>
-        </w:rPr>
-        <w:t xml:space="preserve"> para </w:t>
-      </w:r>
-      <w:proofErr w:type="spellStart"/>
-      <w:r>
-        <w:rPr>
-          <w:rFonts w:ascii="Courier New" w:eastAsia="Courier New" w:hAnsi="Courier New" w:cs="Courier New"/>
-        </w:rPr>
-        <w:t>RoutesControl</w:t>
-      </w:r>
-      <w:proofErr w:type="spellEnd"/>
-      <w:r>
-        <w:rPr>
-          <w:rFonts w:ascii="Courier New" w:eastAsia="Courier New" w:hAnsi="Courier New" w:cs="Courier New"/>
-        </w:rPr>
-        <w:t>;</w:t>
-      </w:r>
-    </w:p>
-    <w:p>
-      <w:pPr>
-        <w:numPr>
-          <w:ilvl w:val="0"/>
-          <w:numId w:val="18"/>
-        </w:numPr>
-        <w:ind w:left="566" w:right="-324" w:hanging="570"/>
-        <w:jc w:val="both"/>
-        <w:rPr>
-          <w:rFonts w:ascii="Courier New" w:eastAsia="Courier New" w:hAnsi="Courier New" w:cs="Courier New"/>
-          <w:b/>
-          <w:bCs/>
-        </w:rPr>
-      </w:pPr>
-      <w:proofErr w:type="spellStart"/>
-      <w:r>
-        <w:rPr>
-          <w:rFonts w:ascii="Courier New" w:eastAsia="Courier New" w:hAnsi="Courier New" w:cs="Courier New"/>
-        </w:rPr>
-        <w:t>LoginView</w:t>
-      </w:r>
-      <w:proofErr w:type="spellEnd"/>
-      <w:r>
-        <w:rPr>
-          <w:rFonts w:ascii="Courier New" w:eastAsia="Courier New" w:hAnsi="Courier New" w:cs="Courier New"/>
-        </w:rPr>
-        <w:t xml:space="preserve"> chama </w:t>
-      </w:r>
-      <w:proofErr w:type="gramStart"/>
-      <w:r>
-        <w:rPr>
-          <w:rFonts w:ascii="Courier New" w:eastAsia="Courier New" w:hAnsi="Courier New" w:cs="Courier New"/>
-        </w:rPr>
-        <w:t>render(</w:t>
-      </w:r>
-      <w:proofErr w:type="gramEnd"/>
-      <w:r>
-        <w:rPr>
-          <w:rFonts w:ascii="Courier New" w:eastAsia="Courier New" w:hAnsi="Courier New" w:cs="Courier New"/>
-        </w:rPr>
-        <w:t>); para ser exibida novamente;</w:t>
-      </w:r>
-    </w:p>
-    <w:p>
-      <w:pPr>
-        <w:numPr>
-          <w:ilvl w:val="0"/>
-          <w:numId w:val="18"/>
-        </w:numPr>
-        <w:ind w:left="566" w:right="-324" w:hanging="570"/>
-        <w:jc w:val="both"/>
-        <w:rPr>
-          <w:rFonts w:ascii="Courier New" w:eastAsia="Courier New" w:hAnsi="Courier New" w:cs="Courier New"/>
-        </w:rPr>
-      </w:pPr>
-      <w:proofErr w:type="spellStart"/>
-      <w:r>
-        <w:rPr>
-          <w:rFonts w:ascii="Courier New" w:eastAsia="Courier New" w:hAnsi="Courier New" w:cs="Courier New"/>
-        </w:rPr>
-        <w:t>LoginView</w:t>
-      </w:r>
-      <w:proofErr w:type="spellEnd"/>
-      <w:r>
-        <w:rPr>
-          <w:rFonts w:ascii="Courier New" w:eastAsia="Courier New" w:hAnsi="Courier New" w:cs="Courier New"/>
-        </w:rPr>
-        <w:t xml:space="preserve"> exibe uma mensagem de erro para o </w:t>
-      </w:r>
-      <w:r>
-        <w:rPr>
-          <w:rFonts w:ascii="Courier New" w:eastAsia="Courier New" w:hAnsi="Courier New" w:cs="Courier New"/>
-        </w:rPr>
-        <w:t>Usuário</w:t>
-      </w:r>
-      <w:r>
-        <w:rPr>
-          <w:rFonts w:ascii="Courier New" w:eastAsia="Courier New" w:hAnsi="Courier New" w:cs="Courier New"/>
-        </w:rPr>
-        <w:t>(ator);</w:t>
-      </w:r>
     </w:p>
     <w:sectPr>
       <w:headerReference w:type="default" r:id="rId7"/>
@@ -2449,16 +705,17 @@
   <w:abstractNum w:abstractNumId="1" w15:restartNumberingAfterBreak="0">
     <w:nsid w:val="014D0D2B"/>
     <w:multiLevelType w:val="multilevel"/>
-    <w:tmpl w:val="9588E7FE"/>
+    <w:tmpl w:val="298650AE"/>
     <w:lvl w:ilvl="0">
-      <w:start w:val="1"/>
+      <w:start w:val="4"/>
       <w:numFmt w:val="decimal"/>
       <w:lvlText w:val="%1.2"/>
       <w:lvlJc w:val="left"/>
       <w:pPr>
-        <w:ind w:left="720" w:hanging="360"/>
-      </w:pPr>
-      <w:rPr>
+        <w:ind w:left="360" w:hanging="360"/>
+      </w:pPr>
+      <w:rPr>
+        <w:rFonts w:hint="default"/>
         <w:u w:val="none"/>
       </w:rPr>
     </w:lvl>
@@ -2468,9 +725,10 @@
       <w:lvlText w:val="%2.1"/>
       <w:lvlJc w:val="left"/>
       <w:pPr>
-        <w:ind w:left="1440" w:hanging="360"/>
-      </w:pPr>
-      <w:rPr>
+        <w:ind w:left="1080" w:hanging="360"/>
+      </w:pPr>
+      <w:rPr>
+        <w:rFonts w:hint="default"/>
         <w:u w:val="none"/>
       </w:rPr>
     </w:lvl>
@@ -2480,9 +738,10 @@
       <w:lvlText w:val="%3.1"/>
       <w:lvlJc w:val="right"/>
       <w:pPr>
-        <w:ind w:left="2160" w:hanging="360"/>
-      </w:pPr>
-      <w:rPr>
+        <w:ind w:left="1800" w:hanging="360"/>
+      </w:pPr>
+      <w:rPr>
+        <w:rFonts w:hint="default"/>
         <w:u w:val="none"/>
       </w:rPr>
     </w:lvl>
@@ -2492,9 +751,10 @@
       <w:lvlText w:val="%4.1"/>
       <w:lvlJc w:val="left"/>
       <w:pPr>
-        <w:ind w:left="2880" w:hanging="360"/>
-      </w:pPr>
-      <w:rPr>
+        <w:ind w:left="2520" w:hanging="360"/>
+      </w:pPr>
+      <w:rPr>
+        <w:rFonts w:hint="default"/>
         <w:u w:val="none"/>
       </w:rPr>
     </w:lvl>
@@ -2504,9 +764,10 @@
       <w:lvlText w:val="%5.1"/>
       <w:lvlJc w:val="left"/>
       <w:pPr>
-        <w:ind w:left="3600" w:hanging="360"/>
-      </w:pPr>
-      <w:rPr>
+        <w:ind w:left="3240" w:hanging="360"/>
+      </w:pPr>
+      <w:rPr>
+        <w:rFonts w:hint="default"/>
         <w:u w:val="none"/>
       </w:rPr>
     </w:lvl>
@@ -2516,9 +777,10 @@
       <w:lvlText w:val="%6.1"/>
       <w:lvlJc w:val="right"/>
       <w:pPr>
-        <w:ind w:left="4320" w:hanging="360"/>
-      </w:pPr>
-      <w:rPr>
+        <w:ind w:left="3960" w:hanging="360"/>
+      </w:pPr>
+      <w:rPr>
+        <w:rFonts w:hint="default"/>
         <w:u w:val="none"/>
       </w:rPr>
     </w:lvl>
@@ -2528,9 +790,10 @@
       <w:lvlText w:val="%7.1"/>
       <w:lvlJc w:val="left"/>
       <w:pPr>
-        <w:ind w:left="5040" w:hanging="360"/>
-      </w:pPr>
-      <w:rPr>
+        <w:ind w:left="4680" w:hanging="360"/>
+      </w:pPr>
+      <w:rPr>
+        <w:rFonts w:hint="default"/>
         <w:u w:val="none"/>
       </w:rPr>
     </w:lvl>
@@ -2540,9 +803,10 @@
       <w:lvlText w:val="%8.1"/>
       <w:lvlJc w:val="left"/>
       <w:pPr>
-        <w:ind w:left="5760" w:hanging="360"/>
-      </w:pPr>
-      <w:rPr>
+        <w:ind w:left="5400" w:hanging="360"/>
+      </w:pPr>
+      <w:rPr>
+        <w:rFonts w:hint="default"/>
         <w:u w:val="none"/>
       </w:rPr>
     </w:lvl>
@@ -2552,9 +816,10 @@
       <w:lvlText w:val="%9.1"/>
       <w:lvlJc w:val="right"/>
       <w:pPr>
-        <w:ind w:left="6480" w:hanging="360"/>
-      </w:pPr>
-      <w:rPr>
+        <w:ind w:left="6120" w:hanging="360"/>
+      </w:pPr>
+      <w:rPr>
+        <w:rFonts w:hint="default"/>
         <w:u w:val="none"/>
       </w:rPr>
     </w:lvl>
@@ -2789,6 +1054,128 @@
     </w:lvl>
   </w:abstractNum>
   <w:abstractNum w:abstractNumId="4" w15:restartNumberingAfterBreak="0">
+    <w:nsid w:val="125E4B47"/>
+    <w:multiLevelType w:val="multilevel"/>
+    <w:tmpl w:val="ACC23672"/>
+    <w:lvl w:ilvl="0">
+      <w:start w:val="4"/>
+      <w:numFmt w:val="decimal"/>
+      <w:lvlText w:val="%1.2"/>
+      <w:lvlJc w:val="left"/>
+      <w:pPr>
+        <w:ind w:left="360" w:hanging="360"/>
+      </w:pPr>
+      <w:rPr>
+        <w:rFonts w:hint="default"/>
+        <w:u w:val="none"/>
+      </w:rPr>
+    </w:lvl>
+    <w:lvl w:ilvl="1">
+      <w:start w:val="1"/>
+      <w:numFmt w:val="lowerLetter"/>
+      <w:lvlText w:val="%2.1"/>
+      <w:lvlJc w:val="left"/>
+      <w:pPr>
+        <w:ind w:left="1080" w:hanging="360"/>
+      </w:pPr>
+      <w:rPr>
+        <w:rFonts w:hint="default"/>
+        <w:u w:val="none"/>
+      </w:rPr>
+    </w:lvl>
+    <w:lvl w:ilvl="2">
+      <w:start w:val="1"/>
+      <w:numFmt w:val="lowerRoman"/>
+      <w:lvlText w:val="%3.1"/>
+      <w:lvlJc w:val="right"/>
+      <w:pPr>
+        <w:ind w:left="1800" w:hanging="360"/>
+      </w:pPr>
+      <w:rPr>
+        <w:rFonts w:hint="default"/>
+        <w:u w:val="none"/>
+      </w:rPr>
+    </w:lvl>
+    <w:lvl w:ilvl="3">
+      <w:start w:val="1"/>
+      <w:numFmt w:val="decimal"/>
+      <w:lvlText w:val="%4.1"/>
+      <w:lvlJc w:val="left"/>
+      <w:pPr>
+        <w:ind w:left="2520" w:hanging="360"/>
+      </w:pPr>
+      <w:rPr>
+        <w:rFonts w:hint="default"/>
+        <w:u w:val="none"/>
+      </w:rPr>
+    </w:lvl>
+    <w:lvl w:ilvl="4">
+      <w:start w:val="1"/>
+      <w:numFmt w:val="lowerLetter"/>
+      <w:lvlText w:val="%5.1"/>
+      <w:lvlJc w:val="left"/>
+      <w:pPr>
+        <w:ind w:left="3240" w:hanging="360"/>
+      </w:pPr>
+      <w:rPr>
+        <w:rFonts w:hint="default"/>
+        <w:u w:val="none"/>
+      </w:rPr>
+    </w:lvl>
+    <w:lvl w:ilvl="5">
+      <w:start w:val="1"/>
+      <w:numFmt w:val="lowerRoman"/>
+      <w:lvlText w:val="%6.1"/>
+      <w:lvlJc w:val="right"/>
+      <w:pPr>
+        <w:ind w:left="3960" w:hanging="360"/>
+      </w:pPr>
+      <w:rPr>
+        <w:rFonts w:hint="default"/>
+        <w:u w:val="none"/>
+      </w:rPr>
+    </w:lvl>
+    <w:lvl w:ilvl="6">
+      <w:start w:val="1"/>
+      <w:numFmt w:val="decimal"/>
+      <w:lvlText w:val="%7.1"/>
+      <w:lvlJc w:val="left"/>
+      <w:pPr>
+        <w:ind w:left="4680" w:hanging="360"/>
+      </w:pPr>
+      <w:rPr>
+        <w:rFonts w:hint="default"/>
+        <w:u w:val="none"/>
+      </w:rPr>
+    </w:lvl>
+    <w:lvl w:ilvl="7">
+      <w:start w:val="1"/>
+      <w:numFmt w:val="lowerLetter"/>
+      <w:lvlText w:val="%8.1"/>
+      <w:lvlJc w:val="left"/>
+      <w:pPr>
+        <w:ind w:left="5400" w:hanging="360"/>
+      </w:pPr>
+      <w:rPr>
+        <w:rFonts w:hint="default"/>
+        <w:u w:val="none"/>
+      </w:rPr>
+    </w:lvl>
+    <w:lvl w:ilvl="8">
+      <w:start w:val="1"/>
+      <w:numFmt w:val="lowerRoman"/>
+      <w:lvlText w:val="%9.1"/>
+      <w:lvlJc w:val="right"/>
+      <w:pPr>
+        <w:ind w:left="6120" w:hanging="360"/>
+      </w:pPr>
+      <w:rPr>
+        <w:rFonts w:hint="default"/>
+        <w:u w:val="none"/>
+      </w:rPr>
+    </w:lvl>
+  </w:abstractNum>
+  <w:abstractNum w:abstractNumId="5" w15:restartNumberingAfterBreak="0">
     <w:nsid w:val="1A4A501D"/>
     <w:multiLevelType w:val="multilevel"/>
     <w:tmpl w:val="69AE9F64"/>
@@ -2904,7 +1291,129 @@
       </w:rPr>
     </w:lvl>
   </w:abstractNum>
-  <w:abstractNum w:abstractNumId="5" w15:restartNumberingAfterBreak="0">
+  <w:abstractNum w:abstractNumId="6" w15:restartNumberingAfterBreak="0">
+    <w:nsid w:val="20620D14"/>
+    <w:multiLevelType w:val="multilevel"/>
+    <w:tmpl w:val="4984A67E"/>
+    <w:lvl w:ilvl="0">
+      <w:start w:val="4"/>
+      <w:numFmt w:val="decimal"/>
+      <w:lvlText w:val="%1."/>
+      <w:lvlJc w:val="left"/>
+      <w:pPr>
+        <w:ind w:left="740" w:hanging="360"/>
+      </w:pPr>
+      <w:rPr>
+        <w:rFonts w:hint="default"/>
+        <w:u w:val="none"/>
+      </w:rPr>
+    </w:lvl>
+    <w:lvl w:ilvl="1">
+      <w:start w:val="1"/>
+      <w:numFmt w:val="lowerLetter"/>
+      <w:lvlText w:val="%2."/>
+      <w:lvlJc w:val="left"/>
+      <w:pPr>
+        <w:ind w:left="1460" w:hanging="360"/>
+      </w:pPr>
+      <w:rPr>
+        <w:rFonts w:hint="default"/>
+        <w:u w:val="none"/>
+      </w:rPr>
+    </w:lvl>
+    <w:lvl w:ilvl="2">
+      <w:start w:val="1"/>
+      <w:numFmt w:val="lowerRoman"/>
+      <w:lvlText w:val="%3."/>
+      <w:lvlJc w:val="right"/>
+      <w:pPr>
+        <w:ind w:left="2180" w:hanging="360"/>
+      </w:pPr>
+      <w:rPr>
+        <w:rFonts w:hint="default"/>
+        <w:u w:val="none"/>
+      </w:rPr>
+    </w:lvl>
+    <w:lvl w:ilvl="3">
+      <w:start w:val="1"/>
+      <w:numFmt w:val="decimal"/>
+      <w:lvlText w:val="%4."/>
+      <w:lvlJc w:val="left"/>
+      <w:pPr>
+        <w:ind w:left="2900" w:hanging="360"/>
+      </w:pPr>
+      <w:rPr>
+        <w:rFonts w:hint="default"/>
+        <w:u w:val="none"/>
+      </w:rPr>
+    </w:lvl>
+    <w:lvl w:ilvl="4">
+      <w:start w:val="1"/>
+      <w:numFmt w:val="lowerLetter"/>
+      <w:lvlText w:val="%5."/>
+      <w:lvlJc w:val="left"/>
+      <w:pPr>
+        <w:ind w:left="3620" w:hanging="360"/>
+      </w:pPr>
+      <w:rPr>
+        <w:rFonts w:hint="default"/>
+        <w:u w:val="none"/>
+      </w:rPr>
+    </w:lvl>
+    <w:lvl w:ilvl="5">
+      <w:start w:val="1"/>
+      <w:numFmt w:val="lowerRoman"/>
+      <w:lvlText w:val="%6."/>
+      <w:lvlJc w:val="right"/>
+      <w:pPr>
+        <w:ind w:left="4340" w:hanging="360"/>
+      </w:pPr>
+      <w:rPr>
+        <w:rFonts w:hint="default"/>
+        <w:u w:val="none"/>
+      </w:rPr>
+    </w:lvl>
+    <w:lvl w:ilvl="6">
+      <w:start w:val="1"/>
+      <w:numFmt w:val="decimal"/>
+      <w:lvlText w:val="%7."/>
+      <w:lvlJc w:val="left"/>
+      <w:pPr>
+        <w:ind w:left="5060" w:hanging="360"/>
+      </w:pPr>
+      <w:rPr>
+        <w:rFonts w:hint="default"/>
+        <w:u w:val="none"/>
+      </w:rPr>
+    </w:lvl>
+    <w:lvl w:ilvl="7">
+      <w:start w:val="1"/>
+      <w:numFmt w:val="lowerLetter"/>
+      <w:lvlText w:val="%8."/>
+      <w:lvlJc w:val="left"/>
+      <w:pPr>
+        <w:ind w:left="5780" w:hanging="360"/>
+      </w:pPr>
+      <w:rPr>
+        <w:rFonts w:hint="default"/>
+        <w:u w:val="none"/>
+      </w:rPr>
+    </w:lvl>
+    <w:lvl w:ilvl="8">
+      <w:start w:val="1"/>
+      <w:numFmt w:val="lowerRoman"/>
+      <w:lvlText w:val="%9."/>
+      <w:lvlJc w:val="right"/>
+      <w:pPr>
+        <w:ind w:left="6500" w:hanging="360"/>
+      </w:pPr>
+      <w:rPr>
+        <w:rFonts w:hint="default"/>
+        <w:u w:val="none"/>
+      </w:rPr>
+    </w:lvl>
+  </w:abstractNum>
+  <w:abstractNum w:abstractNumId="7" w15:restartNumberingAfterBreak="0">
     <w:nsid w:val="221704D4"/>
     <w:multiLevelType w:val="multilevel"/>
     <w:tmpl w:val="E790014E"/>
@@ -3020,19 +1529,20 @@
       </w:rPr>
     </w:lvl>
   </w:abstractNum>
-  <w:abstractNum w:abstractNumId="6" w15:restartNumberingAfterBreak="0">
+  <w:abstractNum w:abstractNumId="8" w15:restartNumberingAfterBreak="0">
     <w:nsid w:val="23B22F64"/>
     <w:multiLevelType w:val="multilevel"/>
-    <w:tmpl w:val="D8C24BB4"/>
+    <w:tmpl w:val="4A1C73E8"/>
     <w:lvl w:ilvl="0">
-      <w:start w:val="1"/>
+      <w:start w:val="4"/>
       <w:numFmt w:val="decimal"/>
       <w:lvlText w:val="%1.1"/>
       <w:lvlJc w:val="left"/>
       <w:pPr>
-        <w:ind w:left="720" w:hanging="360"/>
-      </w:pPr>
-      <w:rPr>
+        <w:ind w:left="360" w:hanging="360"/>
+      </w:pPr>
+      <w:rPr>
+        <w:rFonts w:hint="default"/>
         <w:u w:val="none"/>
       </w:rPr>
     </w:lvl>
@@ -3042,9 +1552,10 @@
       <w:lvlText w:val="%2.1"/>
       <w:lvlJc w:val="left"/>
       <w:pPr>
-        <w:ind w:left="1440" w:hanging="360"/>
-      </w:pPr>
-      <w:rPr>
+        <w:ind w:left="1080" w:hanging="360"/>
+      </w:pPr>
+      <w:rPr>
+        <w:rFonts w:hint="default"/>
         <w:u w:val="none"/>
       </w:rPr>
     </w:lvl>
@@ -3054,9 +1565,10 @@
       <w:lvlText w:val="%3.1"/>
       <w:lvlJc w:val="right"/>
       <w:pPr>
-        <w:ind w:left="2160" w:hanging="360"/>
-      </w:pPr>
-      <w:rPr>
+        <w:ind w:left="1800" w:hanging="360"/>
+      </w:pPr>
+      <w:rPr>
+        <w:rFonts w:hint="default"/>
         <w:u w:val="none"/>
       </w:rPr>
     </w:lvl>
@@ -3066,9 +1578,10 @@
       <w:lvlText w:val="%4.1"/>
       <w:lvlJc w:val="left"/>
       <w:pPr>
-        <w:ind w:left="2880" w:hanging="360"/>
-      </w:pPr>
-      <w:rPr>
+        <w:ind w:left="2520" w:hanging="360"/>
+      </w:pPr>
+      <w:rPr>
+        <w:rFonts w:hint="default"/>
         <w:u w:val="none"/>
       </w:rPr>
     </w:lvl>
@@ -3078,9 +1591,10 @@
       <w:lvlText w:val="%5.1"/>
       <w:lvlJc w:val="left"/>
       <w:pPr>
-        <w:ind w:left="3600" w:hanging="360"/>
-      </w:pPr>
-      <w:rPr>
+        <w:ind w:left="3240" w:hanging="360"/>
+      </w:pPr>
+      <w:rPr>
+        <w:rFonts w:hint="default"/>
         <w:u w:val="none"/>
       </w:rPr>
     </w:lvl>
@@ -3090,9 +1604,10 @@
       <w:lvlText w:val="%6.1"/>
       <w:lvlJc w:val="right"/>
       <w:pPr>
-        <w:ind w:left="4320" w:hanging="360"/>
-      </w:pPr>
-      <w:rPr>
+        <w:ind w:left="3960" w:hanging="360"/>
+      </w:pPr>
+      <w:rPr>
+        <w:rFonts w:hint="default"/>
         <w:u w:val="none"/>
       </w:rPr>
     </w:lvl>
@@ -3102,9 +1617,10 @@
       <w:lvlText w:val="%7.1"/>
       <w:lvlJc w:val="left"/>
       <w:pPr>
-        <w:ind w:left="5040" w:hanging="360"/>
-      </w:pPr>
-      <w:rPr>
+        <w:ind w:left="4680" w:hanging="360"/>
+      </w:pPr>
+      <w:rPr>
+        <w:rFonts w:hint="default"/>
         <w:u w:val="none"/>
       </w:rPr>
     </w:lvl>
@@ -3114,9 +1630,10 @@
       <w:lvlText w:val="%8.1"/>
       <w:lvlJc w:val="left"/>
       <w:pPr>
-        <w:ind w:left="5760" w:hanging="360"/>
-      </w:pPr>
-      <w:rPr>
+        <w:ind w:left="5400" w:hanging="360"/>
+      </w:pPr>
+      <w:rPr>
+        <w:rFonts w:hint="default"/>
         <w:u w:val="none"/>
       </w:rPr>
     </w:lvl>
@@ -3126,26 +1643,28 @@
       <w:lvlText w:val="%9.1"/>
       <w:lvlJc w:val="right"/>
       <w:pPr>
-        <w:ind w:left="6480" w:hanging="360"/>
-      </w:pPr>
-      <w:rPr>
+        <w:ind w:left="6120" w:hanging="360"/>
+      </w:pPr>
+      <w:rPr>
+        <w:rFonts w:hint="default"/>
         <w:u w:val="none"/>
       </w:rPr>
     </w:lvl>
   </w:abstractNum>
-  <w:abstractNum w:abstractNumId="7" w15:restartNumberingAfterBreak="0">
+  <w:abstractNum w:abstractNumId="9" w15:restartNumberingAfterBreak="0">
     <w:nsid w:val="25A15D6C"/>
     <w:multiLevelType w:val="multilevel"/>
-    <w:tmpl w:val="6268C890"/>
+    <w:tmpl w:val="715A00C2"/>
     <w:lvl w:ilvl="0">
-      <w:start w:val="1"/>
+      <w:start w:val="4"/>
       <w:numFmt w:val="decimal"/>
       <w:lvlText w:val="%1.3"/>
       <w:lvlJc w:val="left"/>
       <w:pPr>
-        <w:ind w:left="720" w:hanging="360"/>
-      </w:pPr>
-      <w:rPr>
+        <w:ind w:left="360" w:hanging="360"/>
+      </w:pPr>
+      <w:rPr>
+        <w:rFonts w:hint="default"/>
         <w:u w:val="none"/>
       </w:rPr>
     </w:lvl>
@@ -3155,9 +1674,10 @@
       <w:lvlText w:val="%2.1"/>
       <w:lvlJc w:val="left"/>
       <w:pPr>
-        <w:ind w:left="1440" w:hanging="360"/>
-      </w:pPr>
-      <w:rPr>
+        <w:ind w:left="1080" w:hanging="360"/>
+      </w:pPr>
+      <w:rPr>
+        <w:rFonts w:hint="default"/>
         <w:u w:val="none"/>
       </w:rPr>
     </w:lvl>
@@ -3167,9 +1687,10 @@
       <w:lvlText w:val="%3.1"/>
       <w:lvlJc w:val="right"/>
       <w:pPr>
-        <w:ind w:left="2160" w:hanging="360"/>
-      </w:pPr>
-      <w:rPr>
+        <w:ind w:left="1800" w:hanging="360"/>
+      </w:pPr>
+      <w:rPr>
+        <w:rFonts w:hint="default"/>
         <w:u w:val="none"/>
       </w:rPr>
     </w:lvl>
@@ -3179,9 +1700,10 @@
       <w:lvlText w:val="%4.1"/>
       <w:lvlJc w:val="left"/>
       <w:pPr>
-        <w:ind w:left="2880" w:hanging="360"/>
-      </w:pPr>
-      <w:rPr>
+        <w:ind w:left="2520" w:hanging="360"/>
+      </w:pPr>
+      <w:rPr>
+        <w:rFonts w:hint="default"/>
         <w:u w:val="none"/>
       </w:rPr>
     </w:lvl>
@@ -3191,9 +1713,10 @@
       <w:lvlText w:val="%5.1"/>
       <w:lvlJc w:val="left"/>
       <w:pPr>
-        <w:ind w:left="3600" w:hanging="360"/>
-      </w:pPr>
-      <w:rPr>
+        <w:ind w:left="3240" w:hanging="360"/>
+      </w:pPr>
+      <w:rPr>
+        <w:rFonts w:hint="default"/>
         <w:u w:val="none"/>
       </w:rPr>
     </w:lvl>
@@ -3203,9 +1726,10 @@
       <w:lvlText w:val="%6.1"/>
       <w:lvlJc w:val="right"/>
       <w:pPr>
-        <w:ind w:left="4320" w:hanging="360"/>
-      </w:pPr>
-      <w:rPr>
+        <w:ind w:left="3960" w:hanging="360"/>
+      </w:pPr>
+      <w:rPr>
+        <w:rFonts w:hint="default"/>
         <w:u w:val="none"/>
       </w:rPr>
     </w:lvl>
@@ -3215,9 +1739,10 @@
       <w:lvlText w:val="%7.1"/>
       <w:lvlJc w:val="left"/>
       <w:pPr>
-        <w:ind w:left="5040" w:hanging="360"/>
-      </w:pPr>
-      <w:rPr>
+        <w:ind w:left="4680" w:hanging="360"/>
+      </w:pPr>
+      <w:rPr>
+        <w:rFonts w:hint="default"/>
         <w:u w:val="none"/>
       </w:rPr>
     </w:lvl>
@@ -3227,9 +1752,10 @@
       <w:lvlText w:val="%8.1"/>
       <w:lvlJc w:val="left"/>
       <w:pPr>
-        <w:ind w:left="5760" w:hanging="360"/>
-      </w:pPr>
-      <w:rPr>
+        <w:ind w:left="5400" w:hanging="360"/>
+      </w:pPr>
+      <w:rPr>
+        <w:rFonts w:hint="default"/>
         <w:u w:val="none"/>
       </w:rPr>
     </w:lvl>
@@ -3239,14 +1765,128 @@
       <w:lvlText w:val="%9.1"/>
       <w:lvlJc w:val="right"/>
       <w:pPr>
-        <w:ind w:left="6480" w:hanging="360"/>
-      </w:pPr>
-      <w:rPr>
+        <w:ind w:left="6120" w:hanging="360"/>
+      </w:pPr>
+      <w:rPr>
+        <w:rFonts w:hint="default"/>
         <w:u w:val="none"/>
       </w:rPr>
     </w:lvl>
   </w:abstractNum>
-  <w:abstractNum w:abstractNumId="8" w15:restartNumberingAfterBreak="0">
+  <w:abstractNum w:abstractNumId="10" w15:restartNumberingAfterBreak="0">
+    <w:nsid w:val="28853045"/>
+    <w:multiLevelType w:val="multilevel"/>
+    <w:tmpl w:val="5C4EA08C"/>
+    <w:lvl w:ilvl="0">
+      <w:start w:val="1"/>
+      <w:numFmt w:val="decimal"/>
+      <w:lvlText w:val="%1."/>
+      <w:lvlJc w:val="left"/>
+      <w:pPr>
+        <w:ind w:left="740" w:hanging="360"/>
+      </w:pPr>
+      <w:rPr>
+        <w:u w:val="none"/>
+      </w:rPr>
+    </w:lvl>
+    <w:lvl w:ilvl="1">
+      <w:start w:val="1"/>
+      <w:numFmt w:val="lowerLetter"/>
+      <w:lvlText w:val="%2."/>
+      <w:lvlJc w:val="left"/>
+      <w:pPr>
+        <w:ind w:left="1460" w:hanging="360"/>
+      </w:pPr>
+      <w:rPr>
+        <w:u w:val="none"/>
+      </w:rPr>
+    </w:lvl>
+    <w:lvl w:ilvl="2">
+      <w:start w:val="1"/>
+      <w:numFmt w:val="lowerRoman"/>
+      <w:lvlText w:val="%3."/>
+      <w:lvlJc w:val="right"/>
+      <w:pPr>
+        <w:ind w:left="2180" w:hanging="360"/>
+      </w:pPr>
+      <w:rPr>
+        <w:u w:val="none"/>
+      </w:rPr>
+    </w:lvl>
+    <w:lvl w:ilvl="3">
+      <w:start w:val="1"/>
+      <w:numFmt w:val="decimal"/>
+      <w:lvlText w:val="%4."/>
+      <w:lvlJc w:val="left"/>
+      <w:pPr>
+        <w:ind w:left="2900" w:hanging="360"/>
+      </w:pPr>
+      <w:rPr>
+        <w:u w:val="none"/>
+      </w:rPr>
+    </w:lvl>
+    <w:lvl w:ilvl="4">
+      <w:start w:val="1"/>
+      <w:numFmt w:val="lowerLetter"/>
+      <w:lvlText w:val="%5."/>
+      <w:lvlJc w:val="left"/>
+      <w:pPr>
+        <w:ind w:left="3620" w:hanging="360"/>
+      </w:pPr>
+      <w:rPr>
+        <w:u w:val="none"/>
+      </w:rPr>
+    </w:lvl>
+    <w:lvl w:ilvl="5">
+      <w:start w:val="1"/>
+      <w:numFmt w:val="lowerRoman"/>
+      <w:lvlText w:val="%6."/>
+      <w:lvlJc w:val="right"/>
+      <w:pPr>
+        <w:ind w:left="4340" w:hanging="360"/>
+      </w:pPr>
+      <w:rPr>
+        <w:u w:val="none"/>
+      </w:rPr>
+    </w:lvl>
+    <w:lvl w:ilvl="6">
+      <w:start w:val="1"/>
+      <w:numFmt w:val="decimal"/>
+      <w:lvlText w:val="%7."/>
+      <w:lvlJc w:val="left"/>
+      <w:pPr>
+        <w:ind w:left="5060" w:hanging="360"/>
+      </w:pPr>
+      <w:rPr>
+        <w:u w:val="none"/>
+      </w:rPr>
+    </w:lvl>
+    <w:lvl w:ilvl="7">
+      <w:start w:val="1"/>
+      <w:numFmt w:val="lowerLetter"/>
+      <w:lvlText w:val="%8."/>
+      <w:lvlJc w:val="left"/>
+      <w:pPr>
+        <w:ind w:left="5780" w:hanging="360"/>
+      </w:pPr>
+      <w:rPr>
+        <w:u w:val="none"/>
+      </w:rPr>
+    </w:lvl>
+    <w:lvl w:ilvl="8">
+      <w:start w:val="1"/>
+      <w:numFmt w:val="lowerRoman"/>
+      <w:lvlText w:val="%9."/>
+      <w:lvlJc w:val="right"/>
+      <w:pPr>
+        <w:ind w:left="6500" w:hanging="360"/>
+      </w:pPr>
+      <w:rPr>
+        <w:u w:val="none"/>
+      </w:rPr>
+    </w:lvl>
+  </w:abstractNum>
+  <w:abstractNum w:abstractNumId="11" w15:restartNumberingAfterBreak="0">
     <w:nsid w:val="29C945CD"/>
     <w:multiLevelType w:val="multilevel"/>
     <w:tmpl w:val="1B608FA8"/>
@@ -3359,7 +1999,7 @@
       </w:rPr>
     </w:lvl>
   </w:abstractNum>
-  <w:abstractNum w:abstractNumId="9" w15:restartNumberingAfterBreak="0">
+  <w:abstractNum w:abstractNumId="12" w15:restartNumberingAfterBreak="0">
     <w:nsid w:val="2F4F206F"/>
     <w:multiLevelType w:val="multilevel"/>
     <w:tmpl w:val="0C88381E"/>
@@ -3472,7 +2112,7 @@
       </w:rPr>
     </w:lvl>
   </w:abstractNum>
-  <w:abstractNum w:abstractNumId="10" w15:restartNumberingAfterBreak="0">
+  <w:abstractNum w:abstractNumId="13" w15:restartNumberingAfterBreak="0">
     <w:nsid w:val="367742E0"/>
     <w:multiLevelType w:val="multilevel"/>
     <w:tmpl w:val="86086F46"/>
@@ -3585,7 +2225,7 @@
       </w:rPr>
     </w:lvl>
   </w:abstractNum>
-  <w:abstractNum w:abstractNumId="11" w15:restartNumberingAfterBreak="0">
+  <w:abstractNum w:abstractNumId="14" w15:restartNumberingAfterBreak="0">
     <w:nsid w:val="40B10259"/>
     <w:multiLevelType w:val="multilevel"/>
     <w:tmpl w:val="9D429992"/>
@@ -3701,7 +2341,7 @@
       </w:rPr>
     </w:lvl>
   </w:abstractNum>
-  <w:abstractNum w:abstractNumId="12" w15:restartNumberingAfterBreak="0">
+  <w:abstractNum w:abstractNumId="15" w15:restartNumberingAfterBreak="0">
     <w:nsid w:val="4E001E1C"/>
     <w:multiLevelType w:val="multilevel"/>
     <w:tmpl w:val="8EA60A92"/>
@@ -3817,7 +2457,120 @@
       </w:rPr>
     </w:lvl>
   </w:abstractNum>
-  <w:abstractNum w:abstractNumId="13" w15:restartNumberingAfterBreak="0">
+  <w:abstractNum w:abstractNumId="16" w15:restartNumberingAfterBreak="0">
+    <w:nsid w:val="4FB52813"/>
+    <w:multiLevelType w:val="multilevel"/>
+    <w:tmpl w:val="5C4EA08C"/>
+    <w:lvl w:ilvl="0">
+      <w:start w:val="1"/>
+      <w:numFmt w:val="decimal"/>
+      <w:lvlText w:val="%1."/>
+      <w:lvlJc w:val="left"/>
+      <w:pPr>
+        <w:ind w:left="740" w:hanging="360"/>
+      </w:pPr>
+      <w:rPr>
+        <w:u w:val="none"/>
+      </w:rPr>
+    </w:lvl>
+    <w:lvl w:ilvl="1">
+      <w:start w:val="1"/>
+      <w:numFmt w:val="lowerLetter"/>
+      <w:lvlText w:val="%2."/>
+      <w:lvlJc w:val="left"/>
+      <w:pPr>
+        <w:ind w:left="1460" w:hanging="360"/>
+      </w:pPr>
+      <w:rPr>
+        <w:u w:val="none"/>
+      </w:rPr>
+    </w:lvl>
+    <w:lvl w:ilvl="2">
+      <w:start w:val="1"/>
+      <w:numFmt w:val="lowerRoman"/>
+      <w:lvlText w:val="%3."/>
+      <w:lvlJc w:val="right"/>
+      <w:pPr>
+        <w:ind w:left="2180" w:hanging="360"/>
+      </w:pPr>
+      <w:rPr>
+        <w:u w:val="none"/>
+      </w:rPr>
+    </w:lvl>
+    <w:lvl w:ilvl="3">
+      <w:start w:val="1"/>
+      <w:numFmt w:val="decimal"/>
+      <w:lvlText w:val="%4."/>
+      <w:lvlJc w:val="left"/>
+      <w:pPr>
+        <w:ind w:left="2900" w:hanging="360"/>
+      </w:pPr>
+      <w:rPr>
+        <w:u w:val="none"/>
+      </w:rPr>
+    </w:lvl>
+    <w:lvl w:ilvl="4">
+      <w:start w:val="1"/>
+      <w:numFmt w:val="lowerLetter"/>
+      <w:lvlText w:val="%5."/>
+      <w:lvlJc w:val="left"/>
+      <w:pPr>
+        <w:ind w:left="3620" w:hanging="360"/>
+      </w:pPr>
+      <w:rPr>
+        <w:u w:val="none"/>
+      </w:rPr>
+    </w:lvl>
+    <w:lvl w:ilvl="5">
+      <w:start w:val="1"/>
+      <w:numFmt w:val="lowerRoman"/>
+      <w:lvlText w:val="%6."/>
+      <w:lvlJc w:val="right"/>
+      <w:pPr>
+        <w:ind w:left="4340" w:hanging="360"/>
+      </w:pPr>
+      <w:rPr>
+        <w:u w:val="none"/>
+      </w:rPr>
+    </w:lvl>
+    <w:lvl w:ilvl="6">
+      <w:start w:val="1"/>
+      <w:numFmt w:val="decimal"/>
+      <w:lvlText w:val="%7."/>
+      <w:lvlJc w:val="left"/>
+      <w:pPr>
+        <w:ind w:left="5060" w:hanging="360"/>
+      </w:pPr>
+      <w:rPr>
+        <w:u w:val="none"/>
+      </w:rPr>
+    </w:lvl>
+    <w:lvl w:ilvl="7">
+      <w:start w:val="1"/>
+      <w:numFmt w:val="lowerLetter"/>
+      <w:lvlText w:val="%8."/>
+      <w:lvlJc w:val="left"/>
+      <w:pPr>
+        <w:ind w:left="5780" w:hanging="360"/>
+      </w:pPr>
+      <w:rPr>
+        <w:u w:val="none"/>
+      </w:rPr>
+    </w:lvl>
+    <w:lvl w:ilvl="8">
+      <w:start w:val="1"/>
+      <w:numFmt w:val="lowerRoman"/>
+      <w:lvlText w:val="%9."/>
+      <w:lvlJc w:val="right"/>
+      <w:pPr>
+        <w:ind w:left="6500" w:hanging="360"/>
+      </w:pPr>
+      <w:rPr>
+        <w:u w:val="none"/>
+      </w:rPr>
+    </w:lvl>
+  </w:abstractNum>
+  <w:abstractNum w:abstractNumId="17" w15:restartNumberingAfterBreak="0">
     <w:nsid w:val="521F3E72"/>
     <w:multiLevelType w:val="multilevel"/>
     <w:tmpl w:val="BA7A5262"/>
@@ -3930,7 +2683,7 @@
       </w:rPr>
     </w:lvl>
   </w:abstractNum>
-  <w:abstractNum w:abstractNumId="14" w15:restartNumberingAfterBreak="0">
+  <w:abstractNum w:abstractNumId="18" w15:restartNumberingAfterBreak="0">
     <w:nsid w:val="581A2719"/>
     <w:multiLevelType w:val="multilevel"/>
     <w:tmpl w:val="5C4EA08C"/>
@@ -4043,7 +2796,7 @@
       </w:rPr>
     </w:lvl>
   </w:abstractNum>
-  <w:abstractNum w:abstractNumId="15" w15:restartNumberingAfterBreak="0">
+  <w:abstractNum w:abstractNumId="19" w15:restartNumberingAfterBreak="0">
     <w:nsid w:val="599031E6"/>
     <w:multiLevelType w:val="multilevel"/>
     <w:tmpl w:val="064CCBA2"/>
@@ -4159,7 +2912,7 @@
       </w:rPr>
     </w:lvl>
   </w:abstractNum>
-  <w:abstractNum w:abstractNumId="16" w15:restartNumberingAfterBreak="0">
+  <w:abstractNum w:abstractNumId="20" w15:restartNumberingAfterBreak="0">
     <w:nsid w:val="5DD1588E"/>
     <w:multiLevelType w:val="multilevel"/>
     <w:tmpl w:val="26BA343A"/>
@@ -4272,7 +3025,7 @@
       </w:rPr>
     </w:lvl>
   </w:abstractNum>
-  <w:abstractNum w:abstractNumId="17" w15:restartNumberingAfterBreak="0">
+  <w:abstractNum w:abstractNumId="21" w15:restartNumberingAfterBreak="0">
     <w:nsid w:val="62BE5493"/>
     <w:multiLevelType w:val="multilevel"/>
     <w:tmpl w:val="92C655FE"/>
@@ -4388,7 +3141,129 @@
       </w:rPr>
     </w:lvl>
   </w:abstractNum>
-  <w:abstractNum w:abstractNumId="18" w15:restartNumberingAfterBreak="0">
+  <w:abstractNum w:abstractNumId="22" w15:restartNumberingAfterBreak="0">
+    <w:nsid w:val="647410D8"/>
+    <w:multiLevelType w:val="multilevel"/>
+    <w:tmpl w:val="178010F2"/>
+    <w:lvl w:ilvl="0">
+      <w:start w:val="4"/>
+      <w:numFmt w:val="decimal"/>
+      <w:lvlText w:val="%1.1"/>
+      <w:lvlJc w:val="left"/>
+      <w:pPr>
+        <w:ind w:left="360" w:hanging="360"/>
+      </w:pPr>
+      <w:rPr>
+        <w:rFonts w:hint="default"/>
+        <w:u w:val="none"/>
+      </w:rPr>
+    </w:lvl>
+    <w:lvl w:ilvl="1">
+      <w:start w:val="1"/>
+      <w:numFmt w:val="lowerLetter"/>
+      <w:lvlText w:val="%2.1"/>
+      <w:lvlJc w:val="left"/>
+      <w:pPr>
+        <w:ind w:left="1080" w:hanging="360"/>
+      </w:pPr>
+      <w:rPr>
+        <w:rFonts w:hint="default"/>
+        <w:u w:val="none"/>
+      </w:rPr>
+    </w:lvl>
+    <w:lvl w:ilvl="2">
+      <w:start w:val="1"/>
+      <w:numFmt w:val="lowerRoman"/>
+      <w:lvlText w:val="%3.1"/>
+      <w:lvlJc w:val="right"/>
+      <w:pPr>
+        <w:ind w:left="1800" w:hanging="360"/>
+      </w:pPr>
+      <w:rPr>
+        <w:rFonts w:hint="default"/>
+        <w:u w:val="none"/>
+      </w:rPr>
+    </w:lvl>
+    <w:lvl w:ilvl="3">
+      <w:start w:val="1"/>
+      <w:numFmt w:val="decimal"/>
+      <w:lvlText w:val="%4.1"/>
+      <w:lvlJc w:val="left"/>
+      <w:pPr>
+        <w:ind w:left="2520" w:hanging="360"/>
+      </w:pPr>
+      <w:rPr>
+        <w:rFonts w:hint="default"/>
+        <w:u w:val="none"/>
+      </w:rPr>
+    </w:lvl>
+    <w:lvl w:ilvl="4">
+      <w:start w:val="1"/>
+      <w:numFmt w:val="lowerLetter"/>
+      <w:lvlText w:val="%5.1"/>
+      <w:lvlJc w:val="left"/>
+      <w:pPr>
+        <w:ind w:left="3240" w:hanging="360"/>
+      </w:pPr>
+      <w:rPr>
+        <w:rFonts w:hint="default"/>
+        <w:u w:val="none"/>
+      </w:rPr>
+    </w:lvl>
+    <w:lvl w:ilvl="5">
+      <w:start w:val="1"/>
+      <w:numFmt w:val="lowerRoman"/>
+      <w:lvlText w:val="%6.1"/>
+      <w:lvlJc w:val="right"/>
+      <w:pPr>
+        <w:ind w:left="3960" w:hanging="360"/>
+      </w:pPr>
+      <w:rPr>
+        <w:rFonts w:hint="default"/>
+        <w:u w:val="none"/>
+      </w:rPr>
+    </w:lvl>
+    <w:lvl w:ilvl="6">
+      <w:start w:val="1"/>
+      <w:numFmt w:val="decimal"/>
+      <w:lvlText w:val="%7.1"/>
+      <w:lvlJc w:val="left"/>
+      <w:pPr>
+        <w:ind w:left="4680" w:hanging="360"/>
+      </w:pPr>
+      <w:rPr>
+        <w:rFonts w:hint="default"/>
+        <w:u w:val="none"/>
+      </w:rPr>
+    </w:lvl>
+    <w:lvl w:ilvl="7">
+      <w:start w:val="1"/>
+      <w:numFmt w:val="lowerLetter"/>
+      <w:lvlText w:val="%8.1"/>
+      <w:lvlJc w:val="left"/>
+      <w:pPr>
+        <w:ind w:left="5400" w:hanging="360"/>
+      </w:pPr>
+      <w:rPr>
+        <w:rFonts w:hint="default"/>
+        <w:u w:val="none"/>
+      </w:rPr>
+    </w:lvl>
+    <w:lvl w:ilvl="8">
+      <w:start w:val="1"/>
+      <w:numFmt w:val="lowerRoman"/>
+      <w:lvlText w:val="%9.1"/>
+      <w:lvlJc w:val="right"/>
+      <w:pPr>
+        <w:ind w:left="6120" w:hanging="360"/>
+      </w:pPr>
+      <w:rPr>
+        <w:rFonts w:hint="default"/>
+        <w:u w:val="none"/>
+      </w:rPr>
+    </w:lvl>
+  </w:abstractNum>
+  <w:abstractNum w:abstractNumId="23" w15:restartNumberingAfterBreak="0">
     <w:nsid w:val="65497669"/>
     <w:multiLevelType w:val="multilevel"/>
     <w:tmpl w:val="F8904A20"/>
@@ -4501,7 +3376,129 @@
       </w:rPr>
     </w:lvl>
   </w:abstractNum>
-  <w:abstractNum w:abstractNumId="19" w15:restartNumberingAfterBreak="0">
+  <w:abstractNum w:abstractNumId="24" w15:restartNumberingAfterBreak="0">
+    <w:nsid w:val="68B64D7B"/>
+    <w:multiLevelType w:val="multilevel"/>
+    <w:tmpl w:val="2CBA46C6"/>
+    <w:lvl w:ilvl="0">
+      <w:start w:val="5"/>
+      <w:numFmt w:val="decimal"/>
+      <w:lvlText w:val="%1."/>
+      <w:lvlJc w:val="left"/>
+      <w:pPr>
+        <w:ind w:left="740" w:hanging="360"/>
+      </w:pPr>
+      <w:rPr>
+        <w:rFonts w:hint="default"/>
+        <w:u w:val="none"/>
+      </w:rPr>
+    </w:lvl>
+    <w:lvl w:ilvl="1">
+      <w:start w:val="1"/>
+      <w:numFmt w:val="lowerLetter"/>
+      <w:lvlText w:val="%2."/>
+      <w:lvlJc w:val="left"/>
+      <w:pPr>
+        <w:ind w:left="1460" w:hanging="360"/>
+      </w:pPr>
+      <w:rPr>
+        <w:rFonts w:hint="default"/>
+        <w:u w:val="none"/>
+      </w:rPr>
+    </w:lvl>
+    <w:lvl w:ilvl="2">
+      <w:start w:val="1"/>
+      <w:numFmt w:val="lowerRoman"/>
+      <w:lvlText w:val="%3."/>
+      <w:lvlJc w:val="right"/>
+      <w:pPr>
+        <w:ind w:left="2180" w:hanging="360"/>
+      </w:pPr>
+      <w:rPr>
+        <w:rFonts w:hint="default"/>
+        <w:u w:val="none"/>
+      </w:rPr>
+    </w:lvl>
+    <w:lvl w:ilvl="3">
+      <w:start w:val="1"/>
+      <w:numFmt w:val="decimal"/>
+      <w:lvlText w:val="%4."/>
+      <w:lvlJc w:val="left"/>
+      <w:pPr>
+        <w:ind w:left="2900" w:hanging="360"/>
+      </w:pPr>
+      <w:rPr>
+        <w:rFonts w:hint="default"/>
+        <w:u w:val="none"/>
+      </w:rPr>
+    </w:lvl>
+    <w:lvl w:ilvl="4">
+      <w:start w:val="1"/>
+      <w:numFmt w:val="lowerLetter"/>
+      <w:lvlText w:val="%5."/>
+      <w:lvlJc w:val="left"/>
+      <w:pPr>
+        <w:ind w:left="3620" w:hanging="360"/>
+      </w:pPr>
+      <w:rPr>
+        <w:rFonts w:hint="default"/>
+        <w:u w:val="none"/>
+      </w:rPr>
+    </w:lvl>
+    <w:lvl w:ilvl="5">
+      <w:start w:val="1"/>
+      <w:numFmt w:val="lowerRoman"/>
+      <w:lvlText w:val="%6."/>
+      <w:lvlJc w:val="right"/>
+      <w:pPr>
+        <w:ind w:left="4340" w:hanging="360"/>
+      </w:pPr>
+      <w:rPr>
+        <w:rFonts w:hint="default"/>
+        <w:u w:val="none"/>
+      </w:rPr>
+    </w:lvl>
+    <w:lvl w:ilvl="6">
+      <w:start w:val="1"/>
+      <w:numFmt w:val="decimal"/>
+      <w:lvlText w:val="%7."/>
+      <w:lvlJc w:val="left"/>
+      <w:pPr>
+        <w:ind w:left="5060" w:hanging="360"/>
+      </w:pPr>
+      <w:rPr>
+        <w:rFonts w:hint="default"/>
+        <w:u w:val="none"/>
+      </w:rPr>
+    </w:lvl>
+    <w:lvl w:ilvl="7">
+      <w:start w:val="1"/>
+      <w:numFmt w:val="lowerLetter"/>
+      <w:lvlText w:val="%8."/>
+      <w:lvlJc w:val="left"/>
+      <w:pPr>
+        <w:ind w:left="5780" w:hanging="360"/>
+      </w:pPr>
+      <w:rPr>
+        <w:rFonts w:hint="default"/>
+        <w:u w:val="none"/>
+      </w:rPr>
+    </w:lvl>
+    <w:lvl w:ilvl="8">
+      <w:start w:val="1"/>
+      <w:numFmt w:val="lowerRoman"/>
+      <w:lvlText w:val="%9."/>
+      <w:lvlJc w:val="right"/>
+      <w:pPr>
+        <w:ind w:left="6500" w:hanging="360"/>
+      </w:pPr>
+      <w:rPr>
+        <w:rFonts w:hint="default"/>
+        <w:u w:val="none"/>
+      </w:rPr>
+    </w:lvl>
+  </w:abstractNum>
+  <w:abstractNum w:abstractNumId="25" w15:restartNumberingAfterBreak="0">
     <w:nsid w:val="6AF4727F"/>
     <w:multiLevelType w:val="multilevel"/>
     <w:tmpl w:val="8DEAB65C"/>
@@ -4617,7 +3614,7 @@
       </w:rPr>
     </w:lvl>
   </w:abstractNum>
-  <w:abstractNum w:abstractNumId="20" w15:restartNumberingAfterBreak="0">
+  <w:abstractNum w:abstractNumId="26" w15:restartNumberingAfterBreak="0">
     <w:nsid w:val="6BF27891"/>
     <w:multiLevelType w:val="multilevel"/>
     <w:tmpl w:val="4D94A9DC"/>
@@ -4733,7 +3730,7 @@
       </w:rPr>
     </w:lvl>
   </w:abstractNum>
-  <w:abstractNum w:abstractNumId="21" w15:restartNumberingAfterBreak="0">
+  <w:abstractNum w:abstractNumId="27" w15:restartNumberingAfterBreak="0">
     <w:nsid w:val="732F29B8"/>
     <w:multiLevelType w:val="multilevel"/>
     <w:tmpl w:val="758C1FA2"/>
@@ -4849,7 +3846,7 @@
       </w:rPr>
     </w:lvl>
   </w:abstractNum>
-  <w:abstractNum w:abstractNumId="22" w15:restartNumberingAfterBreak="0">
+  <w:abstractNum w:abstractNumId="28" w15:restartNumberingAfterBreak="0">
     <w:nsid w:val="767E1F28"/>
     <w:multiLevelType w:val="multilevel"/>
     <w:tmpl w:val="E940EE40"/>
@@ -4965,7 +3962,7 @@
       </w:rPr>
     </w:lvl>
   </w:abstractNum>
-  <w:abstractNum w:abstractNumId="23" w15:restartNumberingAfterBreak="0">
+  <w:abstractNum w:abstractNumId="29" w15:restartNumberingAfterBreak="0">
     <w:nsid w:val="7DD76EA1"/>
     <w:multiLevelType w:val="multilevel"/>
     <w:tmpl w:val="CC162778"/>
@@ -5082,76 +4079,94 @@
     </w:lvl>
   </w:abstractNum>
   <w:num w:numId="1" w16cid:durableId="1954285802">
-    <w:abstractNumId w:val="6"/>
+    <w:abstractNumId w:val="8"/>
   </w:num>
   <w:num w:numId="2" w16cid:durableId="1865552330">
-    <w:abstractNumId w:val="12"/>
+    <w:abstractNumId w:val="15"/>
   </w:num>
   <w:num w:numId="3" w16cid:durableId="91360664">
-    <w:abstractNumId w:val="23"/>
+    <w:abstractNumId w:val="29"/>
   </w:num>
   <w:num w:numId="4" w16cid:durableId="2037584998">
-    <w:abstractNumId w:val="8"/>
+    <w:abstractNumId w:val="11"/>
   </w:num>
   <w:num w:numId="5" w16cid:durableId="804928646">
-    <w:abstractNumId w:val="4"/>
+    <w:abstractNumId w:val="5"/>
   </w:num>
   <w:num w:numId="6" w16cid:durableId="193272748">
     <w:abstractNumId w:val="0"/>
   </w:num>
   <w:num w:numId="7" w16cid:durableId="1002850815">
-    <w:abstractNumId w:val="7"/>
+    <w:abstractNumId w:val="9"/>
   </w:num>
   <w:num w:numId="8" w16cid:durableId="207883238">
-    <w:abstractNumId w:val="19"/>
+    <w:abstractNumId w:val="25"/>
   </w:num>
   <w:num w:numId="9" w16cid:durableId="176240538">
-    <w:abstractNumId w:val="16"/>
+    <w:abstractNumId w:val="20"/>
   </w:num>
   <w:num w:numId="10" w16cid:durableId="2052606034">
+    <w:abstractNumId w:val="23"/>
+  </w:num>
+  <w:num w:numId="11" w16cid:durableId="1701515058">
     <w:abstractNumId w:val="18"/>
   </w:num>
-  <w:num w:numId="11" w16cid:durableId="1701515058">
-    <w:abstractNumId w:val="14"/>
-  </w:num>
   <w:num w:numId="12" w16cid:durableId="48313096">
-    <w:abstractNumId w:val="10"/>
+    <w:abstractNumId w:val="13"/>
   </w:num>
   <w:num w:numId="13" w16cid:durableId="37097688">
     <w:abstractNumId w:val="2"/>
   </w:num>
   <w:num w:numId="14" w16cid:durableId="839346070">
-    <w:abstractNumId w:val="11"/>
+    <w:abstractNumId w:val="14"/>
   </w:num>
   <w:num w:numId="15" w16cid:durableId="1256092310">
     <w:abstractNumId w:val="3"/>
   </w:num>
   <w:num w:numId="16" w16cid:durableId="2146655569">
-    <w:abstractNumId w:val="20"/>
+    <w:abstractNumId w:val="26"/>
   </w:num>
   <w:num w:numId="17" w16cid:durableId="969287393">
-    <w:abstractNumId w:val="15"/>
+    <w:abstractNumId w:val="19"/>
   </w:num>
   <w:num w:numId="18" w16cid:durableId="1377121269">
+    <w:abstractNumId w:val="21"/>
+  </w:num>
+  <w:num w:numId="19" w16cid:durableId="1043091186">
+    <w:abstractNumId w:val="7"/>
+  </w:num>
+  <w:num w:numId="20" w16cid:durableId="54135274">
     <w:abstractNumId w:val="17"/>
   </w:num>
-  <w:num w:numId="19" w16cid:durableId="1043091186">
-    <w:abstractNumId w:val="5"/>
-  </w:num>
-  <w:num w:numId="20" w16cid:durableId="54135274">
-    <w:abstractNumId w:val="13"/>
-  </w:num>
   <w:num w:numId="21" w16cid:durableId="2037193785">
-    <w:abstractNumId w:val="9"/>
+    <w:abstractNumId w:val="12"/>
   </w:num>
   <w:num w:numId="22" w16cid:durableId="1407190391">
     <w:abstractNumId w:val="1"/>
   </w:num>
   <w:num w:numId="23" w16cid:durableId="1673727312">
-    <w:abstractNumId w:val="21"/>
+    <w:abstractNumId w:val="27"/>
   </w:num>
   <w:num w:numId="24" w16cid:durableId="581069680">
+    <w:abstractNumId w:val="28"/>
+  </w:num>
+  <w:num w:numId="25" w16cid:durableId="465467047">
+    <w:abstractNumId w:val="16"/>
+  </w:num>
+  <w:num w:numId="26" w16cid:durableId="667831141">
+    <w:abstractNumId w:val="6"/>
+  </w:num>
+  <w:num w:numId="27" w16cid:durableId="78142491">
+    <w:abstractNumId w:val="10"/>
+  </w:num>
+  <w:num w:numId="28" w16cid:durableId="201597529">
+    <w:abstractNumId w:val="24"/>
+  </w:num>
+  <w:num w:numId="29" w16cid:durableId="1178808885">
     <w:abstractNumId w:val="22"/>
+  </w:num>
+  <w:num w:numId="30" w16cid:durableId="541668872">
+    <w:abstractNumId w:val="4"/>
   </w:num>
 </w:numbering>
 </file>

</xml_diff>

<commit_message>
docs: upload remaining documents
</commit_message>
<xml_diff>
--- a/docs/engenharia-software-2/casos_de_uso/Caso de uso - Login.docx
+++ b/docs/engenharia-software-2/casos_de_uso/Caso de uso - Login.docx
@@ -1,6 +1,6 @@
 
 <file path=word/document.xml><?xml version="1.0" encoding="utf-8"?>
-<w:document xmlns:wpc="http://schemas.microsoft.com/office/word/2010/wordprocessingCanvas" xmlns:cx="http://schemas.microsoft.com/office/drawing/2014/chartex" xmlns:cx1="http://schemas.microsoft.com/office/drawing/2015/9/8/chartex" xmlns:cx2="http://schemas.microsoft.com/office/drawing/2015/10/21/chartex" xmlns:cx3="http://schemas.microsoft.com/office/drawing/2016/5/9/chartex" xmlns:cx4="http://schemas.microsoft.com/office/drawing/2016/5/10/chartex" xmlns:cx5="http://schemas.microsoft.com/office/drawing/2016/5/11/chartex" xmlns:cx6="http://schemas.microsoft.com/office/drawing/2016/5/12/chartex" xmlns:cx7="http://schemas.microsoft.com/office/drawing/2016/5/13/chartex" xmlns:cx8="http://schemas.microsoft.com/office/drawing/2016/5/14/chartex" xmlns:mc="http://schemas.openxmlformats.org/markup-compatibility/2006" xmlns:aink="http://schemas.microsoft.com/office/drawing/2016/ink" xmlns:am3d="http://schemas.microsoft.com/office/drawing/2017/model3d" xmlns:o="urn:schemas-microsoft-com:office:office" xmlns:oel="http://schemas.microsoft.com/office/2019/extlst" xmlns:r="http://schemas.openxmlformats.org/officeDocument/2006/relationships" xmlns:m="http://schemas.openxmlformats.org/officeDocument/2006/math" xmlns:v="urn:schemas-microsoft-com:vml" xmlns:wp14="http://schemas.microsoft.com/office/word/2010/wordprocessingDrawing" xmlns:wp="http://schemas.openxmlformats.org/drawingml/2006/wordprocessingDrawing" xmlns:w10="urn:schemas-microsoft-com:office:word" xmlns:w="http://schemas.openxmlformats.org/wordprocessingml/2006/main" xmlns:w14="http://schemas.microsoft.com/office/word/2010/wordml" xmlns:w15="http://schemas.microsoft.com/office/word/2012/wordml" xmlns:w16cex="http://schemas.microsoft.com/office/word/2018/wordml/cex" xmlns:w16cid="http://schemas.microsoft.com/office/word/2016/wordml/cid" xmlns:w16="http://schemas.microsoft.com/office/word/2018/wordml" xmlns:w16du="http://schemas.microsoft.com/office/word/2023/wordml/word16du" xmlns:w16sdtdh="http://schemas.microsoft.com/office/word/2020/wordml/sdtdatahash" xmlns:w16sdtfl="http://schemas.microsoft.com/office/word/2024/wordml/sdtformatlock" xmlns:w16se="http://schemas.microsoft.com/office/word/2015/wordml/symex" xmlns:wpg="http://schemas.microsoft.com/office/word/2010/wordprocessingGroup" xmlns:wpi="http://schemas.microsoft.com/office/word/2010/wordprocessingInk" xmlns:wne="http://schemas.microsoft.com/office/word/2006/wordml" xmlns:wps="http://schemas.microsoft.com/office/word/2010/wordprocessingShape" mc:Ignorable="w14 w15 w16se w16cid w16 w16cex w16sdtdh w16sdtfl w16du wp14">
+<w:document xmlns:wpc="http://schemas.microsoft.com/office/word/2010/wordprocessingCanvas" xmlns:mc="http://schemas.openxmlformats.org/markup-compatibility/2006" xmlns:o="urn:schemas-microsoft-com:office:office" xmlns:r="http://schemas.openxmlformats.org/officeDocument/2006/relationships" xmlns:m="http://schemas.openxmlformats.org/officeDocument/2006/math" xmlns:v="urn:schemas-microsoft-com:vml" xmlns:wp14="http://schemas.microsoft.com/office/word/2010/wordprocessingDrawing" xmlns:wp="http://schemas.openxmlformats.org/drawingml/2006/wordprocessingDrawing" xmlns:w10="urn:schemas-microsoft-com:office:word" xmlns:w="http://schemas.openxmlformats.org/wordprocessingml/2006/main" xmlns:w14="http://schemas.microsoft.com/office/word/2010/wordml" xmlns:w15="http://schemas.microsoft.com/office/word/2012/wordml" xmlns:wpg="http://schemas.microsoft.com/office/word/2010/wordprocessingGroup" xmlns:wpi="http://schemas.microsoft.com/office/word/2010/wordprocessingInk" xmlns:wne="http://schemas.microsoft.com/office/word/2006/wordml" xmlns:wps="http://schemas.microsoft.com/office/word/2010/wordprocessingShape" mc:Ignorable="w14 w15 wp14">
   <w:body>
     <w:p>
       <w:pPr>
@@ -77,6 +77,30 @@
     </w:p>
     <w:p>
       <w:pPr>
+        <w:pStyle w:val="PargrafodaLista"/>
+        <w:numPr>
+          <w:ilvl w:val="0"/>
+          <w:numId w:val="25"/>
+        </w:numPr>
+        <w:ind w:right="-324"/>
+        <w:jc w:val="both"/>
+        <w:rPr>
+          <w:rFonts w:ascii="Courier New" w:eastAsia="Courier New" w:hAnsi="Courier New" w:cs="Courier New"/>
+          <w:b/>
+          <w:bCs/>
+        </w:rPr>
+      </w:pPr>
+      <w:r>
+        <w:rPr>
+          <w:rFonts w:ascii="Courier New" w:eastAsia="Courier New" w:hAnsi="Courier New" w:cs="Courier New"/>
+          <w:b/>
+          <w:bCs/>
+        </w:rPr>
+        <w:t>Usuário preenche suas informações na caixa de texto;</w:t>
+      </w:r>
+    </w:p>
+    <w:p>
+      <w:pPr>
         <w:numPr>
           <w:ilvl w:val="0"/>
           <w:numId w:val="11"/>
@@ -112,6 +136,30 @@
     </w:p>
     <w:p>
       <w:pPr>
+        <w:pStyle w:val="PargrafodaLista"/>
+        <w:numPr>
+          <w:ilvl w:val="0"/>
+          <w:numId w:val="25"/>
+        </w:numPr>
+        <w:ind w:right="-324"/>
+        <w:jc w:val="both"/>
+        <w:rPr>
+          <w:rFonts w:ascii="Courier New" w:eastAsia="Courier New" w:hAnsi="Courier New" w:cs="Courier New"/>
+          <w:b/>
+          <w:bCs/>
+        </w:rPr>
+      </w:pPr>
+      <w:r>
+        <w:rPr>
+          <w:rFonts w:ascii="Courier New" w:eastAsia="Courier New" w:hAnsi="Courier New" w:cs="Courier New"/>
+          <w:b/>
+          <w:bCs/>
+        </w:rPr>
+        <w:t>Usuário pressiona o botão “ENTRAR”;</w:t>
+      </w:r>
+    </w:p>
+    <w:p>
+      <w:pPr>
         <w:numPr>
           <w:ilvl w:val="0"/>
           <w:numId w:val="11"/>
@@ -166,6 +214,36 @@
         </w:rPr>
         <w:t>); para validar as informações inseridas pelo usuário;</w:t>
       </w:r>
+      <w:r>
+        <w:rPr>
+          <w:rFonts w:ascii="Courier New" w:eastAsia="Courier New" w:hAnsi="Courier New" w:cs="Courier New"/>
+        </w:rPr>
+        <w:t xml:space="preserve"> </w:t>
+      </w:r>
+    </w:p>
+    <w:p>
+      <w:pPr>
+        <w:pStyle w:val="PargrafodaLista"/>
+        <w:numPr>
+          <w:ilvl w:val="0"/>
+          <w:numId w:val="25"/>
+        </w:numPr>
+        <w:ind w:right="-324"/>
+        <w:jc w:val="both"/>
+        <w:rPr>
+          <w:rFonts w:ascii="Courier New" w:eastAsia="Courier New" w:hAnsi="Courier New" w:cs="Courier New"/>
+          <w:b/>
+          <w:bCs/>
+        </w:rPr>
+      </w:pPr>
+      <w:r>
+        <w:rPr>
+          <w:rFonts w:ascii="Courier New" w:eastAsia="Courier New" w:hAnsi="Courier New" w:cs="Courier New"/>
+          <w:b/>
+          <w:bCs/>
+        </w:rPr>
+        <w:t>Sistema valida as informações inseridas pelo usuário;</w:t>
+      </w:r>
     </w:p>
     <w:p>
       <w:pPr>
@@ -219,23 +297,87 @@
         <w:rPr>
           <w:rFonts w:ascii="Courier New" w:eastAsia="Courier New" w:hAnsi="Courier New" w:cs="Courier New"/>
         </w:rPr>
-        <w:t xml:space="preserve">); para enviar as informações de login inseridas para </w:t>
-      </w:r>
-      <w:proofErr w:type="gramStart"/>
-      <w:r>
-        <w:rPr>
-          <w:rFonts w:ascii="Courier New" w:eastAsia="Courier New" w:hAnsi="Courier New" w:cs="Courier New"/>
-        </w:rPr>
-        <w:t>Login(</w:t>
-      </w:r>
-      <w:proofErr w:type="gramEnd"/>
-      <w:r>
-        <w:rPr>
-          <w:rFonts w:ascii="Courier New" w:eastAsia="Courier New" w:hAnsi="Courier New" w:cs="Courier New"/>
-        </w:rPr>
-        <w:t>Model);</w:t>
+        <w:t xml:space="preserve">); para enviar as informações de </w:t>
+      </w:r>
+      <w:proofErr w:type="spellStart"/>
+      <w:r>
+        <w:rPr>
+          <w:rFonts w:ascii="Courier New" w:eastAsia="Courier New" w:hAnsi="Courier New" w:cs="Courier New"/>
+        </w:rPr>
+        <w:t>login</w:t>
+      </w:r>
+      <w:proofErr w:type="spellEnd"/>
+      <w:r>
+        <w:rPr>
+          <w:rFonts w:ascii="Courier New" w:eastAsia="Courier New" w:hAnsi="Courier New" w:cs="Courier New"/>
+        </w:rPr>
+        <w:t xml:space="preserve"> inseridas para </w:t>
+      </w:r>
+      <w:proofErr w:type="spellStart"/>
+      <w:r>
+        <w:rPr>
+          <w:rFonts w:ascii="Courier New" w:eastAsia="Courier New" w:hAnsi="Courier New" w:cs="Courier New"/>
+        </w:rPr>
+        <w:t>Login</w:t>
+      </w:r>
+      <w:proofErr w:type="spellEnd"/>
+      <w:r>
+        <w:rPr>
+          <w:rFonts w:ascii="Courier New" w:eastAsia="Courier New" w:hAnsi="Courier New" w:cs="Courier New"/>
+        </w:rPr>
+        <w:t>(</w:t>
+      </w:r>
+      <w:proofErr w:type="spellStart"/>
+      <w:r>
+        <w:rPr>
+          <w:rFonts w:ascii="Courier New" w:eastAsia="Courier New" w:hAnsi="Courier New" w:cs="Courier New"/>
+        </w:rPr>
+        <w:t>Model</w:t>
+      </w:r>
+      <w:proofErr w:type="spellEnd"/>
+      <w:r>
+        <w:rPr>
+          <w:rFonts w:ascii="Courier New" w:eastAsia="Courier New" w:hAnsi="Courier New" w:cs="Courier New"/>
+        </w:rPr>
+        <w:t>);</w:t>
       </w:r>
     </w:p>
+    <w:p>
+      <w:pPr>
+        <w:pStyle w:val="PargrafodaLista"/>
+        <w:numPr>
+          <w:ilvl w:val="0"/>
+          <w:numId w:val="25"/>
+        </w:numPr>
+        <w:ind w:right="-324"/>
+        <w:jc w:val="both"/>
+        <w:rPr>
+          <w:rFonts w:ascii="Courier New" w:eastAsia="Courier New" w:hAnsi="Courier New" w:cs="Courier New"/>
+        </w:rPr>
+      </w:pPr>
+      <w:bookmarkStart w:id="1" w:name="_GoBack"/>
+      <w:r>
+        <w:rPr>
+          <w:rFonts w:ascii="Courier New" w:eastAsia="Courier New" w:hAnsi="Courier New" w:cs="Courier New"/>
+        </w:rPr>
+        <w:t xml:space="preserve">Sistema envia </w:t>
+      </w:r>
+      <w:proofErr w:type="spellStart"/>
+      <w:r>
+        <w:rPr>
+          <w:rFonts w:ascii="Courier New" w:eastAsia="Courier New" w:hAnsi="Courier New" w:cs="Courier New"/>
+        </w:rPr>
+        <w:t>login</w:t>
+      </w:r>
+      <w:proofErr w:type="spellEnd"/>
+      <w:r>
+        <w:rPr>
+          <w:rFonts w:ascii="Courier New" w:eastAsia="Courier New" w:hAnsi="Courier New" w:cs="Courier New"/>
+        </w:rPr>
+        <w:t xml:space="preserve"> </w:t>
+      </w:r>
+    </w:p>
+    <w:bookmarkEnd w:id="1"/>
     <w:p>
       <w:pPr>
         <w:numPr>
@@ -250,19 +392,33 @@
           <w:bCs/>
         </w:rPr>
       </w:pPr>
-      <w:proofErr w:type="gramStart"/>
-      <w:r>
-        <w:rPr>
-          <w:rFonts w:ascii="Courier New" w:eastAsia="Courier New" w:hAnsi="Courier New" w:cs="Courier New"/>
-        </w:rPr>
-        <w:t>Login(</w:t>
-      </w:r>
-      <w:proofErr w:type="gramEnd"/>
-      <w:r>
-        <w:rPr>
-          <w:rFonts w:ascii="Courier New" w:eastAsia="Courier New" w:hAnsi="Courier New" w:cs="Courier New"/>
-        </w:rPr>
-        <w:t xml:space="preserve">Model) chama </w:t>
+      <w:proofErr w:type="spellStart"/>
+      <w:r>
+        <w:rPr>
+          <w:rFonts w:ascii="Courier New" w:eastAsia="Courier New" w:hAnsi="Courier New" w:cs="Courier New"/>
+        </w:rPr>
+        <w:t>Login</w:t>
+      </w:r>
+      <w:proofErr w:type="spellEnd"/>
+      <w:r>
+        <w:rPr>
+          <w:rFonts w:ascii="Courier New" w:eastAsia="Courier New" w:hAnsi="Courier New" w:cs="Courier New"/>
+        </w:rPr>
+        <w:t>(</w:t>
+      </w:r>
+      <w:proofErr w:type="spellStart"/>
+      <w:r>
+        <w:rPr>
+          <w:rFonts w:ascii="Courier New" w:eastAsia="Courier New" w:hAnsi="Courier New" w:cs="Courier New"/>
+        </w:rPr>
+        <w:t>Model</w:t>
+      </w:r>
+      <w:proofErr w:type="spellEnd"/>
+      <w:r>
+        <w:rPr>
+          <w:rFonts w:ascii="Courier New" w:eastAsia="Courier New" w:hAnsi="Courier New" w:cs="Courier New"/>
+        </w:rPr>
+        <w:t xml:space="preserve">) chama </w:t>
       </w:r>
       <w:proofErr w:type="spellStart"/>
       <w:r>
@@ -307,19 +463,33 @@
           <w:bCs/>
         </w:rPr>
       </w:pPr>
-      <w:proofErr w:type="gramStart"/>
-      <w:r>
-        <w:rPr>
-          <w:rFonts w:ascii="Courier New" w:eastAsia="Courier New" w:hAnsi="Courier New" w:cs="Courier New"/>
-        </w:rPr>
-        <w:t>Login(</w:t>
-      </w:r>
-      <w:proofErr w:type="gramEnd"/>
-      <w:r>
-        <w:rPr>
-          <w:rFonts w:ascii="Courier New" w:eastAsia="Courier New" w:hAnsi="Courier New" w:cs="Courier New"/>
-        </w:rPr>
-        <w:t xml:space="preserve">Model) chama </w:t>
+      <w:proofErr w:type="spellStart"/>
+      <w:r>
+        <w:rPr>
+          <w:rFonts w:ascii="Courier New" w:eastAsia="Courier New" w:hAnsi="Courier New" w:cs="Courier New"/>
+        </w:rPr>
+        <w:t>Login</w:t>
+      </w:r>
+      <w:proofErr w:type="spellEnd"/>
+      <w:r>
+        <w:rPr>
+          <w:rFonts w:ascii="Courier New" w:eastAsia="Courier New" w:hAnsi="Courier New" w:cs="Courier New"/>
+        </w:rPr>
+        <w:t>(</w:t>
+      </w:r>
+      <w:proofErr w:type="spellStart"/>
+      <w:r>
+        <w:rPr>
+          <w:rFonts w:ascii="Courier New" w:eastAsia="Courier New" w:hAnsi="Courier New" w:cs="Courier New"/>
+        </w:rPr>
+        <w:t>Model</w:t>
+      </w:r>
+      <w:proofErr w:type="spellEnd"/>
+      <w:r>
+        <w:rPr>
+          <w:rFonts w:ascii="Courier New" w:eastAsia="Courier New" w:hAnsi="Courier New" w:cs="Courier New"/>
+        </w:rPr>
+        <w:t xml:space="preserve">) chama </w:t>
       </w:r>
       <w:proofErr w:type="spellStart"/>
       <w:r>
@@ -347,7 +517,21 @@
         <w:rPr>
           <w:rFonts w:ascii="Courier New" w:eastAsia="Courier New" w:hAnsi="Courier New" w:cs="Courier New"/>
         </w:rPr>
-        <w:t>); para sanitizar as informações inseridas pelo Usuário;</w:t>
+        <w:t xml:space="preserve">); para </w:t>
+      </w:r>
+      <w:proofErr w:type="spellStart"/>
+      <w:r>
+        <w:rPr>
+          <w:rFonts w:ascii="Courier New" w:eastAsia="Courier New" w:hAnsi="Courier New" w:cs="Courier New"/>
+        </w:rPr>
+        <w:t>sanitizar</w:t>
+      </w:r>
+      <w:proofErr w:type="spellEnd"/>
+      <w:r>
+        <w:rPr>
+          <w:rFonts w:ascii="Courier New" w:eastAsia="Courier New" w:hAnsi="Courier New" w:cs="Courier New"/>
+        </w:rPr>
+        <w:t xml:space="preserve"> as informações inseridas pelo Usuário;</w:t>
       </w:r>
     </w:p>
     <w:p>
@@ -447,21 +631,7 @@
         <w:rPr>
           <w:rFonts w:ascii="Courier New" w:eastAsia="Courier New" w:hAnsi="Courier New" w:cs="Courier New"/>
         </w:rPr>
-        <w:t xml:space="preserve"> de aprovado para </w:t>
-      </w:r>
-      <w:proofErr w:type="gramStart"/>
-      <w:r>
-        <w:rPr>
-          <w:rFonts w:ascii="Courier New" w:eastAsia="Courier New" w:hAnsi="Courier New" w:cs="Courier New"/>
-        </w:rPr>
-        <w:t>Login(</w:t>
-      </w:r>
-      <w:proofErr w:type="gramEnd"/>
-      <w:r>
-        <w:rPr>
-          <w:rFonts w:ascii="Courier New" w:eastAsia="Courier New" w:hAnsi="Courier New" w:cs="Courier New"/>
-        </w:rPr>
-        <w:t>Model);</w:t>
+        <w:t xml:space="preserve"> de aprovado para Login(Model);</w:t>
       </w:r>
     </w:p>
     <w:p>
@@ -478,19 +648,33 @@
           <w:bCs/>
         </w:rPr>
       </w:pPr>
-      <w:proofErr w:type="gramStart"/>
-      <w:r>
-        <w:rPr>
-          <w:rFonts w:ascii="Courier New" w:eastAsia="Courier New" w:hAnsi="Courier New" w:cs="Courier New"/>
-        </w:rPr>
-        <w:t>Login(</w:t>
-      </w:r>
-      <w:proofErr w:type="gramEnd"/>
-      <w:r>
-        <w:rPr>
-          <w:rFonts w:ascii="Courier New" w:eastAsia="Courier New" w:hAnsi="Courier New" w:cs="Courier New"/>
-        </w:rPr>
-        <w:t xml:space="preserve">Model) retorna </w:t>
+      <w:proofErr w:type="spellStart"/>
+      <w:r>
+        <w:rPr>
+          <w:rFonts w:ascii="Courier New" w:eastAsia="Courier New" w:hAnsi="Courier New" w:cs="Courier New"/>
+        </w:rPr>
+        <w:t>Login</w:t>
+      </w:r>
+      <w:proofErr w:type="spellEnd"/>
+      <w:r>
+        <w:rPr>
+          <w:rFonts w:ascii="Courier New" w:eastAsia="Courier New" w:hAnsi="Courier New" w:cs="Courier New"/>
+        </w:rPr>
+        <w:t>(</w:t>
+      </w:r>
+      <w:proofErr w:type="spellStart"/>
+      <w:r>
+        <w:rPr>
+          <w:rFonts w:ascii="Courier New" w:eastAsia="Courier New" w:hAnsi="Courier New" w:cs="Courier New"/>
+        </w:rPr>
+        <w:t>Model</w:t>
+      </w:r>
+      <w:proofErr w:type="spellEnd"/>
+      <w:r>
+        <w:rPr>
+          <w:rFonts w:ascii="Courier New" w:eastAsia="Courier New" w:hAnsi="Courier New" w:cs="Courier New"/>
+        </w:rPr>
+        <w:t xml:space="preserve">) retorna </w:t>
       </w:r>
       <w:proofErr w:type="spellStart"/>
       <w:r>
@@ -574,12 +758,20 @@
         </w:rPr>
         <w:t>(</w:t>
       </w:r>
+      <w:proofErr w:type="spellStart"/>
       <w:proofErr w:type="gramEnd"/>
       <w:r>
         <w:rPr>
           <w:rFonts w:ascii="Courier New" w:eastAsia="Courier New" w:hAnsi="Courier New" w:cs="Courier New"/>
         </w:rPr>
-        <w:t xml:space="preserve">Dashboard principal do </w:t>
+        <w:t>Dashboard</w:t>
+      </w:r>
+      <w:proofErr w:type="spellEnd"/>
+      <w:r>
+        <w:rPr>
+          <w:rFonts w:ascii="Courier New" w:eastAsia="Courier New" w:hAnsi="Courier New" w:cs="Courier New"/>
+        </w:rPr>
+        <w:t xml:space="preserve"> principal do </w:t>
       </w:r>
       <w:r>
         <w:rPr>
@@ -594,7 +786,6 @@
         <w:t xml:space="preserve">) ou </w:t>
       </w:r>
       <w:proofErr w:type="spellStart"/>
-      <w:proofErr w:type="gramStart"/>
       <w:r>
         <w:rPr>
           <w:rFonts w:ascii="Courier New" w:eastAsia="Courier New" w:hAnsi="Courier New" w:cs="Courier New"/>
@@ -608,26 +799,33 @@
         </w:rPr>
         <w:t>(</w:t>
       </w:r>
-      <w:proofErr w:type="gramEnd"/>
-      <w:r>
-        <w:rPr>
-          <w:rFonts w:ascii="Courier New" w:eastAsia="Courier New" w:hAnsi="Courier New" w:cs="Courier New"/>
-        </w:rPr>
-        <w:t xml:space="preserve">Dashboard principal do Personal) chamar </w:t>
-      </w:r>
-      <w:proofErr w:type="gramStart"/>
-      <w:r>
-        <w:rPr>
-          <w:rFonts w:ascii="Courier New" w:eastAsia="Courier New" w:hAnsi="Courier New" w:cs="Courier New"/>
-        </w:rPr>
-        <w:t>render(</w:t>
-      </w:r>
-      <w:proofErr w:type="gramEnd"/>
-      <w:r>
-        <w:rPr>
-          <w:rFonts w:ascii="Courier New" w:eastAsia="Courier New" w:hAnsi="Courier New" w:cs="Courier New"/>
-        </w:rPr>
-        <w:t>); para serem exibidas;</w:t>
+      <w:proofErr w:type="spellStart"/>
+      <w:r>
+        <w:rPr>
+          <w:rFonts w:ascii="Courier New" w:eastAsia="Courier New" w:hAnsi="Courier New" w:cs="Courier New"/>
+        </w:rPr>
+        <w:t>Dashboard</w:t>
+      </w:r>
+      <w:proofErr w:type="spellEnd"/>
+      <w:r>
+        <w:rPr>
+          <w:rFonts w:ascii="Courier New" w:eastAsia="Courier New" w:hAnsi="Courier New" w:cs="Courier New"/>
+        </w:rPr>
+        <w:t xml:space="preserve"> principal do </w:t>
+      </w:r>
+      <w:proofErr w:type="spellStart"/>
+      <w:r>
+        <w:rPr>
+          <w:rFonts w:ascii="Courier New" w:eastAsia="Courier New" w:hAnsi="Courier New" w:cs="Courier New"/>
+        </w:rPr>
+        <w:t>Personal</w:t>
+      </w:r>
+      <w:proofErr w:type="spellEnd"/>
+      <w:r>
+        <w:rPr>
+          <w:rFonts w:ascii="Courier New" w:eastAsia="Courier New" w:hAnsi="Courier New" w:cs="Courier New"/>
+        </w:rPr>
+        <w:t>) chamar render(); para serem exibidas;</w:t>
       </w:r>
     </w:p>
     <w:p>
@@ -686,8 +884,8 @@
       <w:pPr>
         <w:pStyle w:val="Ttulo"/>
       </w:pPr>
-      <w:bookmarkStart w:id="1" w:name="_n85s57ykwb9l" w:colFirst="0" w:colLast="0"/>
-      <w:bookmarkEnd w:id="1"/>
+      <w:bookmarkStart w:id="2" w:name="_n85s57ykwb9l" w:colFirst="0" w:colLast="0"/>
+      <w:bookmarkEnd w:id="2"/>
       <w:r>
         <w:t>Fluxo Alternativo I (1)</w:t>
       </w:r>
@@ -900,21 +1098,7 @@
         <w:rPr>
           <w:rFonts w:ascii="Courier New" w:eastAsia="Courier New" w:hAnsi="Courier New" w:cs="Courier New"/>
         </w:rPr>
-        <w:t xml:space="preserve">); para enviar as informações de login inseridas para </w:t>
-      </w:r>
-      <w:proofErr w:type="gramStart"/>
-      <w:r>
-        <w:rPr>
-          <w:rFonts w:ascii="Courier New" w:eastAsia="Courier New" w:hAnsi="Courier New" w:cs="Courier New"/>
-        </w:rPr>
-        <w:t>Login(</w:t>
-      </w:r>
-      <w:proofErr w:type="gramEnd"/>
-      <w:r>
-        <w:rPr>
-          <w:rFonts w:ascii="Courier New" w:eastAsia="Courier New" w:hAnsi="Courier New" w:cs="Courier New"/>
-        </w:rPr>
-        <w:t>Model);</w:t>
+        <w:t>); para enviar as informações de login inseridas para Login(Model);</w:t>
       </w:r>
     </w:p>
     <w:p>
@@ -931,19 +1115,33 @@
           <w:bCs/>
         </w:rPr>
       </w:pPr>
-      <w:proofErr w:type="gramStart"/>
-      <w:r>
-        <w:rPr>
-          <w:rFonts w:ascii="Courier New" w:eastAsia="Courier New" w:hAnsi="Courier New" w:cs="Courier New"/>
-        </w:rPr>
-        <w:t>Login(</w:t>
-      </w:r>
-      <w:proofErr w:type="gramEnd"/>
-      <w:r>
-        <w:rPr>
-          <w:rFonts w:ascii="Courier New" w:eastAsia="Courier New" w:hAnsi="Courier New" w:cs="Courier New"/>
-        </w:rPr>
-        <w:t xml:space="preserve">Model) chama </w:t>
+      <w:proofErr w:type="spellStart"/>
+      <w:r>
+        <w:rPr>
+          <w:rFonts w:ascii="Courier New" w:eastAsia="Courier New" w:hAnsi="Courier New" w:cs="Courier New"/>
+        </w:rPr>
+        <w:t>Login</w:t>
+      </w:r>
+      <w:proofErr w:type="spellEnd"/>
+      <w:r>
+        <w:rPr>
+          <w:rFonts w:ascii="Courier New" w:eastAsia="Courier New" w:hAnsi="Courier New" w:cs="Courier New"/>
+        </w:rPr>
+        <w:t>(</w:t>
+      </w:r>
+      <w:proofErr w:type="spellStart"/>
+      <w:r>
+        <w:rPr>
+          <w:rFonts w:ascii="Courier New" w:eastAsia="Courier New" w:hAnsi="Courier New" w:cs="Courier New"/>
+        </w:rPr>
+        <w:t>Model</w:t>
+      </w:r>
+      <w:proofErr w:type="spellEnd"/>
+      <w:r>
+        <w:rPr>
+          <w:rFonts w:ascii="Courier New" w:eastAsia="Courier New" w:hAnsi="Courier New" w:cs="Courier New"/>
+        </w:rPr>
+        <w:t xml:space="preserve">) chama </w:t>
       </w:r>
       <w:proofErr w:type="spellStart"/>
       <w:r>
@@ -986,19 +1184,33 @@
           <w:rFonts w:ascii="Courier New" w:eastAsia="Courier New" w:hAnsi="Courier New" w:cs="Courier New"/>
         </w:rPr>
       </w:pPr>
-      <w:proofErr w:type="gramStart"/>
-      <w:r>
-        <w:rPr>
-          <w:rFonts w:ascii="Courier New" w:eastAsia="Courier New" w:hAnsi="Courier New" w:cs="Courier New"/>
-        </w:rPr>
-        <w:t>Login(</w:t>
-      </w:r>
-      <w:proofErr w:type="gramEnd"/>
-      <w:r>
-        <w:rPr>
-          <w:rFonts w:ascii="Courier New" w:eastAsia="Courier New" w:hAnsi="Courier New" w:cs="Courier New"/>
-        </w:rPr>
-        <w:t xml:space="preserve">Model) chama </w:t>
+      <w:proofErr w:type="spellStart"/>
+      <w:r>
+        <w:rPr>
+          <w:rFonts w:ascii="Courier New" w:eastAsia="Courier New" w:hAnsi="Courier New" w:cs="Courier New"/>
+        </w:rPr>
+        <w:t>Login</w:t>
+      </w:r>
+      <w:proofErr w:type="spellEnd"/>
+      <w:r>
+        <w:rPr>
+          <w:rFonts w:ascii="Courier New" w:eastAsia="Courier New" w:hAnsi="Courier New" w:cs="Courier New"/>
+        </w:rPr>
+        <w:t>(</w:t>
+      </w:r>
+      <w:proofErr w:type="spellStart"/>
+      <w:r>
+        <w:rPr>
+          <w:rFonts w:ascii="Courier New" w:eastAsia="Courier New" w:hAnsi="Courier New" w:cs="Courier New"/>
+        </w:rPr>
+        <w:t>Model</w:t>
+      </w:r>
+      <w:proofErr w:type="spellEnd"/>
+      <w:r>
+        <w:rPr>
+          <w:rFonts w:ascii="Courier New" w:eastAsia="Courier New" w:hAnsi="Courier New" w:cs="Courier New"/>
+        </w:rPr>
+        <w:t xml:space="preserve">) chama </w:t>
       </w:r>
       <w:proofErr w:type="spellStart"/>
       <w:r>
@@ -1026,7 +1238,21 @@
         <w:rPr>
           <w:rFonts w:ascii="Courier New" w:eastAsia="Courier New" w:hAnsi="Courier New" w:cs="Courier New"/>
         </w:rPr>
-        <w:t>); para sanitizar as informações inseridas pelo Usuário;</w:t>
+        <w:t xml:space="preserve">); para </w:t>
+      </w:r>
+      <w:proofErr w:type="spellStart"/>
+      <w:r>
+        <w:rPr>
+          <w:rFonts w:ascii="Courier New" w:eastAsia="Courier New" w:hAnsi="Courier New" w:cs="Courier New"/>
+        </w:rPr>
+        <w:t>sanitizar</w:t>
+      </w:r>
+      <w:proofErr w:type="spellEnd"/>
+      <w:r>
+        <w:rPr>
+          <w:rFonts w:ascii="Courier New" w:eastAsia="Courier New" w:hAnsi="Courier New" w:cs="Courier New"/>
+        </w:rPr>
+        <w:t xml:space="preserve"> as informações inseridas pelo Usuário;</w:t>
       </w:r>
     </w:p>
     <w:p>
@@ -1122,21 +1348,7 @@
         <w:rPr>
           <w:rFonts w:ascii="Courier New" w:eastAsia="Courier New" w:hAnsi="Courier New" w:cs="Courier New"/>
         </w:rPr>
-        <w:t xml:space="preserve"> de aprovado para </w:t>
-      </w:r>
-      <w:proofErr w:type="gramStart"/>
-      <w:r>
-        <w:rPr>
-          <w:rFonts w:ascii="Courier New" w:eastAsia="Courier New" w:hAnsi="Courier New" w:cs="Courier New"/>
-        </w:rPr>
-        <w:t>Login(</w:t>
-      </w:r>
-      <w:proofErr w:type="gramEnd"/>
-      <w:r>
-        <w:rPr>
-          <w:rFonts w:ascii="Courier New" w:eastAsia="Courier New" w:hAnsi="Courier New" w:cs="Courier New"/>
-        </w:rPr>
-        <w:t>Model);</w:t>
+        <w:t xml:space="preserve"> de aprovado para Login(Model);</w:t>
       </w:r>
     </w:p>
     <w:p>
@@ -1151,19 +1363,33 @@
           <w:rFonts w:ascii="Courier New" w:eastAsia="Courier New" w:hAnsi="Courier New" w:cs="Courier New"/>
         </w:rPr>
       </w:pPr>
-      <w:proofErr w:type="gramStart"/>
-      <w:r>
-        <w:rPr>
-          <w:rFonts w:ascii="Courier New" w:eastAsia="Courier New" w:hAnsi="Courier New" w:cs="Courier New"/>
-        </w:rPr>
-        <w:t>Login(</w:t>
-      </w:r>
-      <w:proofErr w:type="gramEnd"/>
-      <w:r>
-        <w:rPr>
-          <w:rFonts w:ascii="Courier New" w:eastAsia="Courier New" w:hAnsi="Courier New" w:cs="Courier New"/>
-        </w:rPr>
-        <w:t xml:space="preserve">Model) retorna </w:t>
+      <w:proofErr w:type="spellStart"/>
+      <w:r>
+        <w:rPr>
+          <w:rFonts w:ascii="Courier New" w:eastAsia="Courier New" w:hAnsi="Courier New" w:cs="Courier New"/>
+        </w:rPr>
+        <w:t>Login</w:t>
+      </w:r>
+      <w:proofErr w:type="spellEnd"/>
+      <w:r>
+        <w:rPr>
+          <w:rFonts w:ascii="Courier New" w:eastAsia="Courier New" w:hAnsi="Courier New" w:cs="Courier New"/>
+        </w:rPr>
+        <w:t>(</w:t>
+      </w:r>
+      <w:proofErr w:type="spellStart"/>
+      <w:r>
+        <w:rPr>
+          <w:rFonts w:ascii="Courier New" w:eastAsia="Courier New" w:hAnsi="Courier New" w:cs="Courier New"/>
+        </w:rPr>
+        <w:t>Model</w:t>
+      </w:r>
+      <w:proofErr w:type="spellEnd"/>
+      <w:r>
+        <w:rPr>
+          <w:rFonts w:ascii="Courier New" w:eastAsia="Courier New" w:hAnsi="Courier New" w:cs="Courier New"/>
+        </w:rPr>
+        <w:t xml:space="preserve">) retorna </w:t>
       </w:r>
       <w:proofErr w:type="spellStart"/>
       <w:r>
@@ -1245,12 +1471,20 @@
         </w:rPr>
         <w:t>(</w:t>
       </w:r>
+      <w:proofErr w:type="spellStart"/>
       <w:proofErr w:type="gramEnd"/>
       <w:r>
         <w:rPr>
           <w:rFonts w:ascii="Courier New" w:eastAsia="Courier New" w:hAnsi="Courier New" w:cs="Courier New"/>
         </w:rPr>
-        <w:t xml:space="preserve">Dashboard principal do </w:t>
+        <w:t>Dashboard</w:t>
+      </w:r>
+      <w:proofErr w:type="spellEnd"/>
+      <w:r>
+        <w:rPr>
+          <w:rFonts w:ascii="Courier New" w:eastAsia="Courier New" w:hAnsi="Courier New" w:cs="Courier New"/>
+        </w:rPr>
+        <w:t xml:space="preserve"> principal do </w:t>
       </w:r>
       <w:r>
         <w:rPr>
@@ -1265,7 +1499,6 @@
         <w:t xml:space="preserve">) ou </w:t>
       </w:r>
       <w:proofErr w:type="spellStart"/>
-      <w:proofErr w:type="gramStart"/>
       <w:r>
         <w:rPr>
           <w:rFonts w:ascii="Courier New" w:eastAsia="Courier New" w:hAnsi="Courier New" w:cs="Courier New"/>
@@ -1279,26 +1512,33 @@
         </w:rPr>
         <w:t>(</w:t>
       </w:r>
-      <w:proofErr w:type="gramEnd"/>
-      <w:r>
-        <w:rPr>
-          <w:rFonts w:ascii="Courier New" w:eastAsia="Courier New" w:hAnsi="Courier New" w:cs="Courier New"/>
-        </w:rPr>
-        <w:t xml:space="preserve">Dashboard principal do Personal) chamar </w:t>
-      </w:r>
-      <w:proofErr w:type="gramStart"/>
-      <w:r>
-        <w:rPr>
-          <w:rFonts w:ascii="Courier New" w:eastAsia="Courier New" w:hAnsi="Courier New" w:cs="Courier New"/>
-        </w:rPr>
-        <w:t>render(</w:t>
-      </w:r>
-      <w:proofErr w:type="gramEnd"/>
-      <w:r>
-        <w:rPr>
-          <w:rFonts w:ascii="Courier New" w:eastAsia="Courier New" w:hAnsi="Courier New" w:cs="Courier New"/>
-        </w:rPr>
-        <w:t>); para serem exibidas;</w:t>
+      <w:proofErr w:type="spellStart"/>
+      <w:r>
+        <w:rPr>
+          <w:rFonts w:ascii="Courier New" w:eastAsia="Courier New" w:hAnsi="Courier New" w:cs="Courier New"/>
+        </w:rPr>
+        <w:t>Dashboard</w:t>
+      </w:r>
+      <w:proofErr w:type="spellEnd"/>
+      <w:r>
+        <w:rPr>
+          <w:rFonts w:ascii="Courier New" w:eastAsia="Courier New" w:hAnsi="Courier New" w:cs="Courier New"/>
+        </w:rPr>
+        <w:t xml:space="preserve"> principal do </w:t>
+      </w:r>
+      <w:proofErr w:type="spellStart"/>
+      <w:r>
+        <w:rPr>
+          <w:rFonts w:ascii="Courier New" w:eastAsia="Courier New" w:hAnsi="Courier New" w:cs="Courier New"/>
+        </w:rPr>
+        <w:t>Personal</w:t>
+      </w:r>
+      <w:proofErr w:type="spellEnd"/>
+      <w:r>
+        <w:rPr>
+          <w:rFonts w:ascii="Courier New" w:eastAsia="Courier New" w:hAnsi="Courier New" w:cs="Courier New"/>
+        </w:rPr>
+        <w:t>) chamar render(); para serem exibidas;</w:t>
       </w:r>
     </w:p>
     <w:p>
@@ -1326,8 +1566,8 @@
       <w:pPr>
         <w:pStyle w:val="Ttulo"/>
       </w:pPr>
-      <w:bookmarkStart w:id="2" w:name="_aesxzu3ewedp" w:colFirst="0" w:colLast="0"/>
-      <w:bookmarkEnd w:id="2"/>
+      <w:bookmarkStart w:id="3" w:name="_aesxzu3ewedp" w:colFirst="0" w:colLast="0"/>
+      <w:bookmarkEnd w:id="3"/>
       <w:r>
         <w:t>Fluxo Alternativo II (1)</w:t>
       </w:r>
@@ -1540,21 +1780,7 @@
         <w:rPr>
           <w:rFonts w:ascii="Courier New" w:eastAsia="Courier New" w:hAnsi="Courier New" w:cs="Courier New"/>
         </w:rPr>
-        <w:t xml:space="preserve">); para enviar as informações de login inseridas para </w:t>
-      </w:r>
-      <w:proofErr w:type="gramStart"/>
-      <w:r>
-        <w:rPr>
-          <w:rFonts w:ascii="Courier New" w:eastAsia="Courier New" w:hAnsi="Courier New" w:cs="Courier New"/>
-        </w:rPr>
-        <w:t>Login(</w:t>
-      </w:r>
-      <w:proofErr w:type="gramEnd"/>
-      <w:r>
-        <w:rPr>
-          <w:rFonts w:ascii="Courier New" w:eastAsia="Courier New" w:hAnsi="Courier New" w:cs="Courier New"/>
-        </w:rPr>
-        <w:t>Model);</w:t>
+        <w:t>); para enviar as informações de login inseridas para Login(Model);</w:t>
       </w:r>
     </w:p>
     <w:p>
@@ -1569,19 +1795,33 @@
           <w:rFonts w:ascii="Courier New" w:eastAsia="Courier New" w:hAnsi="Courier New" w:cs="Courier New"/>
         </w:rPr>
       </w:pPr>
-      <w:proofErr w:type="gramStart"/>
-      <w:r>
-        <w:rPr>
-          <w:rFonts w:ascii="Courier New" w:eastAsia="Courier New" w:hAnsi="Courier New" w:cs="Courier New"/>
-        </w:rPr>
-        <w:t>Login(</w:t>
-      </w:r>
-      <w:proofErr w:type="gramEnd"/>
-      <w:r>
-        <w:rPr>
-          <w:rFonts w:ascii="Courier New" w:eastAsia="Courier New" w:hAnsi="Courier New" w:cs="Courier New"/>
-        </w:rPr>
-        <w:t xml:space="preserve">Model) chama </w:t>
+      <w:proofErr w:type="spellStart"/>
+      <w:r>
+        <w:rPr>
+          <w:rFonts w:ascii="Courier New" w:eastAsia="Courier New" w:hAnsi="Courier New" w:cs="Courier New"/>
+        </w:rPr>
+        <w:t>Login</w:t>
+      </w:r>
+      <w:proofErr w:type="spellEnd"/>
+      <w:r>
+        <w:rPr>
+          <w:rFonts w:ascii="Courier New" w:eastAsia="Courier New" w:hAnsi="Courier New" w:cs="Courier New"/>
+        </w:rPr>
+        <w:t>(</w:t>
+      </w:r>
+      <w:proofErr w:type="spellStart"/>
+      <w:r>
+        <w:rPr>
+          <w:rFonts w:ascii="Courier New" w:eastAsia="Courier New" w:hAnsi="Courier New" w:cs="Courier New"/>
+        </w:rPr>
+        <w:t>Model</w:t>
+      </w:r>
+      <w:proofErr w:type="spellEnd"/>
+      <w:r>
+        <w:rPr>
+          <w:rFonts w:ascii="Courier New" w:eastAsia="Courier New" w:hAnsi="Courier New" w:cs="Courier New"/>
+        </w:rPr>
+        <w:t xml:space="preserve">) chama </w:t>
       </w:r>
       <w:proofErr w:type="spellStart"/>
       <w:r>
@@ -1624,19 +1864,33 @@
           <w:rFonts w:ascii="Courier New" w:eastAsia="Courier New" w:hAnsi="Courier New" w:cs="Courier New"/>
         </w:rPr>
       </w:pPr>
-      <w:proofErr w:type="gramStart"/>
-      <w:r>
-        <w:rPr>
-          <w:rFonts w:ascii="Courier New" w:eastAsia="Courier New" w:hAnsi="Courier New" w:cs="Courier New"/>
-        </w:rPr>
-        <w:t>Login(</w:t>
-      </w:r>
-      <w:proofErr w:type="gramEnd"/>
-      <w:r>
-        <w:rPr>
-          <w:rFonts w:ascii="Courier New" w:eastAsia="Courier New" w:hAnsi="Courier New" w:cs="Courier New"/>
-        </w:rPr>
-        <w:t xml:space="preserve">Model) chama </w:t>
+      <w:proofErr w:type="spellStart"/>
+      <w:r>
+        <w:rPr>
+          <w:rFonts w:ascii="Courier New" w:eastAsia="Courier New" w:hAnsi="Courier New" w:cs="Courier New"/>
+        </w:rPr>
+        <w:t>Login</w:t>
+      </w:r>
+      <w:proofErr w:type="spellEnd"/>
+      <w:r>
+        <w:rPr>
+          <w:rFonts w:ascii="Courier New" w:eastAsia="Courier New" w:hAnsi="Courier New" w:cs="Courier New"/>
+        </w:rPr>
+        <w:t>(</w:t>
+      </w:r>
+      <w:proofErr w:type="spellStart"/>
+      <w:r>
+        <w:rPr>
+          <w:rFonts w:ascii="Courier New" w:eastAsia="Courier New" w:hAnsi="Courier New" w:cs="Courier New"/>
+        </w:rPr>
+        <w:t>Model</w:t>
+      </w:r>
+      <w:proofErr w:type="spellEnd"/>
+      <w:r>
+        <w:rPr>
+          <w:rFonts w:ascii="Courier New" w:eastAsia="Courier New" w:hAnsi="Courier New" w:cs="Courier New"/>
+        </w:rPr>
+        <w:t xml:space="preserve">) chama </w:t>
       </w:r>
       <w:proofErr w:type="spellStart"/>
       <w:r>
@@ -1664,7 +1918,21 @@
         <w:rPr>
           <w:rFonts w:ascii="Courier New" w:eastAsia="Courier New" w:hAnsi="Courier New" w:cs="Courier New"/>
         </w:rPr>
-        <w:t>); para sanitizar as informações inseridas pelo Usuário;</w:t>
+        <w:t xml:space="preserve">); para </w:t>
+      </w:r>
+      <w:proofErr w:type="spellStart"/>
+      <w:r>
+        <w:rPr>
+          <w:rFonts w:ascii="Courier New" w:eastAsia="Courier New" w:hAnsi="Courier New" w:cs="Courier New"/>
+        </w:rPr>
+        <w:t>sanitizar</w:t>
+      </w:r>
+      <w:proofErr w:type="spellEnd"/>
+      <w:r>
+        <w:rPr>
+          <w:rFonts w:ascii="Courier New" w:eastAsia="Courier New" w:hAnsi="Courier New" w:cs="Courier New"/>
+        </w:rPr>
+        <w:t xml:space="preserve"> as informações inseridas pelo Usuário;</w:t>
       </w:r>
     </w:p>
     <w:p>
@@ -1760,21 +2028,7 @@
         <w:rPr>
           <w:rFonts w:ascii="Courier New" w:eastAsia="Courier New" w:hAnsi="Courier New" w:cs="Courier New"/>
         </w:rPr>
-        <w:t xml:space="preserve"> de aprovado para </w:t>
-      </w:r>
-      <w:proofErr w:type="gramStart"/>
-      <w:r>
-        <w:rPr>
-          <w:rFonts w:ascii="Courier New" w:eastAsia="Courier New" w:hAnsi="Courier New" w:cs="Courier New"/>
-        </w:rPr>
-        <w:t>Login(</w:t>
-      </w:r>
-      <w:proofErr w:type="gramEnd"/>
-      <w:r>
-        <w:rPr>
-          <w:rFonts w:ascii="Courier New" w:eastAsia="Courier New" w:hAnsi="Courier New" w:cs="Courier New"/>
-        </w:rPr>
-        <w:t>Model);</w:t>
+        <w:t xml:space="preserve"> de aprovado para Login(Model);</w:t>
       </w:r>
     </w:p>
     <w:p>
@@ -1789,19 +2043,33 @@
           <w:rFonts w:ascii="Courier New" w:eastAsia="Courier New" w:hAnsi="Courier New" w:cs="Courier New"/>
         </w:rPr>
       </w:pPr>
-      <w:proofErr w:type="gramStart"/>
-      <w:r>
-        <w:rPr>
-          <w:rFonts w:ascii="Courier New" w:eastAsia="Courier New" w:hAnsi="Courier New" w:cs="Courier New"/>
-        </w:rPr>
-        <w:t>Login(</w:t>
-      </w:r>
-      <w:proofErr w:type="gramEnd"/>
-      <w:r>
-        <w:rPr>
-          <w:rFonts w:ascii="Courier New" w:eastAsia="Courier New" w:hAnsi="Courier New" w:cs="Courier New"/>
-        </w:rPr>
-        <w:t xml:space="preserve">Model) retorna </w:t>
+      <w:proofErr w:type="spellStart"/>
+      <w:r>
+        <w:rPr>
+          <w:rFonts w:ascii="Courier New" w:eastAsia="Courier New" w:hAnsi="Courier New" w:cs="Courier New"/>
+        </w:rPr>
+        <w:t>Login</w:t>
+      </w:r>
+      <w:proofErr w:type="spellEnd"/>
+      <w:r>
+        <w:rPr>
+          <w:rFonts w:ascii="Courier New" w:eastAsia="Courier New" w:hAnsi="Courier New" w:cs="Courier New"/>
+        </w:rPr>
+        <w:t>(</w:t>
+      </w:r>
+      <w:proofErr w:type="spellStart"/>
+      <w:r>
+        <w:rPr>
+          <w:rFonts w:ascii="Courier New" w:eastAsia="Courier New" w:hAnsi="Courier New" w:cs="Courier New"/>
+        </w:rPr>
+        <w:t>Model</w:t>
+      </w:r>
+      <w:proofErr w:type="spellEnd"/>
+      <w:r>
+        <w:rPr>
+          <w:rFonts w:ascii="Courier New" w:eastAsia="Courier New" w:hAnsi="Courier New" w:cs="Courier New"/>
+        </w:rPr>
+        <w:t xml:space="preserve">) retorna </w:t>
       </w:r>
       <w:proofErr w:type="spellStart"/>
       <w:r>
@@ -1883,12 +2151,20 @@
         </w:rPr>
         <w:t>(</w:t>
       </w:r>
+      <w:proofErr w:type="spellStart"/>
       <w:proofErr w:type="gramEnd"/>
       <w:r>
         <w:rPr>
           <w:rFonts w:ascii="Courier New" w:eastAsia="Courier New" w:hAnsi="Courier New" w:cs="Courier New"/>
         </w:rPr>
-        <w:t xml:space="preserve">Dashboard principal do </w:t>
+        <w:t>Dashboard</w:t>
+      </w:r>
+      <w:proofErr w:type="spellEnd"/>
+      <w:r>
+        <w:rPr>
+          <w:rFonts w:ascii="Courier New" w:eastAsia="Courier New" w:hAnsi="Courier New" w:cs="Courier New"/>
+        </w:rPr>
+        <w:t xml:space="preserve"> principal do </w:t>
       </w:r>
       <w:r>
         <w:rPr>
@@ -1903,7 +2179,6 @@
         <w:t xml:space="preserve">) ou </w:t>
       </w:r>
       <w:proofErr w:type="spellStart"/>
-      <w:proofErr w:type="gramStart"/>
       <w:r>
         <w:rPr>
           <w:rFonts w:ascii="Courier New" w:eastAsia="Courier New" w:hAnsi="Courier New" w:cs="Courier New"/>
@@ -1917,26 +2192,33 @@
         </w:rPr>
         <w:t>(</w:t>
       </w:r>
-      <w:proofErr w:type="gramEnd"/>
-      <w:r>
-        <w:rPr>
-          <w:rFonts w:ascii="Courier New" w:eastAsia="Courier New" w:hAnsi="Courier New" w:cs="Courier New"/>
-        </w:rPr>
-        <w:t xml:space="preserve">Dashboard principal do Personal) chamar </w:t>
-      </w:r>
-      <w:proofErr w:type="gramStart"/>
-      <w:r>
-        <w:rPr>
-          <w:rFonts w:ascii="Courier New" w:eastAsia="Courier New" w:hAnsi="Courier New" w:cs="Courier New"/>
-        </w:rPr>
-        <w:t>render(</w:t>
-      </w:r>
-      <w:proofErr w:type="gramEnd"/>
-      <w:r>
-        <w:rPr>
-          <w:rFonts w:ascii="Courier New" w:eastAsia="Courier New" w:hAnsi="Courier New" w:cs="Courier New"/>
-        </w:rPr>
-        <w:t>); para serem exibidas;</w:t>
+      <w:proofErr w:type="spellStart"/>
+      <w:r>
+        <w:rPr>
+          <w:rFonts w:ascii="Courier New" w:eastAsia="Courier New" w:hAnsi="Courier New" w:cs="Courier New"/>
+        </w:rPr>
+        <w:t>Dashboard</w:t>
+      </w:r>
+      <w:proofErr w:type="spellEnd"/>
+      <w:r>
+        <w:rPr>
+          <w:rFonts w:ascii="Courier New" w:eastAsia="Courier New" w:hAnsi="Courier New" w:cs="Courier New"/>
+        </w:rPr>
+        <w:t xml:space="preserve"> principal do </w:t>
+      </w:r>
+      <w:proofErr w:type="spellStart"/>
+      <w:r>
+        <w:rPr>
+          <w:rFonts w:ascii="Courier New" w:eastAsia="Courier New" w:hAnsi="Courier New" w:cs="Courier New"/>
+        </w:rPr>
+        <w:t>Personal</w:t>
+      </w:r>
+      <w:proofErr w:type="spellEnd"/>
+      <w:r>
+        <w:rPr>
+          <w:rFonts w:ascii="Courier New" w:eastAsia="Courier New" w:hAnsi="Courier New" w:cs="Courier New"/>
+        </w:rPr>
+        <w:t>) chamar render(); para serem exibidas;</w:t>
       </w:r>
     </w:p>
     <w:p>
@@ -1964,8 +2246,8 @@
       <w:pPr>
         <w:pStyle w:val="Ttulo"/>
       </w:pPr>
-      <w:bookmarkStart w:id="3" w:name="_p4tya94guwh4" w:colFirst="0" w:colLast="0"/>
-      <w:bookmarkEnd w:id="3"/>
+      <w:bookmarkStart w:id="4" w:name="_p4tya94guwh4" w:colFirst="0" w:colLast="0"/>
+      <w:bookmarkEnd w:id="4"/>
       <w:r>
         <w:t>Fluxo Alternativo III (8, 1.9)</w:t>
       </w:r>
@@ -2010,21 +2292,7 @@
         <w:rPr>
           <w:rFonts w:ascii="Courier New" w:eastAsia="Courier New" w:hAnsi="Courier New" w:cs="Courier New"/>
         </w:rPr>
-        <w:t xml:space="preserve"> de reprovado para </w:t>
-      </w:r>
-      <w:proofErr w:type="gramStart"/>
-      <w:r>
-        <w:rPr>
-          <w:rFonts w:ascii="Courier New" w:eastAsia="Courier New" w:hAnsi="Courier New" w:cs="Courier New"/>
-        </w:rPr>
-        <w:t>Login(</w:t>
-      </w:r>
-      <w:proofErr w:type="gramEnd"/>
-      <w:r>
-        <w:rPr>
-          <w:rFonts w:ascii="Courier New" w:eastAsia="Courier New" w:hAnsi="Courier New" w:cs="Courier New"/>
-        </w:rPr>
-        <w:t>Model);</w:t>
+        <w:t xml:space="preserve"> de reprovado para Login(Model);</w:t>
       </w:r>
     </w:p>
     <w:p>
@@ -2041,19 +2309,33 @@
           <w:bCs/>
         </w:rPr>
       </w:pPr>
-      <w:proofErr w:type="gramStart"/>
-      <w:r>
-        <w:rPr>
-          <w:rFonts w:ascii="Courier New" w:eastAsia="Courier New" w:hAnsi="Courier New" w:cs="Courier New"/>
-        </w:rPr>
-        <w:t>Login(</w:t>
-      </w:r>
-      <w:proofErr w:type="gramEnd"/>
-      <w:r>
-        <w:rPr>
-          <w:rFonts w:ascii="Courier New" w:eastAsia="Courier New" w:hAnsi="Courier New" w:cs="Courier New"/>
-        </w:rPr>
-        <w:t xml:space="preserve">Model) retorna </w:t>
+      <w:proofErr w:type="spellStart"/>
+      <w:r>
+        <w:rPr>
+          <w:rFonts w:ascii="Courier New" w:eastAsia="Courier New" w:hAnsi="Courier New" w:cs="Courier New"/>
+        </w:rPr>
+        <w:t>Login</w:t>
+      </w:r>
+      <w:proofErr w:type="spellEnd"/>
+      <w:r>
+        <w:rPr>
+          <w:rFonts w:ascii="Courier New" w:eastAsia="Courier New" w:hAnsi="Courier New" w:cs="Courier New"/>
+        </w:rPr>
+        <w:t>(</w:t>
+      </w:r>
+      <w:proofErr w:type="spellStart"/>
+      <w:r>
+        <w:rPr>
+          <w:rFonts w:ascii="Courier New" w:eastAsia="Courier New" w:hAnsi="Courier New" w:cs="Courier New"/>
+        </w:rPr>
+        <w:t>Model</w:t>
+      </w:r>
+      <w:proofErr w:type="spellEnd"/>
+      <w:r>
+        <w:rPr>
+          <w:rFonts w:ascii="Courier New" w:eastAsia="Courier New" w:hAnsi="Courier New" w:cs="Courier New"/>
+        </w:rPr>
+        <w:t xml:space="preserve">) retorna </w:t>
       </w:r>
       <w:proofErr w:type="spellStart"/>
       <w:r>
@@ -2180,7 +2462,7 @@
 </file>
 
 <file path=word/endnotes.xml><?xml version="1.0" encoding="utf-8"?>
-<w:endnotes xmlns:wpc="http://schemas.microsoft.com/office/word/2010/wordprocessingCanvas" xmlns:cx="http://schemas.microsoft.com/office/drawing/2014/chartex" xmlns:cx1="http://schemas.microsoft.com/office/drawing/2015/9/8/chartex" xmlns:cx2="http://schemas.microsoft.com/office/drawing/2015/10/21/chartex" xmlns:cx3="http://schemas.microsoft.com/office/drawing/2016/5/9/chartex" xmlns:cx4="http://schemas.microsoft.com/office/drawing/2016/5/10/chartex" xmlns:cx5="http://schemas.microsoft.com/office/drawing/2016/5/11/chartex" xmlns:cx6="http://schemas.microsoft.com/office/drawing/2016/5/12/chartex" xmlns:cx7="http://schemas.microsoft.com/office/drawing/2016/5/13/chartex" xmlns:cx8="http://schemas.microsoft.com/office/drawing/2016/5/14/chartex" xmlns:mc="http://schemas.openxmlformats.org/markup-compatibility/2006" xmlns:aink="http://schemas.microsoft.com/office/drawing/2016/ink" xmlns:am3d="http://schemas.microsoft.com/office/drawing/2017/model3d" xmlns:o="urn:schemas-microsoft-com:office:office" xmlns:oel="http://schemas.microsoft.com/office/2019/extlst" xmlns:r="http://schemas.openxmlformats.org/officeDocument/2006/relationships" xmlns:m="http://schemas.openxmlformats.org/officeDocument/2006/math" xmlns:v="urn:schemas-microsoft-com:vml" xmlns:wp14="http://schemas.microsoft.com/office/word/2010/wordprocessingDrawing" xmlns:wp="http://schemas.openxmlformats.org/drawingml/2006/wordprocessingDrawing" xmlns:w10="urn:schemas-microsoft-com:office:word" xmlns:w="http://schemas.openxmlformats.org/wordprocessingml/2006/main" xmlns:w14="http://schemas.microsoft.com/office/word/2010/wordml" xmlns:w15="http://schemas.microsoft.com/office/word/2012/wordml" xmlns:w16cex="http://schemas.microsoft.com/office/word/2018/wordml/cex" xmlns:w16cid="http://schemas.microsoft.com/office/word/2016/wordml/cid" xmlns:w16="http://schemas.microsoft.com/office/word/2018/wordml" xmlns:w16du="http://schemas.microsoft.com/office/word/2023/wordml/word16du" xmlns:w16sdtdh="http://schemas.microsoft.com/office/word/2020/wordml/sdtdatahash" xmlns:w16sdtfl="http://schemas.microsoft.com/office/word/2024/wordml/sdtformatlock" xmlns:w16se="http://schemas.microsoft.com/office/word/2015/wordml/symex" xmlns:wpg="http://schemas.microsoft.com/office/word/2010/wordprocessingGroup" xmlns:wpi="http://schemas.microsoft.com/office/word/2010/wordprocessingInk" xmlns:wne="http://schemas.microsoft.com/office/word/2006/wordml" xmlns:wps="http://schemas.microsoft.com/office/word/2010/wordprocessingShape" mc:Ignorable="w14 w15 w16se w16cid w16 w16cex w16sdtdh w16sdtfl w16du wp14">
+<w:endnotes xmlns:wpc="http://schemas.microsoft.com/office/word/2010/wordprocessingCanvas" xmlns:mc="http://schemas.openxmlformats.org/markup-compatibility/2006" xmlns:o="urn:schemas-microsoft-com:office:office" xmlns:r="http://schemas.openxmlformats.org/officeDocument/2006/relationships" xmlns:m="http://schemas.openxmlformats.org/officeDocument/2006/math" xmlns:v="urn:schemas-microsoft-com:vml" xmlns:wp14="http://schemas.microsoft.com/office/word/2010/wordprocessingDrawing" xmlns:wp="http://schemas.openxmlformats.org/drawingml/2006/wordprocessingDrawing" xmlns:w10="urn:schemas-microsoft-com:office:word" xmlns:w="http://schemas.openxmlformats.org/wordprocessingml/2006/main" xmlns:w14="http://schemas.microsoft.com/office/word/2010/wordml" xmlns:w15="http://schemas.microsoft.com/office/word/2012/wordml" xmlns:wpg="http://schemas.microsoft.com/office/word/2010/wordprocessingGroup" xmlns:wpi="http://schemas.microsoft.com/office/word/2010/wordprocessingInk" xmlns:wne="http://schemas.microsoft.com/office/word/2006/wordml" xmlns:wps="http://schemas.microsoft.com/office/word/2010/wordprocessingShape" mc:Ignorable="w14 w15 wp14">
   <w:endnote w:type="separator" w:id="-1">
     <w:p>
       <w:pPr>
@@ -2205,7 +2487,7 @@
 </file>
 
 <file path=word/footnotes.xml><?xml version="1.0" encoding="utf-8"?>
-<w:footnotes xmlns:wpc="http://schemas.microsoft.com/office/word/2010/wordprocessingCanvas" xmlns:cx="http://schemas.microsoft.com/office/drawing/2014/chartex" xmlns:cx1="http://schemas.microsoft.com/office/drawing/2015/9/8/chartex" xmlns:cx2="http://schemas.microsoft.com/office/drawing/2015/10/21/chartex" xmlns:cx3="http://schemas.microsoft.com/office/drawing/2016/5/9/chartex" xmlns:cx4="http://schemas.microsoft.com/office/drawing/2016/5/10/chartex" xmlns:cx5="http://schemas.microsoft.com/office/drawing/2016/5/11/chartex" xmlns:cx6="http://schemas.microsoft.com/office/drawing/2016/5/12/chartex" xmlns:cx7="http://schemas.microsoft.com/office/drawing/2016/5/13/chartex" xmlns:cx8="http://schemas.microsoft.com/office/drawing/2016/5/14/chartex" xmlns:mc="http://schemas.openxmlformats.org/markup-compatibility/2006" xmlns:aink="http://schemas.microsoft.com/office/drawing/2016/ink" xmlns:am3d="http://schemas.microsoft.com/office/drawing/2017/model3d" xmlns:o="urn:schemas-microsoft-com:office:office" xmlns:oel="http://schemas.microsoft.com/office/2019/extlst" xmlns:r="http://schemas.openxmlformats.org/officeDocument/2006/relationships" xmlns:m="http://schemas.openxmlformats.org/officeDocument/2006/math" xmlns:v="urn:schemas-microsoft-com:vml" xmlns:wp14="http://schemas.microsoft.com/office/word/2010/wordprocessingDrawing" xmlns:wp="http://schemas.openxmlformats.org/drawingml/2006/wordprocessingDrawing" xmlns:w10="urn:schemas-microsoft-com:office:word" xmlns:w="http://schemas.openxmlformats.org/wordprocessingml/2006/main" xmlns:w14="http://schemas.microsoft.com/office/word/2010/wordml" xmlns:w15="http://schemas.microsoft.com/office/word/2012/wordml" xmlns:w16cex="http://schemas.microsoft.com/office/word/2018/wordml/cex" xmlns:w16cid="http://schemas.microsoft.com/office/word/2016/wordml/cid" xmlns:w16="http://schemas.microsoft.com/office/word/2018/wordml" xmlns:w16du="http://schemas.microsoft.com/office/word/2023/wordml/word16du" xmlns:w16sdtdh="http://schemas.microsoft.com/office/word/2020/wordml/sdtdatahash" xmlns:w16sdtfl="http://schemas.microsoft.com/office/word/2024/wordml/sdtformatlock" xmlns:w16se="http://schemas.microsoft.com/office/word/2015/wordml/symex" xmlns:wpg="http://schemas.microsoft.com/office/word/2010/wordprocessingGroup" xmlns:wpi="http://schemas.microsoft.com/office/word/2010/wordprocessingInk" xmlns:wne="http://schemas.microsoft.com/office/word/2006/wordml" xmlns:wps="http://schemas.microsoft.com/office/word/2010/wordprocessingShape" mc:Ignorable="w14 w15 w16se w16cid w16 w16cex w16sdtdh w16sdtfl w16du wp14">
+<w:footnotes xmlns:wpc="http://schemas.microsoft.com/office/word/2010/wordprocessingCanvas" xmlns:mc="http://schemas.openxmlformats.org/markup-compatibility/2006" xmlns:o="urn:schemas-microsoft-com:office:office" xmlns:r="http://schemas.openxmlformats.org/officeDocument/2006/relationships" xmlns:m="http://schemas.openxmlformats.org/officeDocument/2006/math" xmlns:v="urn:schemas-microsoft-com:vml" xmlns:wp14="http://schemas.microsoft.com/office/word/2010/wordprocessingDrawing" xmlns:wp="http://schemas.openxmlformats.org/drawingml/2006/wordprocessingDrawing" xmlns:w10="urn:schemas-microsoft-com:office:word" xmlns:w="http://schemas.openxmlformats.org/wordprocessingml/2006/main" xmlns:w14="http://schemas.microsoft.com/office/word/2010/wordml" xmlns:w15="http://schemas.microsoft.com/office/word/2012/wordml" xmlns:wpg="http://schemas.microsoft.com/office/word/2010/wordprocessingGroup" xmlns:wpi="http://schemas.microsoft.com/office/word/2010/wordprocessingInk" xmlns:wne="http://schemas.microsoft.com/office/word/2006/wordml" xmlns:wps="http://schemas.microsoft.com/office/word/2010/wordprocessingShape" mc:Ignorable="w14 w15 wp14">
   <w:footnote w:type="separator" w:id="-1">
     <w:p>
       <w:pPr>
@@ -2230,7 +2512,7 @@
 </file>
 
 <file path=word/header1.xml><?xml version="1.0" encoding="utf-8"?>
-<w:hdr xmlns:wpc="http://schemas.microsoft.com/office/word/2010/wordprocessingCanvas" xmlns:cx="http://schemas.microsoft.com/office/drawing/2014/chartex" xmlns:cx1="http://schemas.microsoft.com/office/drawing/2015/9/8/chartex" xmlns:cx2="http://schemas.microsoft.com/office/drawing/2015/10/21/chartex" xmlns:cx3="http://schemas.microsoft.com/office/drawing/2016/5/9/chartex" xmlns:cx4="http://schemas.microsoft.com/office/drawing/2016/5/10/chartex" xmlns:cx5="http://schemas.microsoft.com/office/drawing/2016/5/11/chartex" xmlns:cx6="http://schemas.microsoft.com/office/drawing/2016/5/12/chartex" xmlns:cx7="http://schemas.microsoft.com/office/drawing/2016/5/13/chartex" xmlns:cx8="http://schemas.microsoft.com/office/drawing/2016/5/14/chartex" xmlns:mc="http://schemas.openxmlformats.org/markup-compatibility/2006" xmlns:aink="http://schemas.microsoft.com/office/drawing/2016/ink" xmlns:am3d="http://schemas.microsoft.com/office/drawing/2017/model3d" xmlns:o="urn:schemas-microsoft-com:office:office" xmlns:oel="http://schemas.microsoft.com/office/2019/extlst" xmlns:r="http://schemas.openxmlformats.org/officeDocument/2006/relationships" xmlns:m="http://schemas.openxmlformats.org/officeDocument/2006/math" xmlns:v="urn:schemas-microsoft-com:vml" xmlns:wp14="http://schemas.microsoft.com/office/word/2010/wordprocessingDrawing" xmlns:wp="http://schemas.openxmlformats.org/drawingml/2006/wordprocessingDrawing" xmlns:w10="urn:schemas-microsoft-com:office:word" xmlns:w="http://schemas.openxmlformats.org/wordprocessingml/2006/main" xmlns:w14="http://schemas.microsoft.com/office/word/2010/wordml" xmlns:w15="http://schemas.microsoft.com/office/word/2012/wordml" xmlns:w16cex="http://schemas.microsoft.com/office/word/2018/wordml/cex" xmlns:w16cid="http://schemas.microsoft.com/office/word/2016/wordml/cid" xmlns:w16="http://schemas.microsoft.com/office/word/2018/wordml" xmlns:w16du="http://schemas.microsoft.com/office/word/2023/wordml/word16du" xmlns:w16sdtdh="http://schemas.microsoft.com/office/word/2020/wordml/sdtdatahash" xmlns:w16sdtfl="http://schemas.microsoft.com/office/word/2024/wordml/sdtformatlock" xmlns:w16se="http://schemas.microsoft.com/office/word/2015/wordml/symex" xmlns:wpg="http://schemas.microsoft.com/office/word/2010/wordprocessingGroup" xmlns:wpi="http://schemas.microsoft.com/office/word/2010/wordprocessingInk" xmlns:wne="http://schemas.microsoft.com/office/word/2006/wordml" xmlns:wps="http://schemas.microsoft.com/office/word/2010/wordprocessingShape" mc:Ignorable="w14 w15 w16se w16cid w16 w16cex w16sdtdh w16sdtfl w16du wp14">
+<w:hdr xmlns:wpc="http://schemas.microsoft.com/office/word/2010/wordprocessingCanvas" xmlns:mc="http://schemas.openxmlformats.org/markup-compatibility/2006" xmlns:o="urn:schemas-microsoft-com:office:office" xmlns:r="http://schemas.openxmlformats.org/officeDocument/2006/relationships" xmlns:m="http://schemas.openxmlformats.org/officeDocument/2006/math" xmlns:v="urn:schemas-microsoft-com:vml" xmlns:wp14="http://schemas.microsoft.com/office/word/2010/wordprocessingDrawing" xmlns:wp="http://schemas.openxmlformats.org/drawingml/2006/wordprocessingDrawing" xmlns:w10="urn:schemas-microsoft-com:office:word" xmlns:w="http://schemas.openxmlformats.org/wordprocessingml/2006/main" xmlns:w14="http://schemas.microsoft.com/office/word/2010/wordml" xmlns:w15="http://schemas.microsoft.com/office/word/2012/wordml" xmlns:wpg="http://schemas.microsoft.com/office/word/2010/wordprocessingGroup" xmlns:wpi="http://schemas.microsoft.com/office/word/2010/wordprocessingInk" xmlns:wne="http://schemas.microsoft.com/office/word/2006/wordml" xmlns:wps="http://schemas.microsoft.com/office/word/2010/wordprocessingShape" mc:Ignorable="w14 w15 wp14">
   <w:p>
     <w:pPr>
       <w:jc w:val="center"/>
@@ -2329,8 +2611,8 @@
 </file>
 
 <file path=word/numbering.xml><?xml version="1.0" encoding="utf-8"?>
-<w:numbering xmlns:wpc="http://schemas.microsoft.com/office/word/2010/wordprocessingCanvas" xmlns:cx="http://schemas.microsoft.com/office/drawing/2014/chartex" xmlns:cx1="http://schemas.microsoft.com/office/drawing/2015/9/8/chartex" xmlns:cx2="http://schemas.microsoft.com/office/drawing/2015/10/21/chartex" xmlns:cx3="http://schemas.microsoft.com/office/drawing/2016/5/9/chartex" xmlns:cx4="http://schemas.microsoft.com/office/drawing/2016/5/10/chartex" xmlns:cx5="http://schemas.microsoft.com/office/drawing/2016/5/11/chartex" xmlns:cx6="http://schemas.microsoft.com/office/drawing/2016/5/12/chartex" xmlns:cx7="http://schemas.microsoft.com/office/drawing/2016/5/13/chartex" xmlns:cx8="http://schemas.microsoft.com/office/drawing/2016/5/14/chartex" xmlns:mc="http://schemas.openxmlformats.org/markup-compatibility/2006" xmlns:aink="http://schemas.microsoft.com/office/drawing/2016/ink" xmlns:am3d="http://schemas.microsoft.com/office/drawing/2017/model3d" xmlns:o="urn:schemas-microsoft-com:office:office" xmlns:oel="http://schemas.microsoft.com/office/2019/extlst" xmlns:r="http://schemas.openxmlformats.org/officeDocument/2006/relationships" xmlns:m="http://schemas.openxmlformats.org/officeDocument/2006/math" xmlns:v="urn:schemas-microsoft-com:vml" xmlns:wp14="http://schemas.microsoft.com/office/word/2010/wordprocessingDrawing" xmlns:wp="http://schemas.openxmlformats.org/drawingml/2006/wordprocessingDrawing" xmlns:w10="urn:schemas-microsoft-com:office:word" xmlns:w="http://schemas.openxmlformats.org/wordprocessingml/2006/main" xmlns:w14="http://schemas.microsoft.com/office/word/2010/wordml" xmlns:w15="http://schemas.microsoft.com/office/word/2012/wordml" xmlns:w16cex="http://schemas.microsoft.com/office/word/2018/wordml/cex" xmlns:w16cid="http://schemas.microsoft.com/office/word/2016/wordml/cid" xmlns:w16="http://schemas.microsoft.com/office/word/2018/wordml" xmlns:w16du="http://schemas.microsoft.com/office/word/2023/wordml/word16du" xmlns:w16sdtdh="http://schemas.microsoft.com/office/word/2020/wordml/sdtdatahash" xmlns:w16sdtfl="http://schemas.microsoft.com/office/word/2024/wordml/sdtformatlock" xmlns:w16se="http://schemas.microsoft.com/office/word/2015/wordml/symex" xmlns:wpg="http://schemas.microsoft.com/office/word/2010/wordprocessingGroup" xmlns:wpi="http://schemas.microsoft.com/office/word/2010/wordprocessingInk" xmlns:wne="http://schemas.microsoft.com/office/word/2006/wordml" xmlns:wps="http://schemas.microsoft.com/office/word/2010/wordprocessingShape" mc:Ignorable="w14 w15 w16se w16cid w16 w16cex w16sdtdh w16sdtfl w16du wp14">
-  <w:abstractNum w:abstractNumId="0" w15:restartNumberingAfterBreak="0">
+<w:numbering xmlns:wpc="http://schemas.microsoft.com/office/word/2010/wordprocessingCanvas" xmlns:mc="http://schemas.openxmlformats.org/markup-compatibility/2006" xmlns:o="urn:schemas-microsoft-com:office:office" xmlns:r="http://schemas.openxmlformats.org/officeDocument/2006/relationships" xmlns:m="http://schemas.openxmlformats.org/officeDocument/2006/math" xmlns:v="urn:schemas-microsoft-com:vml" xmlns:wp14="http://schemas.microsoft.com/office/word/2010/wordprocessingDrawing" xmlns:wp="http://schemas.openxmlformats.org/drawingml/2006/wordprocessingDrawing" xmlns:w10="urn:schemas-microsoft-com:office:word" xmlns:w="http://schemas.openxmlformats.org/wordprocessingml/2006/main" xmlns:w14="http://schemas.microsoft.com/office/word/2010/wordml" xmlns:w15="http://schemas.microsoft.com/office/word/2012/wordml" xmlns:wpg="http://schemas.microsoft.com/office/word/2010/wordprocessingGroup" xmlns:wpi="http://schemas.microsoft.com/office/word/2010/wordprocessingInk" xmlns:wne="http://schemas.microsoft.com/office/word/2006/wordml" xmlns:wps="http://schemas.microsoft.com/office/word/2010/wordprocessingShape" mc:Ignorable="w14 w15 wp14">
+  <w:abstractNum w:abstractNumId="0">
     <w:nsid w:val="006718BD"/>
     <w:multiLevelType w:val="multilevel"/>
     <w:tmpl w:val="8E307472"/>
@@ -2446,7 +2728,7 @@
       </w:rPr>
     </w:lvl>
   </w:abstractNum>
-  <w:abstractNum w:abstractNumId="1" w15:restartNumberingAfterBreak="0">
+  <w:abstractNum w:abstractNumId="1">
     <w:nsid w:val="014D0D2B"/>
     <w:multiLevelType w:val="multilevel"/>
     <w:tmpl w:val="9588E7FE"/>
@@ -2559,7 +2841,7 @@
       </w:rPr>
     </w:lvl>
   </w:abstractNum>
-  <w:abstractNum w:abstractNumId="2" w15:restartNumberingAfterBreak="0">
+  <w:abstractNum w:abstractNumId="2">
     <w:nsid w:val="06D96502"/>
     <w:multiLevelType w:val="multilevel"/>
     <w:tmpl w:val="B8E2599E"/>
@@ -2672,7 +2954,7 @@
       </w:rPr>
     </w:lvl>
   </w:abstractNum>
-  <w:abstractNum w:abstractNumId="3" w15:restartNumberingAfterBreak="0">
+  <w:abstractNum w:abstractNumId="3">
     <w:nsid w:val="0BA61FC5"/>
     <w:multiLevelType w:val="multilevel"/>
     <w:tmpl w:val="01B2802C"/>
@@ -2788,7 +3070,7 @@
       </w:rPr>
     </w:lvl>
   </w:abstractNum>
-  <w:abstractNum w:abstractNumId="4" w15:restartNumberingAfterBreak="0">
+  <w:abstractNum w:abstractNumId="4">
     <w:nsid w:val="1A4A501D"/>
     <w:multiLevelType w:val="multilevel"/>
     <w:tmpl w:val="69AE9F64"/>
@@ -2904,7 +3186,7 @@
       </w:rPr>
     </w:lvl>
   </w:abstractNum>
-  <w:abstractNum w:abstractNumId="5" w15:restartNumberingAfterBreak="0">
+  <w:abstractNum w:abstractNumId="5">
     <w:nsid w:val="221704D4"/>
     <w:multiLevelType w:val="multilevel"/>
     <w:tmpl w:val="E790014E"/>
@@ -3020,7 +3302,7 @@
       </w:rPr>
     </w:lvl>
   </w:abstractNum>
-  <w:abstractNum w:abstractNumId="6" w15:restartNumberingAfterBreak="0">
+  <w:abstractNum w:abstractNumId="6">
     <w:nsid w:val="23B22F64"/>
     <w:multiLevelType w:val="multilevel"/>
     <w:tmpl w:val="D8C24BB4"/>
@@ -3133,7 +3415,7 @@
       </w:rPr>
     </w:lvl>
   </w:abstractNum>
-  <w:abstractNum w:abstractNumId="7" w15:restartNumberingAfterBreak="0">
+  <w:abstractNum w:abstractNumId="7">
     <w:nsid w:val="25A15D6C"/>
     <w:multiLevelType w:val="multilevel"/>
     <w:tmpl w:val="6268C890"/>
@@ -3246,7 +3528,7 @@
       </w:rPr>
     </w:lvl>
   </w:abstractNum>
-  <w:abstractNum w:abstractNumId="8" w15:restartNumberingAfterBreak="0">
+  <w:abstractNum w:abstractNumId="8">
     <w:nsid w:val="29C945CD"/>
     <w:multiLevelType w:val="multilevel"/>
     <w:tmpl w:val="1B608FA8"/>
@@ -3359,7 +3641,7 @@
       </w:rPr>
     </w:lvl>
   </w:abstractNum>
-  <w:abstractNum w:abstractNumId="9" w15:restartNumberingAfterBreak="0">
+  <w:abstractNum w:abstractNumId="9">
     <w:nsid w:val="2F4F206F"/>
     <w:multiLevelType w:val="multilevel"/>
     <w:tmpl w:val="0C88381E"/>
@@ -3472,7 +3754,7 @@
       </w:rPr>
     </w:lvl>
   </w:abstractNum>
-  <w:abstractNum w:abstractNumId="10" w15:restartNumberingAfterBreak="0">
+  <w:abstractNum w:abstractNumId="10">
     <w:nsid w:val="367742E0"/>
     <w:multiLevelType w:val="multilevel"/>
     <w:tmpl w:val="86086F46"/>
@@ -3585,7 +3867,7 @@
       </w:rPr>
     </w:lvl>
   </w:abstractNum>
-  <w:abstractNum w:abstractNumId="11" w15:restartNumberingAfterBreak="0">
+  <w:abstractNum w:abstractNumId="11">
     <w:nsid w:val="40B10259"/>
     <w:multiLevelType w:val="multilevel"/>
     <w:tmpl w:val="9D429992"/>
@@ -3701,7 +3983,7 @@
       </w:rPr>
     </w:lvl>
   </w:abstractNum>
-  <w:abstractNum w:abstractNumId="12" w15:restartNumberingAfterBreak="0">
+  <w:abstractNum w:abstractNumId="12">
     <w:nsid w:val="4E001E1C"/>
     <w:multiLevelType w:val="multilevel"/>
     <w:tmpl w:val="8EA60A92"/>
@@ -3817,7 +4099,120 @@
       </w:rPr>
     </w:lvl>
   </w:abstractNum>
-  <w:abstractNum w:abstractNumId="13" w15:restartNumberingAfterBreak="0">
+  <w:abstractNum w:abstractNumId="13">
+    <w:nsid w:val="4FD45144"/>
+    <w:multiLevelType w:val="hybridMultilevel"/>
+    <w:tmpl w:val="EB6ACBC8"/>
+    <w:lvl w:ilvl="0" w:tplc="62585E74">
+      <w:numFmt w:val="bullet"/>
+      <w:lvlText w:val=""/>
+      <w:lvlJc w:val="left"/>
+      <w:pPr>
+        <w:ind w:left="926" w:hanging="360"/>
+      </w:pPr>
+      <w:rPr>
+        <w:rFonts w:ascii="Wingdings" w:eastAsia="Courier New" w:hAnsi="Wingdings" w:cs="Courier New" w:hint="default"/>
+        <w:b w:val="0"/>
+      </w:rPr>
+    </w:lvl>
+    <w:lvl w:ilvl="1" w:tplc="04160003" w:tentative="1">
+      <w:start w:val="1"/>
+      <w:numFmt w:val="bullet"/>
+      <w:lvlText w:val="o"/>
+      <w:lvlJc w:val="left"/>
+      <w:pPr>
+        <w:ind w:left="1646" w:hanging="360"/>
+      </w:pPr>
+      <w:rPr>
+        <w:rFonts w:ascii="Courier New" w:hAnsi="Courier New" w:cs="Courier New" w:hint="default"/>
+      </w:rPr>
+    </w:lvl>
+    <w:lvl w:ilvl="2" w:tplc="04160005" w:tentative="1">
+      <w:start w:val="1"/>
+      <w:numFmt w:val="bullet"/>
+      <w:lvlText w:val=""/>
+      <w:lvlJc w:val="left"/>
+      <w:pPr>
+        <w:ind w:left="2366" w:hanging="360"/>
+      </w:pPr>
+      <w:rPr>
+        <w:rFonts w:ascii="Wingdings" w:hAnsi="Wingdings" w:hint="default"/>
+      </w:rPr>
+    </w:lvl>
+    <w:lvl w:ilvl="3" w:tplc="04160001" w:tentative="1">
+      <w:start w:val="1"/>
+      <w:numFmt w:val="bullet"/>
+      <w:lvlText w:val=""/>
+      <w:lvlJc w:val="left"/>
+      <w:pPr>
+        <w:ind w:left="3086" w:hanging="360"/>
+      </w:pPr>
+      <w:rPr>
+        <w:rFonts w:ascii="Symbol" w:hAnsi="Symbol" w:hint="default"/>
+      </w:rPr>
+    </w:lvl>
+    <w:lvl w:ilvl="4" w:tplc="04160003" w:tentative="1">
+      <w:start w:val="1"/>
+      <w:numFmt w:val="bullet"/>
+      <w:lvlText w:val="o"/>
+      <w:lvlJc w:val="left"/>
+      <w:pPr>
+        <w:ind w:left="3806" w:hanging="360"/>
+      </w:pPr>
+      <w:rPr>
+        <w:rFonts w:ascii="Courier New" w:hAnsi="Courier New" w:cs="Courier New" w:hint="default"/>
+      </w:rPr>
+    </w:lvl>
+    <w:lvl w:ilvl="5" w:tplc="04160005" w:tentative="1">
+      <w:start w:val="1"/>
+      <w:numFmt w:val="bullet"/>
+      <w:lvlText w:val=""/>
+      <w:lvlJc w:val="left"/>
+      <w:pPr>
+        <w:ind w:left="4526" w:hanging="360"/>
+      </w:pPr>
+      <w:rPr>
+        <w:rFonts w:ascii="Wingdings" w:hAnsi="Wingdings" w:hint="default"/>
+      </w:rPr>
+    </w:lvl>
+    <w:lvl w:ilvl="6" w:tplc="04160001" w:tentative="1">
+      <w:start w:val="1"/>
+      <w:numFmt w:val="bullet"/>
+      <w:lvlText w:val=""/>
+      <w:lvlJc w:val="left"/>
+      <w:pPr>
+        <w:ind w:left="5246" w:hanging="360"/>
+      </w:pPr>
+      <w:rPr>
+        <w:rFonts w:ascii="Symbol" w:hAnsi="Symbol" w:hint="default"/>
+      </w:rPr>
+    </w:lvl>
+    <w:lvl w:ilvl="7" w:tplc="04160003" w:tentative="1">
+      <w:start w:val="1"/>
+      <w:numFmt w:val="bullet"/>
+      <w:lvlText w:val="o"/>
+      <w:lvlJc w:val="left"/>
+      <w:pPr>
+        <w:ind w:left="5966" w:hanging="360"/>
+      </w:pPr>
+      <w:rPr>
+        <w:rFonts w:ascii="Courier New" w:hAnsi="Courier New" w:cs="Courier New" w:hint="default"/>
+      </w:rPr>
+    </w:lvl>
+    <w:lvl w:ilvl="8" w:tplc="04160005" w:tentative="1">
+      <w:start w:val="1"/>
+      <w:numFmt w:val="bullet"/>
+      <w:lvlText w:val=""/>
+      <w:lvlJc w:val="left"/>
+      <w:pPr>
+        <w:ind w:left="6686" w:hanging="360"/>
+      </w:pPr>
+      <w:rPr>
+        <w:rFonts w:ascii="Wingdings" w:hAnsi="Wingdings" w:hint="default"/>
+      </w:rPr>
+    </w:lvl>
+  </w:abstractNum>
+  <w:abstractNum w:abstractNumId="14">
     <w:nsid w:val="521F3E72"/>
     <w:multiLevelType w:val="multilevel"/>
     <w:tmpl w:val="BA7A5262"/>
@@ -3930,7 +4325,7 @@
       </w:rPr>
     </w:lvl>
   </w:abstractNum>
-  <w:abstractNum w:abstractNumId="14" w15:restartNumberingAfterBreak="0">
+  <w:abstractNum w:abstractNumId="15">
     <w:nsid w:val="581A2719"/>
     <w:multiLevelType w:val="multilevel"/>
     <w:tmpl w:val="5C4EA08C"/>
@@ -4043,7 +4438,7 @@
       </w:rPr>
     </w:lvl>
   </w:abstractNum>
-  <w:abstractNum w:abstractNumId="15" w15:restartNumberingAfterBreak="0">
+  <w:abstractNum w:abstractNumId="16">
     <w:nsid w:val="599031E6"/>
     <w:multiLevelType w:val="multilevel"/>
     <w:tmpl w:val="064CCBA2"/>
@@ -4159,7 +4554,7 @@
       </w:rPr>
     </w:lvl>
   </w:abstractNum>
-  <w:abstractNum w:abstractNumId="16" w15:restartNumberingAfterBreak="0">
+  <w:abstractNum w:abstractNumId="17">
     <w:nsid w:val="5DD1588E"/>
     <w:multiLevelType w:val="multilevel"/>
     <w:tmpl w:val="26BA343A"/>
@@ -4272,7 +4667,7 @@
       </w:rPr>
     </w:lvl>
   </w:abstractNum>
-  <w:abstractNum w:abstractNumId="17" w15:restartNumberingAfterBreak="0">
+  <w:abstractNum w:abstractNumId="18">
     <w:nsid w:val="62BE5493"/>
     <w:multiLevelType w:val="multilevel"/>
     <w:tmpl w:val="92C655FE"/>
@@ -4388,7 +4783,7 @@
       </w:rPr>
     </w:lvl>
   </w:abstractNum>
-  <w:abstractNum w:abstractNumId="18" w15:restartNumberingAfterBreak="0">
+  <w:abstractNum w:abstractNumId="19">
     <w:nsid w:val="65497669"/>
     <w:multiLevelType w:val="multilevel"/>
     <w:tmpl w:val="F8904A20"/>
@@ -4501,7 +4896,7 @@
       </w:rPr>
     </w:lvl>
   </w:abstractNum>
-  <w:abstractNum w:abstractNumId="19" w15:restartNumberingAfterBreak="0">
+  <w:abstractNum w:abstractNumId="20">
     <w:nsid w:val="6AF4727F"/>
     <w:multiLevelType w:val="multilevel"/>
     <w:tmpl w:val="8DEAB65C"/>
@@ -4617,7 +5012,7 @@
       </w:rPr>
     </w:lvl>
   </w:abstractNum>
-  <w:abstractNum w:abstractNumId="20" w15:restartNumberingAfterBreak="0">
+  <w:abstractNum w:abstractNumId="21">
     <w:nsid w:val="6BF27891"/>
     <w:multiLevelType w:val="multilevel"/>
     <w:tmpl w:val="4D94A9DC"/>
@@ -4733,7 +5128,7 @@
       </w:rPr>
     </w:lvl>
   </w:abstractNum>
-  <w:abstractNum w:abstractNumId="21" w15:restartNumberingAfterBreak="0">
+  <w:abstractNum w:abstractNumId="22">
     <w:nsid w:val="732F29B8"/>
     <w:multiLevelType w:val="multilevel"/>
     <w:tmpl w:val="758C1FA2"/>
@@ -4849,7 +5244,7 @@
       </w:rPr>
     </w:lvl>
   </w:abstractNum>
-  <w:abstractNum w:abstractNumId="22" w15:restartNumberingAfterBreak="0">
+  <w:abstractNum w:abstractNumId="23">
     <w:nsid w:val="767E1F28"/>
     <w:multiLevelType w:val="multilevel"/>
     <w:tmpl w:val="E940EE40"/>
@@ -4965,7 +5360,7 @@
       </w:rPr>
     </w:lvl>
   </w:abstractNum>
-  <w:abstractNum w:abstractNumId="23" w15:restartNumberingAfterBreak="0">
+  <w:abstractNum w:abstractNumId="24">
     <w:nsid w:val="7DD76EA1"/>
     <w:multiLevelType w:val="multilevel"/>
     <w:tmpl w:val="CC162778"/>
@@ -5081,83 +5476,86 @@
       </w:rPr>
     </w:lvl>
   </w:abstractNum>
-  <w:num w:numId="1" w16cid:durableId="1954285802">
+  <w:num w:numId="1">
     <w:abstractNumId w:val="6"/>
   </w:num>
-  <w:num w:numId="2" w16cid:durableId="1865552330">
+  <w:num w:numId="2">
     <w:abstractNumId w:val="12"/>
   </w:num>
-  <w:num w:numId="3" w16cid:durableId="91360664">
+  <w:num w:numId="3">
+    <w:abstractNumId w:val="24"/>
+  </w:num>
+  <w:num w:numId="4">
+    <w:abstractNumId w:val="8"/>
+  </w:num>
+  <w:num w:numId="5">
+    <w:abstractNumId w:val="4"/>
+  </w:num>
+  <w:num w:numId="6">
+    <w:abstractNumId w:val="0"/>
+  </w:num>
+  <w:num w:numId="7">
+    <w:abstractNumId w:val="7"/>
+  </w:num>
+  <w:num w:numId="8">
+    <w:abstractNumId w:val="20"/>
+  </w:num>
+  <w:num w:numId="9">
+    <w:abstractNumId w:val="17"/>
+  </w:num>
+  <w:num w:numId="10">
+    <w:abstractNumId w:val="19"/>
+  </w:num>
+  <w:num w:numId="11">
+    <w:abstractNumId w:val="15"/>
+  </w:num>
+  <w:num w:numId="12">
+    <w:abstractNumId w:val="10"/>
+  </w:num>
+  <w:num w:numId="13">
+    <w:abstractNumId w:val="2"/>
+  </w:num>
+  <w:num w:numId="14">
+    <w:abstractNumId w:val="11"/>
+  </w:num>
+  <w:num w:numId="15">
+    <w:abstractNumId w:val="3"/>
+  </w:num>
+  <w:num w:numId="16">
+    <w:abstractNumId w:val="21"/>
+  </w:num>
+  <w:num w:numId="17">
+    <w:abstractNumId w:val="16"/>
+  </w:num>
+  <w:num w:numId="18">
+    <w:abstractNumId w:val="18"/>
+  </w:num>
+  <w:num w:numId="19">
+    <w:abstractNumId w:val="5"/>
+  </w:num>
+  <w:num w:numId="20">
+    <w:abstractNumId w:val="14"/>
+  </w:num>
+  <w:num w:numId="21">
+    <w:abstractNumId w:val="9"/>
+  </w:num>
+  <w:num w:numId="22">
+    <w:abstractNumId w:val="1"/>
+  </w:num>
+  <w:num w:numId="23">
+    <w:abstractNumId w:val="22"/>
+  </w:num>
+  <w:num w:numId="24">
     <w:abstractNumId w:val="23"/>
   </w:num>
-  <w:num w:numId="4" w16cid:durableId="2037584998">
-    <w:abstractNumId w:val="8"/>
-  </w:num>
-  <w:num w:numId="5" w16cid:durableId="804928646">
-    <w:abstractNumId w:val="4"/>
-  </w:num>
-  <w:num w:numId="6" w16cid:durableId="193272748">
-    <w:abstractNumId w:val="0"/>
-  </w:num>
-  <w:num w:numId="7" w16cid:durableId="1002850815">
-    <w:abstractNumId w:val="7"/>
-  </w:num>
-  <w:num w:numId="8" w16cid:durableId="207883238">
-    <w:abstractNumId w:val="19"/>
-  </w:num>
-  <w:num w:numId="9" w16cid:durableId="176240538">
-    <w:abstractNumId w:val="16"/>
-  </w:num>
-  <w:num w:numId="10" w16cid:durableId="2052606034">
-    <w:abstractNumId w:val="18"/>
-  </w:num>
-  <w:num w:numId="11" w16cid:durableId="1701515058">
-    <w:abstractNumId w:val="14"/>
-  </w:num>
-  <w:num w:numId="12" w16cid:durableId="48313096">
-    <w:abstractNumId w:val="10"/>
-  </w:num>
-  <w:num w:numId="13" w16cid:durableId="37097688">
-    <w:abstractNumId w:val="2"/>
-  </w:num>
-  <w:num w:numId="14" w16cid:durableId="839346070">
-    <w:abstractNumId w:val="11"/>
-  </w:num>
-  <w:num w:numId="15" w16cid:durableId="1256092310">
-    <w:abstractNumId w:val="3"/>
-  </w:num>
-  <w:num w:numId="16" w16cid:durableId="2146655569">
-    <w:abstractNumId w:val="20"/>
-  </w:num>
-  <w:num w:numId="17" w16cid:durableId="969287393">
-    <w:abstractNumId w:val="15"/>
-  </w:num>
-  <w:num w:numId="18" w16cid:durableId="1377121269">
-    <w:abstractNumId w:val="17"/>
-  </w:num>
-  <w:num w:numId="19" w16cid:durableId="1043091186">
-    <w:abstractNumId w:val="5"/>
-  </w:num>
-  <w:num w:numId="20" w16cid:durableId="54135274">
+  <w:num w:numId="25">
     <w:abstractNumId w:val="13"/>
-  </w:num>
-  <w:num w:numId="21" w16cid:durableId="2037193785">
-    <w:abstractNumId w:val="9"/>
-  </w:num>
-  <w:num w:numId="22" w16cid:durableId="1407190391">
-    <w:abstractNumId w:val="1"/>
-  </w:num>
-  <w:num w:numId="23" w16cid:durableId="1673727312">
-    <w:abstractNumId w:val="21"/>
-  </w:num>
-  <w:num w:numId="24" w16cid:durableId="581069680">
-    <w:abstractNumId w:val="22"/>
   </w:num>
 </w:numbering>
 </file>
 
 <file path=word/styles.xml><?xml version="1.0" encoding="utf-8"?>
-<w:styles xmlns:mc="http://schemas.openxmlformats.org/markup-compatibility/2006" xmlns:r="http://schemas.openxmlformats.org/officeDocument/2006/relationships" xmlns:w="http://schemas.openxmlformats.org/wordprocessingml/2006/main" xmlns:w14="http://schemas.microsoft.com/office/word/2010/wordml" xmlns:w15="http://schemas.microsoft.com/office/word/2012/wordml" xmlns:w16cex="http://schemas.microsoft.com/office/word/2018/wordml/cex" xmlns:w16cid="http://schemas.microsoft.com/office/word/2016/wordml/cid" xmlns:w16="http://schemas.microsoft.com/office/word/2018/wordml" xmlns:w16du="http://schemas.microsoft.com/office/word/2023/wordml/word16du" xmlns:w16sdtdh="http://schemas.microsoft.com/office/word/2020/wordml/sdtdatahash" xmlns:w16sdtfl="http://schemas.microsoft.com/office/word/2024/wordml/sdtformatlock" xmlns:w16se="http://schemas.microsoft.com/office/word/2015/wordml/symex" mc:Ignorable="w14 w15 w16se w16cid w16 w16cex w16sdtdh w16sdtfl w16du">
+<w:styles xmlns:mc="http://schemas.openxmlformats.org/markup-compatibility/2006" xmlns:r="http://schemas.openxmlformats.org/officeDocument/2006/relationships" xmlns:w="http://schemas.openxmlformats.org/wordprocessingml/2006/main" xmlns:w14="http://schemas.microsoft.com/office/word/2010/wordml" xmlns:w15="http://schemas.microsoft.com/office/word/2012/wordml" mc:Ignorable="w14 w15">
   <w:docDefaults>
     <w:rPrDefault>
       <w:rPr>
@@ -5173,7 +5571,7 @@
       </w:pPr>
     </w:pPrDefault>
   </w:docDefaults>
-  <w:latentStyles w:defLockedState="0" w:defUIPriority="99" w:defSemiHidden="0" w:defUnhideWhenUsed="0" w:defQFormat="0" w:count="376">
+  <w:latentStyles w:defLockedState="0" w:defUIPriority="99" w:defSemiHidden="0" w:defUnhideWhenUsed="0" w:defQFormat="0" w:count="371">
     <w:lsdException w:name="Normal" w:uiPriority="0" w:qFormat="1"/>
     <w:lsdException w:name="heading 1" w:uiPriority="9" w:qFormat="1"/>
     <w:lsdException w:name="heading 2" w:semiHidden="1" w:uiPriority="9" w:unhideWhenUsed="1" w:qFormat="1"/>
@@ -5545,11 +5943,6 @@
     <w:lsdException w:name="List Table 5 Dark Accent 6" w:uiPriority="50"/>
     <w:lsdException w:name="List Table 6 Colorful Accent 6" w:uiPriority="51"/>
     <w:lsdException w:name="List Table 7 Colorful Accent 6" w:uiPriority="52"/>
-    <w:lsdException w:name="Mention" w:semiHidden="1" w:unhideWhenUsed="1"/>
-    <w:lsdException w:name="Smart Hyperlink" w:semiHidden="1" w:unhideWhenUsed="1"/>
-    <w:lsdException w:name="Hashtag" w:semiHidden="1" w:unhideWhenUsed="1"/>
-    <w:lsdException w:name="Unresolved Mention" w:semiHidden="1" w:unhideWhenUsed="1"/>
-    <w:lsdException w:name="Smart Link" w:semiHidden="1" w:unhideWhenUsed="1"/>
   </w:latentStyles>
   <w:style w:type="paragraph" w:default="1" w:styleId="Normal">
     <w:name w:val="Normal"/>

</xml_diff>

<commit_message>
docs(Login): Refatorado a documentação para Login
- Caso de uso atalizado;
- Diagrama de Sequência (Fase de Análise) corrigido
- Diagrama de Sequência (Fase de Projeto) corrigido
</commit_message>
<xml_diff>
--- a/docs/engenharia-software-2/casos_de_uso/Caso de uso - Login.docx
+++ b/docs/engenharia-software-2/casos_de_uso/Caso de uso - Login.docx
@@ -100,13 +100,7 @@
         <w:rPr>
           <w:rFonts w:ascii="Courier New" w:eastAsia="Courier New" w:hAnsi="Courier New" w:cs="Courier New"/>
         </w:rPr>
-        <w:t>s caixas de texto</w:t>
-      </w:r>
-      <w:r>
-        <w:rPr>
-          <w:rFonts w:ascii="Courier New" w:eastAsia="Courier New" w:hAnsi="Courier New" w:cs="Courier New"/>
-        </w:rPr>
-        <w:t>;</w:t>
+        <w:t>s caixas de texto;</w:t>
       </w:r>
     </w:p>
     <w:p>
@@ -139,7 +133,19 @@
         <w:rPr>
           <w:rFonts w:ascii="Courier New" w:eastAsia="Courier New" w:hAnsi="Courier New" w:cs="Courier New"/>
         </w:rPr>
-        <w:t xml:space="preserve">Aluno(ator) pressiona o botão “ENTER” na </w:t>
+        <w:t>Aluno(ator) pressiona o botão “</w:t>
+      </w:r>
+      <w:r>
+        <w:rPr>
+          <w:rFonts w:ascii="Courier New" w:eastAsia="Courier New" w:hAnsi="Courier New" w:cs="Courier New"/>
+        </w:rPr>
+        <w:t>ENTRAR</w:t>
+      </w:r>
+      <w:r>
+        <w:rPr>
+          <w:rFonts w:ascii="Courier New" w:eastAsia="Courier New" w:hAnsi="Courier New" w:cs="Courier New"/>
+        </w:rPr>
+        <w:t xml:space="preserve">” na </w:t>
       </w:r>
       <w:proofErr w:type="spellStart"/>
       <w:r>
@@ -175,13 +181,7 @@
         <w:rPr>
           <w:rFonts w:ascii="Courier New" w:eastAsia="Courier New" w:hAnsi="Courier New" w:cs="Courier New"/>
         </w:rPr>
-        <w:t>Usuário pressiona o botão “ENTRAR</w:t>
-      </w:r>
-      <w:r>
-        <w:rPr>
-          <w:rFonts w:ascii="Courier New" w:eastAsia="Courier New" w:hAnsi="Courier New" w:cs="Courier New"/>
-        </w:rPr>
-        <w:t>”;</w:t>
+        <w:t>Usuário pressiona o botão “ENTRAR”;</w:t>
       </w:r>
     </w:p>
     <w:p>
@@ -335,19 +335,11 @@
           <w:bCs/>
         </w:rPr>
       </w:pPr>
-      <w:proofErr w:type="gramStart"/>
-      <w:r>
-        <w:rPr>
-          <w:rFonts w:ascii="Courier New" w:eastAsia="Courier New" w:hAnsi="Courier New" w:cs="Courier New"/>
-        </w:rPr>
-        <w:t>Login(</w:t>
-      </w:r>
-      <w:proofErr w:type="gramEnd"/>
-      <w:r>
-        <w:rPr>
-          <w:rFonts w:ascii="Courier New" w:eastAsia="Courier New" w:hAnsi="Courier New" w:cs="Courier New"/>
-        </w:rPr>
-        <w:t xml:space="preserve">Model) chama </w:t>
+      <w:r>
+        <w:rPr>
+          <w:rFonts w:ascii="Courier New" w:eastAsia="Courier New" w:hAnsi="Courier New" w:cs="Courier New"/>
+        </w:rPr>
+        <w:t xml:space="preserve">Login(Model) chama </w:t>
       </w:r>
       <w:proofErr w:type="spellStart"/>
       <w:r>
@@ -454,13 +446,21 @@
         <w:rPr>
           <w:rFonts w:ascii="Courier New" w:eastAsia="Courier New" w:hAnsi="Courier New" w:cs="Courier New"/>
         </w:rPr>
-        <w:t>Sistema valida as informações inseridas pelo Usuário</w:t>
-      </w:r>
-      <w:r>
-        <w:rPr>
-          <w:rFonts w:ascii="Courier New" w:eastAsia="Courier New" w:hAnsi="Courier New" w:cs="Courier New"/>
-        </w:rPr>
-        <w:t>;</w:t>
+        <w:t xml:space="preserve">Sistema </w:t>
+      </w:r>
+      <w:proofErr w:type="gramStart"/>
+      <w:r>
+        <w:rPr>
+          <w:rFonts w:ascii="Courier New" w:eastAsia="Courier New" w:hAnsi="Courier New" w:cs="Courier New"/>
+        </w:rPr>
+        <w:t>autentica</w:t>
+      </w:r>
+      <w:proofErr w:type="gramEnd"/>
+      <w:r>
+        <w:rPr>
+          <w:rFonts w:ascii="Courier New" w:eastAsia="Courier New" w:hAnsi="Courier New" w:cs="Courier New"/>
+        </w:rPr>
+        <w:t xml:space="preserve"> as informações inseridas pelo Usuário;</w:t>
       </w:r>
     </w:p>
     <w:p>
@@ -679,7 +679,19 @@
         <w:rPr>
           <w:rFonts w:ascii="Courier New" w:eastAsia="Courier New" w:hAnsi="Courier New" w:cs="Courier New"/>
         </w:rPr>
-        <w:t>Banco de dados verifica as credenciais do Usuário;</w:t>
+        <w:t xml:space="preserve">Banco de dados </w:t>
+      </w:r>
+      <w:r>
+        <w:rPr>
+          <w:rFonts w:ascii="Courier New" w:eastAsia="Courier New" w:hAnsi="Courier New" w:cs="Courier New"/>
+        </w:rPr>
+        <w:t>busca</w:t>
+      </w:r>
+      <w:r>
+        <w:rPr>
+          <w:rFonts w:ascii="Courier New" w:eastAsia="Courier New" w:hAnsi="Courier New" w:cs="Courier New"/>
+        </w:rPr>
+        <w:t xml:space="preserve"> as credenciais do Usuário;</w:t>
       </w:r>
     </w:p>
     <w:p>
@@ -762,13 +774,7 @@
         <w:rPr>
           <w:rFonts w:ascii="Courier New" w:eastAsia="Courier New" w:hAnsi="Courier New" w:cs="Courier New"/>
         </w:rPr>
-        <w:t>Sistema redireciona Usuário para sua tela principal</w:t>
-      </w:r>
-      <w:r>
-        <w:rPr>
-          <w:rFonts w:ascii="Courier New" w:eastAsia="Courier New" w:hAnsi="Courier New" w:cs="Courier New"/>
-        </w:rPr>
-        <w:t>;</w:t>
+        <w:t>Sistema redireciona Usuário para sua tela principal;</w:t>
       </w:r>
     </w:p>
     <w:p>
@@ -869,19 +875,7 @@
         <w:rPr>
           <w:rFonts w:ascii="Courier New" w:eastAsia="Courier New" w:hAnsi="Courier New" w:cs="Courier New"/>
         </w:rPr>
-        <w:t xml:space="preserve"> de </w:t>
-      </w:r>
-      <w:r>
-        <w:rPr>
-          <w:rFonts w:ascii="Courier New" w:eastAsia="Courier New" w:hAnsi="Courier New" w:cs="Courier New"/>
-        </w:rPr>
-        <w:t>negado</w:t>
-      </w:r>
-      <w:r>
-        <w:rPr>
-          <w:rFonts w:ascii="Courier New" w:eastAsia="Courier New" w:hAnsi="Courier New" w:cs="Courier New"/>
-        </w:rPr>
-        <w:t xml:space="preserve"> para </w:t>
+        <w:t xml:space="preserve"> de negado para </w:t>
       </w:r>
       <w:proofErr w:type="gramStart"/>
       <w:r>
@@ -1094,13 +1088,7 @@
         <w:rPr>
           <w:rFonts w:ascii="Courier New" w:eastAsia="Courier New" w:hAnsi="Courier New" w:cs="Courier New"/>
         </w:rPr>
-        <w:t>Sistema redireciona Usuário de volta para a tela de login</w:t>
-      </w:r>
-      <w:r>
-        <w:rPr>
-          <w:rFonts w:ascii="Courier New" w:eastAsia="Courier New" w:hAnsi="Courier New" w:cs="Courier New"/>
-        </w:rPr>
-        <w:t>;</w:t>
+        <w:t>Sistema redireciona Usuário de volta para a tela de login;</w:t>
       </w:r>
     </w:p>
     <w:p>
@@ -1117,13 +1105,7 @@
         <w:pStyle w:val="Ttulo"/>
       </w:pPr>
       <w:r>
-        <w:t>Fluxo Alternativo I</w:t>
-      </w:r>
-      <w:r>
-        <w:t>I</w:t>
-      </w:r>
-      <w:r>
-        <w:t xml:space="preserve"> (9)</w:t>
+        <w:t>Fluxo Alternativo II (9)</w:t>
       </w:r>
     </w:p>
     <w:p>
@@ -1391,7 +1373,7 @@
         <w:ind w:left="-1417" w:right="-1113"/>
         <w:jc w:val="center"/>
         <w:rPr>
-          <w:rFonts w:ascii="Courier New" w:eastAsia="Courier New" w:hAnsi="Courier New" w:cs="Courier New"/>
+          <w:noProof/>
         </w:rPr>
       </w:pPr>
       <w:r>
@@ -1402,13 +1384,13 @@
         <mc:AlternateContent>
           <mc:Choice Requires="wps">
             <w:drawing>
-              <wp:anchor distT="0" distB="0" distL="114300" distR="114300" simplePos="0" relativeHeight="251662336" behindDoc="0" locked="0" layoutInCell="1" allowOverlap="1" wp14:anchorId="43CF4892" wp14:editId="2428FBD7">
+              <wp:anchor distT="0" distB="0" distL="114300" distR="114300" simplePos="0" relativeHeight="251662336" behindDoc="0" locked="0" layoutInCell="1" allowOverlap="1" wp14:anchorId="43CF4892" wp14:editId="37781474">
                 <wp:simplePos x="0" y="0"/>
                 <wp:positionH relativeFrom="margin">
-                  <wp:posOffset>3405505</wp:posOffset>
+                  <wp:posOffset>3386455</wp:posOffset>
                 </wp:positionH>
                 <wp:positionV relativeFrom="paragraph">
-                  <wp:posOffset>2969260</wp:posOffset>
+                  <wp:posOffset>2797810</wp:posOffset>
                 </wp:positionV>
                 <wp:extent cx="876300" cy="971550"/>
                 <wp:effectExtent l="57150" t="38100" r="57150" b="76200"/>
@@ -1463,11 +1445,11 @@
           </mc:Choice>
           <mc:Fallback>
             <w:pict>
-              <v:shapetype w14:anchorId="28AB3BE5" id="_x0000_t32" coordsize="21600,21600" o:spt="32" o:oned="t" path="m,l21600,21600e" filled="f">
+              <v:shapetype w14:anchorId="015AFD34" id="_x0000_t32" coordsize="21600,21600" o:spt="32" o:oned="t" path="m,l21600,21600e" filled="f">
                 <v:path arrowok="t" fillok="f" o:connecttype="none"/>
                 <o:lock v:ext="edit" shapetype="t"/>
               </v:shapetype>
-              <v:shape id="Conector de Seta Reta 1" o:spid="_x0000_s1026" type="#_x0000_t32" style="position:absolute;margin-left:268.15pt;margin-top:233.8pt;width:69pt;height:76.5pt;flip:x y;z-index:251662336;visibility:visible;mso-wrap-style:square;mso-width-percent:0;mso-height-percent:0;mso-wrap-distance-left:9pt;mso-wrap-distance-top:0;mso-wrap-distance-right:9pt;mso-wrap-distance-bottom:0;mso-position-horizontal:absolute;mso-position-horizontal-relative:margin;mso-position-vertical:absolute;mso-position-vertical-relative:text;mso-width-percent:0;mso-height-percent:0;mso-width-relative:margin;mso-height-relative:margin" o:gfxdata="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" strokecolor="#e00" strokeweight="3pt">
+              <v:shape id="Conector de Seta Reta 1" o:spid="_x0000_s1026" type="#_x0000_t32" style="position:absolute;margin-left:266.65pt;margin-top:220.3pt;width:69pt;height:76.5pt;flip:x y;z-index:251662336;visibility:visible;mso-wrap-style:square;mso-width-percent:0;mso-height-percent:0;mso-wrap-distance-left:9pt;mso-wrap-distance-top:0;mso-wrap-distance-right:9pt;mso-wrap-distance-bottom:0;mso-position-horizontal:absolute;mso-position-horizontal-relative:margin;mso-position-vertical:absolute;mso-position-vertical-relative:text;mso-width-percent:0;mso-height-percent:0;mso-width-relative:margin;mso-height-relative:margin" o:gfxdata="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" strokecolor="#e00" strokeweight="3pt">
                 <v:stroke endarrow="block"/>
                 <v:shadow on="t" color="black" opacity="22937f" origin=",.5" offset="0,.63889mm"/>
                 <w10:wrap anchorx="margin"/>
@@ -1484,13 +1466,13 @@
         <mc:AlternateContent>
           <mc:Choice Requires="wps">
             <w:drawing>
-              <wp:anchor distT="0" distB="0" distL="114300" distR="114300" simplePos="0" relativeHeight="251663360" behindDoc="0" locked="0" layoutInCell="1" allowOverlap="1" wp14:anchorId="1B52AECB" wp14:editId="6EAC1053">
+              <wp:anchor distT="0" distB="0" distL="114300" distR="114300" simplePos="0" relativeHeight="251663360" behindDoc="0" locked="0" layoutInCell="1" allowOverlap="1" wp14:anchorId="1B52AECB" wp14:editId="7708FF43">
                 <wp:simplePos x="0" y="0"/>
                 <wp:positionH relativeFrom="column">
-                  <wp:posOffset>2310130</wp:posOffset>
+                  <wp:posOffset>2291080</wp:posOffset>
                 </wp:positionH>
                 <wp:positionV relativeFrom="paragraph">
-                  <wp:posOffset>2369185</wp:posOffset>
+                  <wp:posOffset>2197735</wp:posOffset>
                 </wp:positionV>
                 <wp:extent cx="1143000" cy="752475"/>
                 <wp:effectExtent l="76200" t="38100" r="57150" b="104775"/>
@@ -1544,7 +1526,7 @@
           </mc:Choice>
           <mc:Fallback>
             <w:pict>
-              <v:oval w14:anchorId="4BFABFB8" id="Elipse 2" o:spid="_x0000_s1026" style="position:absolute;margin-left:181.9pt;margin-top:186.55pt;width:90pt;height:59.25pt;z-index:251663360;visibility:visible;mso-wrap-style:square;mso-wrap-distance-left:9pt;mso-wrap-distance-top:0;mso-wrap-distance-right:9pt;mso-wrap-distance-bottom:0;mso-position-horizontal:absolute;mso-position-horizontal-relative:text;mso-position-vertical:absolute;mso-position-vertical-relative:text;v-text-anchor:middle" o:gfxdata="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" filled="f" strokecolor="#e00" strokeweight="3pt">
+              <v:oval w14:anchorId="613EC7B5" id="Elipse 2" o:spid="_x0000_s1026" style="position:absolute;margin-left:180.4pt;margin-top:173.05pt;width:90pt;height:59.25pt;z-index:251663360;visibility:visible;mso-wrap-style:square;mso-wrap-distance-left:9pt;mso-wrap-distance-top:0;mso-wrap-distance-right:9pt;mso-wrap-distance-bottom:0;mso-position-horizontal:absolute;mso-position-horizontal-relative:text;mso-position-vertical:absolute;mso-position-vertical-relative:text;v-text-anchor:middle" o:gfxdata="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" filled="f" strokecolor="#e00" strokeweight="3pt">
                 <v:shadow on="t" color="black" opacity="22937f" origin=",.5" offset="0,.63889mm"/>
               </v:oval>
             </w:pict>
@@ -1559,13 +1541,13 @@
         <mc:AlternateContent>
           <mc:Choice Requires="wps">
             <w:drawing>
-              <wp:anchor distT="0" distB="0" distL="114300" distR="114300" simplePos="0" relativeHeight="251659264" behindDoc="0" locked="0" layoutInCell="1" allowOverlap="1" wp14:anchorId="6027BD88" wp14:editId="5FECCC8E">
+              <wp:anchor distT="0" distB="0" distL="114300" distR="114300" simplePos="0" relativeHeight="251659264" behindDoc="0" locked="0" layoutInCell="1" allowOverlap="1" wp14:anchorId="6027BD88" wp14:editId="2646EC5C">
                 <wp:simplePos x="0" y="0"/>
                 <wp:positionH relativeFrom="margin">
-                  <wp:align>left</wp:align>
+                  <wp:posOffset>28575</wp:posOffset>
                 </wp:positionH>
                 <wp:positionV relativeFrom="paragraph">
-                  <wp:posOffset>1016635</wp:posOffset>
+                  <wp:posOffset>883285</wp:posOffset>
                 </wp:positionV>
                 <wp:extent cx="971550" cy="885825"/>
                 <wp:effectExtent l="57150" t="38100" r="38100" b="85725"/>
@@ -1614,7 +1596,7 @@
           </mc:Choice>
           <mc:Fallback>
             <w:pict>
-              <v:shape w14:anchorId="06B20CBD" id="Conector de Seta Reta 1" o:spid="_x0000_s1026" type="#_x0000_t32" style="position:absolute;margin-left:0;margin-top:80.05pt;width:76.5pt;height:69.75pt;flip:x;z-index:251659264;visibility:visible;mso-wrap-style:square;mso-wrap-distance-left:9pt;mso-wrap-distance-top:0;mso-wrap-distance-right:9pt;mso-wrap-distance-bottom:0;mso-position-horizontal:left;mso-position-horizontal-relative:margin;mso-position-vertical:absolute;mso-position-vertical-relative:text" o:gfxdata="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" strokecolor="#e00" strokeweight="3pt">
+              <v:shape w14:anchorId="10311D34" id="Conector de Seta Reta 1" o:spid="_x0000_s1026" type="#_x0000_t32" style="position:absolute;margin-left:2.25pt;margin-top:69.55pt;width:76.5pt;height:69.75pt;flip:x;z-index:251659264;visibility:visible;mso-wrap-style:square;mso-wrap-distance-left:9pt;mso-wrap-distance-top:0;mso-wrap-distance-right:9pt;mso-wrap-distance-bottom:0;mso-position-horizontal:absolute;mso-position-horizontal-relative:margin;mso-position-vertical:absolute;mso-position-vertical-relative:text" o:gfxdata="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" strokecolor="#e00" strokeweight="3pt">
                 <v:stroke endarrow="block"/>
                 <v:shadow on="t" color="black" opacity="22937f" origin=",.5" offset="0,.63889mm"/>
                 <w10:wrap anchorx="margin"/>
@@ -1631,13 +1613,13 @@
         <mc:AlternateContent>
           <mc:Choice Requires="wps">
             <w:drawing>
-              <wp:anchor distT="0" distB="0" distL="114300" distR="114300" simplePos="0" relativeHeight="251660288" behindDoc="0" locked="0" layoutInCell="1" allowOverlap="1" wp14:anchorId="390FED90" wp14:editId="6D7D59D1">
+              <wp:anchor distT="0" distB="0" distL="114300" distR="114300" simplePos="0" relativeHeight="251660288" behindDoc="0" locked="0" layoutInCell="1" allowOverlap="1" wp14:anchorId="390FED90" wp14:editId="09E6481D">
                 <wp:simplePos x="0" y="0"/>
                 <wp:positionH relativeFrom="column">
-                  <wp:posOffset>-785495</wp:posOffset>
+                  <wp:posOffset>-814070</wp:posOffset>
                 </wp:positionH>
                 <wp:positionV relativeFrom="paragraph">
-                  <wp:posOffset>1854835</wp:posOffset>
+                  <wp:posOffset>1721485</wp:posOffset>
                 </wp:positionV>
                 <wp:extent cx="1143000" cy="752475"/>
                 <wp:effectExtent l="76200" t="38100" r="57150" b="104775"/>
@@ -1691,7 +1673,7 @@
           </mc:Choice>
           <mc:Fallback>
             <w:pict>
-              <v:oval w14:anchorId="7FBF138C" id="Elipse 2" o:spid="_x0000_s1026" style="position:absolute;margin-left:-61.85pt;margin-top:146.05pt;width:90pt;height:59.25pt;z-index:251660288;visibility:visible;mso-wrap-style:square;mso-wrap-distance-left:9pt;mso-wrap-distance-top:0;mso-wrap-distance-right:9pt;mso-wrap-distance-bottom:0;mso-position-horizontal:absolute;mso-position-horizontal-relative:text;mso-position-vertical:absolute;mso-position-vertical-relative:text;v-text-anchor:middle" o:gfxdata="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" filled="f" strokecolor="#e00" strokeweight="3pt">
+              <v:oval w14:anchorId="48CA96CC" id="Elipse 2" o:spid="_x0000_s1026" style="position:absolute;margin-left:-64.1pt;margin-top:135.55pt;width:90pt;height:59.25pt;z-index:251660288;visibility:visible;mso-wrap-style:square;mso-wrap-distance-left:9pt;mso-wrap-distance-top:0;mso-wrap-distance-right:9pt;mso-wrap-distance-bottom:0;mso-position-horizontal:absolute;mso-position-horizontal-relative:text;mso-position-vertical:absolute;mso-position-vertical-relative:text;v-text-anchor:middle" o:gfxdata="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" filled="f" strokecolor="#e00" strokeweight="3pt">
                 <v:shadow on="t" color="black" opacity="22937f" origin=",.5" offset="0,.63889mm"/>
               </v:oval>
             </w:pict>
@@ -1701,10 +1683,11 @@
       <w:r>
         <w:rPr>
           <w:rFonts w:ascii="Courier New" w:eastAsia="Courier New" w:hAnsi="Courier New" w:cs="Courier New"/>
+          <w:noProof/>
         </w:rPr>
         <w:drawing>
-          <wp:inline distT="0" distB="0" distL="0" distR="0" wp14:anchorId="595D6ED1" wp14:editId="707125E2">
-            <wp:extent cx="2353003" cy="5125165"/>
+          <wp:inline distT="0" distB="0" distL="0" distR="0" wp14:anchorId="595D6ED1" wp14:editId="71B8073D">
+            <wp:extent cx="2352675" cy="4972051"/>
             <wp:effectExtent l="0" t="0" r="9525" b="0"/>
             <wp:docPr id="45591724" name="Imagem 1"/>
             <wp:cNvGraphicFramePr>
@@ -1717,20 +1700,29 @@
                     <pic:cNvPr id="45591724" name=""/>
                     <pic:cNvPicPr/>
                   </pic:nvPicPr>
-                  <pic:blipFill>
+                  <pic:blipFill rotWithShape="1">
                     <a:blip r:embed="rId7"/>
+                    <a:srcRect t="2974"/>
                     <a:stretch>
                       <a:fillRect/>
                     </a:stretch>
                   </pic:blipFill>
-                  <pic:spPr>
+                  <pic:spPr bwMode="auto">
                     <a:xfrm>
                       <a:off x="0" y="0"/>
-                      <a:ext cx="2353003" cy="5125165"/>
+                      <a:ext cx="2353003" cy="4972744"/>
                     </a:xfrm>
                     <a:prstGeom prst="rect">
                       <a:avLst/>
                     </a:prstGeom>
+                    <a:ln>
+                      <a:noFill/>
+                    </a:ln>
+                    <a:extLst>
+                      <a:ext uri="{53640926-AAD7-44D8-BBD7-CCE9431645EC}">
+                        <a14:shadowObscured xmlns:a14="http://schemas.microsoft.com/office/drawing/2010/main"/>
+                      </a:ext>
+                    </a:extLst>
                   </pic:spPr>
                 </pic:pic>
               </a:graphicData>
@@ -1747,11 +1739,12 @@
       <w:r>
         <w:rPr>
           <w:rFonts w:ascii="Courier New" w:eastAsia="Courier New" w:hAnsi="Courier New" w:cs="Courier New"/>
+          <w:noProof/>
         </w:rPr>
         <w:drawing>
-          <wp:inline distT="0" distB="0" distL="0" distR="0" wp14:anchorId="4B22748F" wp14:editId="03DE6041">
-            <wp:extent cx="2343477" cy="5115639"/>
-            <wp:effectExtent l="0" t="0" r="0" b="8890"/>
+          <wp:inline distT="0" distB="0" distL="0" distR="0" wp14:anchorId="4B22748F" wp14:editId="38B5CF22">
+            <wp:extent cx="2343150" cy="4962525"/>
+            <wp:effectExtent l="0" t="0" r="0" b="9525"/>
             <wp:docPr id="418871218" name="Imagem 1"/>
             <wp:cNvGraphicFramePr>
               <a:graphicFrameLocks xmlns:a="http://schemas.openxmlformats.org/drawingml/2006/main" noChangeAspect="1"/>
@@ -1763,20 +1756,29 @@
                     <pic:cNvPr id="418871218" name=""/>
                     <pic:cNvPicPr/>
                   </pic:nvPicPr>
-                  <pic:blipFill>
+                  <pic:blipFill rotWithShape="1">
                     <a:blip r:embed="rId8"/>
+                    <a:srcRect t="2980"/>
                     <a:stretch>
                       <a:fillRect/>
                     </a:stretch>
                   </pic:blipFill>
-                  <pic:spPr>
+                  <pic:spPr bwMode="auto">
                     <a:xfrm>
                       <a:off x="0" y="0"/>
-                      <a:ext cx="2343477" cy="5115639"/>
+                      <a:ext cx="2343477" cy="4963218"/>
                     </a:xfrm>
                     <a:prstGeom prst="rect">
                       <a:avLst/>
                     </a:prstGeom>
+                    <a:ln>
+                      <a:noFill/>
+                    </a:ln>
+                    <a:extLst>
+                      <a:ext uri="{53640926-AAD7-44D8-BBD7-CCE9431645EC}">
+                        <a14:shadowObscured xmlns:a14="http://schemas.microsoft.com/office/drawing/2010/main"/>
+                      </a:ext>
+                    </a:extLst>
                   </pic:spPr>
                 </pic:pic>
               </a:graphicData>
@@ -1795,9 +1797,9 @@
           <w:noProof/>
         </w:rPr>
         <w:drawing>
-          <wp:inline distT="0" distB="0" distL="0" distR="0" wp14:anchorId="1F51FEFD" wp14:editId="27AFE496">
-            <wp:extent cx="2381582" cy="5134692"/>
-            <wp:effectExtent l="0" t="0" r="0" b="8890"/>
+          <wp:inline distT="0" distB="0" distL="0" distR="0" wp14:anchorId="1F51FEFD" wp14:editId="2AB2D767">
+            <wp:extent cx="2381250" cy="4972051"/>
+            <wp:effectExtent l="0" t="0" r="0" b="0"/>
             <wp:docPr id="981676888" name="Imagem 1"/>
             <wp:cNvGraphicFramePr>
               <a:graphicFrameLocks xmlns:a="http://schemas.openxmlformats.org/drawingml/2006/main" noChangeAspect="1"/>
@@ -1809,20 +1811,29 @@
                     <pic:cNvPr id="981676888" name=""/>
                     <pic:cNvPicPr/>
                   </pic:nvPicPr>
-                  <pic:blipFill>
+                  <pic:blipFill rotWithShape="1">
                     <a:blip r:embed="rId9"/>
+                    <a:srcRect t="3154"/>
                     <a:stretch>
                       <a:fillRect/>
                     </a:stretch>
                   </pic:blipFill>
-                  <pic:spPr>
+                  <pic:spPr bwMode="auto">
                     <a:xfrm>
                       <a:off x="0" y="0"/>
-                      <a:ext cx="2381582" cy="5134692"/>
+                      <a:ext cx="2381582" cy="4972744"/>
                     </a:xfrm>
                     <a:prstGeom prst="rect">
                       <a:avLst/>
                     </a:prstGeom>
+                    <a:ln>
+                      <a:noFill/>
+                    </a:ln>
+                    <a:extLst>
+                      <a:ext uri="{53640926-AAD7-44D8-BBD7-CCE9431645EC}">
+                        <a14:shadowObscured xmlns:a14="http://schemas.microsoft.com/office/drawing/2010/main"/>
+                      </a:ext>
+                    </a:extLst>
                   </pic:spPr>
                 </pic:pic>
               </a:graphicData>
@@ -1831,8 +1842,178 @@
         </w:drawing>
       </w:r>
     </w:p>
+    <w:p>
+      <w:pPr>
+        <w:ind w:left="-1417" w:right="-1113"/>
+        <w:jc w:val="center"/>
+        <w:rPr>
+          <w:rFonts w:ascii="Courier New" w:eastAsia="Courier New" w:hAnsi="Courier New" w:cs="Courier New"/>
+        </w:rPr>
+      </w:pPr>
+      <w:r>
+        <w:rPr>
+          <w:rFonts w:ascii="Courier New" w:eastAsia="Courier New" w:hAnsi="Courier New" w:cs="Courier New"/>
+          <w:noProof/>
+        </w:rPr>
+        <w:lastRenderedPageBreak/>
+        <w:drawing>
+          <wp:inline distT="0" distB="0" distL="0" distR="0" wp14:anchorId="09AFB8AD" wp14:editId="7379D560">
+            <wp:extent cx="2280562" cy="4819650"/>
+            <wp:effectExtent l="0" t="0" r="5715" b="0"/>
+            <wp:docPr id="1501796729" name="Imagem 1"/>
+            <wp:cNvGraphicFramePr>
+              <a:graphicFrameLocks xmlns:a="http://schemas.openxmlformats.org/drawingml/2006/main" noChangeAspect="1"/>
+            </wp:cNvGraphicFramePr>
+            <a:graphic xmlns:a="http://schemas.openxmlformats.org/drawingml/2006/main">
+              <a:graphicData uri="http://schemas.openxmlformats.org/drawingml/2006/picture">
+                <pic:pic xmlns:pic="http://schemas.openxmlformats.org/drawingml/2006/picture">
+                  <pic:nvPicPr>
+                    <pic:cNvPr id="45591724" name=""/>
+                    <pic:cNvPicPr/>
+                  </pic:nvPicPr>
+                  <pic:blipFill rotWithShape="1">
+                    <a:blip r:embed="rId7"/>
+                    <a:srcRect t="2974"/>
+                    <a:stretch>
+                      <a:fillRect/>
+                    </a:stretch>
+                  </pic:blipFill>
+                  <pic:spPr bwMode="auto">
+                    <a:xfrm>
+                      <a:off x="0" y="0"/>
+                      <a:ext cx="2294866" cy="4849879"/>
+                    </a:xfrm>
+                    <a:prstGeom prst="rect">
+                      <a:avLst/>
+                    </a:prstGeom>
+                    <a:ln>
+                      <a:noFill/>
+                    </a:ln>
+                    <a:extLst>
+                      <a:ext uri="{53640926-AAD7-44D8-BBD7-CCE9431645EC}">
+                        <a14:shadowObscured xmlns:a14="http://schemas.microsoft.com/office/drawing/2010/main"/>
+                      </a:ext>
+                    </a:extLst>
+                  </pic:spPr>
+                </pic:pic>
+              </a:graphicData>
+            </a:graphic>
+          </wp:inline>
+        </w:drawing>
+      </w:r>
+      <w:r>
+        <w:rPr>
+          <w:rFonts w:ascii="Courier New" w:eastAsia="Courier New" w:hAnsi="Courier New" w:cs="Courier New"/>
+        </w:rPr>
+        <w:t xml:space="preserve"> </w:t>
+      </w:r>
+      <w:r>
+        <w:rPr>
+          <w:rFonts w:ascii="Courier New" w:eastAsia="Courier New" w:hAnsi="Courier New" w:cs="Courier New"/>
+        </w:rPr>
+        <w:drawing>
+          <wp:inline distT="0" distB="0" distL="0" distR="0" wp14:anchorId="3DF784D4" wp14:editId="4B8E4DEC">
+            <wp:extent cx="2273843" cy="4814570"/>
+            <wp:effectExtent l="0" t="0" r="0" b="5080"/>
+            <wp:docPr id="2015779044" name="Imagem 1"/>
+            <wp:cNvGraphicFramePr>
+              <a:graphicFrameLocks xmlns:a="http://schemas.openxmlformats.org/drawingml/2006/main" noChangeAspect="1"/>
+            </wp:cNvGraphicFramePr>
+            <a:graphic xmlns:a="http://schemas.openxmlformats.org/drawingml/2006/main">
+              <a:graphicData uri="http://schemas.openxmlformats.org/drawingml/2006/picture">
+                <pic:pic xmlns:pic="http://schemas.openxmlformats.org/drawingml/2006/picture">
+                  <pic:nvPicPr>
+                    <pic:cNvPr id="2015779044" name=""/>
+                    <pic:cNvPicPr/>
+                  </pic:nvPicPr>
+                  <pic:blipFill rotWithShape="1">
+                    <a:blip r:embed="rId10"/>
+                    <a:srcRect t="3838"/>
+                    <a:stretch>
+                      <a:fillRect/>
+                    </a:stretch>
+                  </pic:blipFill>
+                  <pic:spPr bwMode="auto">
+                    <a:xfrm>
+                      <a:off x="0" y="0"/>
+                      <a:ext cx="2282674" cy="4833269"/>
+                    </a:xfrm>
+                    <a:prstGeom prst="rect">
+                      <a:avLst/>
+                    </a:prstGeom>
+                    <a:ln>
+                      <a:noFill/>
+                    </a:ln>
+                    <a:extLst>
+                      <a:ext uri="{53640926-AAD7-44D8-BBD7-CCE9431645EC}">
+                        <a14:shadowObscured xmlns:a14="http://schemas.microsoft.com/office/drawing/2010/main"/>
+                      </a:ext>
+                    </a:extLst>
+                  </pic:spPr>
+                </pic:pic>
+              </a:graphicData>
+            </a:graphic>
+          </wp:inline>
+        </w:drawing>
+      </w:r>
+      <w:r>
+        <w:rPr>
+          <w:rFonts w:ascii="Courier New" w:eastAsia="Courier New" w:hAnsi="Courier New" w:cs="Courier New"/>
+        </w:rPr>
+        <w:t xml:space="preserve"> </w:t>
+      </w:r>
+      <w:r>
+        <w:rPr>
+          <w:rFonts w:ascii="Courier New" w:eastAsia="Courier New" w:hAnsi="Courier New" w:cs="Courier New"/>
+        </w:rPr>
+        <w:drawing>
+          <wp:inline distT="0" distB="0" distL="0" distR="0" wp14:anchorId="677054ED" wp14:editId="4AB3DDDA">
+            <wp:extent cx="2286945" cy="4829971"/>
+            <wp:effectExtent l="0" t="0" r="0" b="8890"/>
+            <wp:docPr id="1304097327" name="Imagem 1"/>
+            <wp:cNvGraphicFramePr>
+              <a:graphicFrameLocks xmlns:a="http://schemas.openxmlformats.org/drawingml/2006/main" noChangeAspect="1"/>
+            </wp:cNvGraphicFramePr>
+            <a:graphic xmlns:a="http://schemas.openxmlformats.org/drawingml/2006/main">
+              <a:graphicData uri="http://schemas.openxmlformats.org/drawingml/2006/picture">
+                <pic:pic xmlns:pic="http://schemas.openxmlformats.org/drawingml/2006/picture">
+                  <pic:nvPicPr>
+                    <pic:cNvPr id="1304097327" name=""/>
+                    <pic:cNvPicPr/>
+                  </pic:nvPicPr>
+                  <pic:blipFill rotWithShape="1">
+                    <a:blip r:embed="rId11"/>
+                    <a:srcRect t="4257"/>
+                    <a:stretch>
+                      <a:fillRect/>
+                    </a:stretch>
+                  </pic:blipFill>
+                  <pic:spPr bwMode="auto">
+                    <a:xfrm>
+                      <a:off x="0" y="0"/>
+                      <a:ext cx="2303801" cy="4865571"/>
+                    </a:xfrm>
+                    <a:prstGeom prst="rect">
+                      <a:avLst/>
+                    </a:prstGeom>
+                    <a:ln>
+                      <a:noFill/>
+                    </a:ln>
+                    <a:extLst>
+                      <a:ext uri="{53640926-AAD7-44D8-BBD7-CCE9431645EC}">
+                        <a14:shadowObscured xmlns:a14="http://schemas.microsoft.com/office/drawing/2010/main"/>
+                      </a:ext>
+                    </a:extLst>
+                  </pic:spPr>
+                </pic:pic>
+              </a:graphicData>
+            </a:graphic>
+          </wp:inline>
+        </w:drawing>
+      </w:r>
+    </w:p>
     <w:sectPr>
-      <w:headerReference w:type="default" r:id="rId10"/>
+      <w:headerReference w:type="default" r:id="rId12"/>
       <w:pgSz w:w="11909" w:h="16834"/>
       <w:pgMar w:top="1440" w:right="1115" w:bottom="1440" w:left="1417" w:header="720" w:footer="720" w:gutter="0"/>
       <w:pgNumType w:start="1"/>

</xml_diff>